<commit_message>
Added Test cases for tasks 9.1-9.3
</commit_message>
<xml_diff>
--- a/lab09/Report/Report.docx
+++ b/lab09/Report/Report.docx
@@ -2663,7 +2663,7 @@
           <w:sz w:val="28"/>
           <w:szCs w:val="28"/>
         </w:rPr>
-        <w:t>$D_1$</w:t>
+        <w:t>D_1</w:t>
       </w:r>
       <w:r>
         <w:rPr>
@@ -2679,7 +2679,26 @@
           <w:sz w:val="28"/>
           <w:szCs w:val="28"/>
         </w:rPr>
-        <w:t>bit_D1 = (N &gt;&gt; 1)&amp; 1</w:t>
+        <w:t>bit_D1 = (N &gt;&gt; 1)</w:t>
+      </w:r>
+      <w:r>
+        <w:rPr>
+          <w:rStyle w:val="HTML"/>
+          <w:rFonts w:ascii="Times New Roman" w:hAnsi="Times New Roman" w:cs="Times New Roman"/>
+          <w:sz w:val="28"/>
+          <w:szCs w:val="28"/>
+          <w:lang w:val="ru-RU"/>
+        </w:rPr>
+        <w:t xml:space="preserve"> </w:t>
+      </w:r>
+      <w:r>
+        <w:rPr>
+          <w:rStyle w:val="HTML"/>
+          <w:rFonts w:ascii="Times New Roman" w:hAnsi="Times New Roman" w:cs="Times New Roman"/>
+          <w:sz w:val="28"/>
+          <w:szCs w:val="28"/>
+        </w:rPr>
+        <w:t>&amp; 1</w:t>
       </w:r>
       <w:r>
         <w:rPr>
@@ -2811,7 +2830,7 @@
           <w:sz w:val="28"/>
           <w:szCs w:val="28"/>
         </w:rPr>
-        <w:t>$D_1 = 1$</w:t>
+        <w:t>D_1 = 1</w:t>
       </w:r>
       <w:r>
         <w:rPr>
@@ -2956,6 +2975,3504 @@
         </w:rPr>
       </w:pPr>
     </w:p>
+    <w:p>
+      <w:pPr>
+        <w:rPr>
+          <w:sz w:val="28"/>
+          <w:szCs w:val="28"/>
+          <w:lang w:val="en-US"/>
+        </w:rPr>
+      </w:pPr>
+      <w:r>
+        <w:rPr>
+          <w:sz w:val="28"/>
+          <w:szCs w:val="28"/>
+          <w:lang w:val="ru-RU"/>
+        </w:rPr>
+        <w:lastRenderedPageBreak/>
+        <w:t>Тест-кейси для задач</w:t>
+      </w:r>
+      <w:r>
+        <w:rPr>
+          <w:sz w:val="28"/>
+          <w:szCs w:val="28"/>
+          <w:lang w:val="en-US"/>
+        </w:rPr>
+        <w:t>:</w:t>
+      </w:r>
+    </w:p>
+    <w:p>
+      <w:pPr>
+        <w:rPr>
+          <w:sz w:val="28"/>
+          <w:szCs w:val="28"/>
+          <w:lang w:val="en-US"/>
+        </w:rPr>
+      </w:pPr>
+    </w:p>
+    <w:tbl>
+      <w:tblPr>
+        <w:tblpPr w:leftFromText="180" w:rightFromText="180" w:bottomFromText="160" w:vertAnchor="text" w:tblpXSpec="right" w:tblpY="1"/>
+        <w:tblOverlap w:val="never"/>
+        <w:tblW w:w="0" w:type="auto"/>
+        <w:tblBorders>
+          <w:top w:val="single" w:sz="18" w:space="0" w:color="999999"/>
+          <w:left w:val="single" w:sz="18" w:space="0" w:color="999999"/>
+          <w:bottom w:val="single" w:sz="18" w:space="0" w:color="999999"/>
+          <w:right w:val="single" w:sz="18" w:space="0" w:color="999999"/>
+          <w:insideH w:val="single" w:sz="18" w:space="0" w:color="999999"/>
+          <w:insideV w:val="single" w:sz="18" w:space="0" w:color="999999"/>
+        </w:tblBorders>
+        <w:tblLook w:val="01E0" w:firstRow="1" w:lastRow="1" w:firstColumn="1" w:lastColumn="1" w:noHBand="0" w:noVBand="0"/>
+      </w:tblPr>
+      <w:tblGrid>
+        <w:gridCol w:w="2538"/>
+        <w:gridCol w:w="3296"/>
+      </w:tblGrid>
+      <w:tr>
+        <w:trPr>
+          <w:trHeight w:val="567"/>
+        </w:trPr>
+        <w:tc>
+          <w:tcPr>
+            <w:tcW w:w="2538" w:type="dxa"/>
+            <w:tcBorders>
+              <w:top w:val="single" w:sz="18" w:space="0" w:color="999999"/>
+              <w:left w:val="single" w:sz="18" w:space="0" w:color="999999"/>
+              <w:bottom w:val="single" w:sz="18" w:space="0" w:color="999999"/>
+              <w:right w:val="single" w:sz="18" w:space="0" w:color="999999"/>
+            </w:tcBorders>
+            <w:vAlign w:val="center"/>
+            <w:hideMark/>
+          </w:tcPr>
+          <w:p>
+            <w:pPr>
+              <w:spacing w:line="256" w:lineRule="auto"/>
+              <w:ind w:right="-214"/>
+              <w:rPr>
+                <w:sz w:val="18"/>
+                <w:szCs w:val="18"/>
+                <w:lang w:eastAsia="en-US"/>
+              </w:rPr>
+            </w:pPr>
+            <w:r>
+              <w:rPr>
+                <w:sz w:val="18"/>
+                <w:szCs w:val="18"/>
+                <w:lang w:eastAsia="en-US"/>
+              </w:rPr>
+              <w:t>Назва тестового набору</w:t>
+            </w:r>
+          </w:p>
+          <w:p>
+            <w:pPr>
+              <w:spacing w:line="256" w:lineRule="auto"/>
+              <w:ind w:right="-214"/>
+              <w:rPr>
+                <w:sz w:val="18"/>
+                <w:szCs w:val="18"/>
+                <w:lang w:eastAsia="en-US"/>
+              </w:rPr>
+            </w:pPr>
+            <w:r>
+              <w:rPr>
+                <w:rFonts w:ascii="Arial" w:hAnsi="Arial" w:cs="Arial"/>
+                <w:sz w:val="18"/>
+                <w:szCs w:val="18"/>
+                <w:lang w:eastAsia="en-US"/>
+              </w:rPr>
+              <w:t>Test Suite Description</w:t>
+            </w:r>
+          </w:p>
+        </w:tc>
+        <w:tc>
+          <w:tcPr>
+            <w:tcW w:w="3296" w:type="dxa"/>
+            <w:tcBorders>
+              <w:top w:val="single" w:sz="18" w:space="0" w:color="999999"/>
+              <w:left w:val="single" w:sz="18" w:space="0" w:color="999999"/>
+              <w:bottom w:val="single" w:sz="18" w:space="0" w:color="999999"/>
+              <w:right w:val="single" w:sz="18" w:space="0" w:color="999999"/>
+            </w:tcBorders>
+            <w:vAlign w:val="center"/>
+            <w:hideMark/>
+          </w:tcPr>
+          <w:p>
+            <w:pPr>
+              <w:spacing w:line="256" w:lineRule="auto"/>
+              <w:ind w:left="104"/>
+              <w:rPr>
+                <w:rFonts w:ascii="Arial Narrow" w:hAnsi="Arial Narrow"/>
+                <w:sz w:val="20"/>
+                <w:szCs w:val="20"/>
+                <w:lang w:val="en-US" w:eastAsia="en-US"/>
+              </w:rPr>
+            </w:pPr>
+            <w:r>
+              <w:rPr>
+                <w:rFonts w:ascii="Arial Narrow" w:hAnsi="Arial Narrow"/>
+                <w:sz w:val="20"/>
+                <w:szCs w:val="20"/>
+                <w:lang w:val="en-US" w:eastAsia="en-US"/>
+              </w:rPr>
+              <w:t>TS_9_1</w:t>
+            </w:r>
+          </w:p>
+        </w:tc>
+      </w:tr>
+      <w:tr>
+        <w:trPr>
+          <w:trHeight w:val="567"/>
+        </w:trPr>
+        <w:tc>
+          <w:tcPr>
+            <w:tcW w:w="2538" w:type="dxa"/>
+            <w:tcBorders>
+              <w:top w:val="single" w:sz="18" w:space="0" w:color="999999"/>
+              <w:left w:val="single" w:sz="18" w:space="0" w:color="999999"/>
+              <w:bottom w:val="single" w:sz="18" w:space="0" w:color="999999"/>
+              <w:right w:val="single" w:sz="18" w:space="0" w:color="999999"/>
+            </w:tcBorders>
+            <w:vAlign w:val="center"/>
+            <w:hideMark/>
+          </w:tcPr>
+          <w:p>
+            <w:pPr>
+              <w:spacing w:line="256" w:lineRule="auto"/>
+              <w:ind w:right="-214"/>
+              <w:rPr>
+                <w:sz w:val="18"/>
+                <w:szCs w:val="18"/>
+                <w:lang w:eastAsia="en-US"/>
+              </w:rPr>
+            </w:pPr>
+            <w:r>
+              <w:rPr>
+                <w:sz w:val="18"/>
+                <w:szCs w:val="18"/>
+                <w:lang w:eastAsia="en-US"/>
+              </w:rPr>
+              <w:t>Назва проекта / ПЗ</w:t>
+            </w:r>
+          </w:p>
+          <w:p>
+            <w:pPr>
+              <w:spacing w:line="256" w:lineRule="auto"/>
+              <w:ind w:right="-214"/>
+              <w:rPr>
+                <w:sz w:val="18"/>
+                <w:szCs w:val="18"/>
+                <w:lang w:eastAsia="en-US"/>
+              </w:rPr>
+            </w:pPr>
+            <w:r>
+              <w:rPr>
+                <w:rFonts w:ascii="Arial" w:hAnsi="Arial" w:cs="Arial"/>
+                <w:sz w:val="18"/>
+                <w:szCs w:val="18"/>
+                <w:lang w:eastAsia="en-US"/>
+              </w:rPr>
+              <w:t>Name of Project / Software</w:t>
+            </w:r>
+          </w:p>
+        </w:tc>
+        <w:tc>
+          <w:tcPr>
+            <w:tcW w:w="3296" w:type="dxa"/>
+            <w:tcBorders>
+              <w:top w:val="single" w:sz="18" w:space="0" w:color="999999"/>
+              <w:left w:val="single" w:sz="18" w:space="0" w:color="999999"/>
+              <w:bottom w:val="single" w:sz="18" w:space="0" w:color="999999"/>
+              <w:right w:val="single" w:sz="18" w:space="0" w:color="999999"/>
+            </w:tcBorders>
+            <w:vAlign w:val="center"/>
+            <w:hideMark/>
+          </w:tcPr>
+          <w:p>
+            <w:pPr>
+              <w:spacing w:line="256" w:lineRule="auto"/>
+              <w:ind w:left="104"/>
+              <w:rPr>
+                <w:rFonts w:ascii="Arial Narrow" w:hAnsi="Arial Narrow"/>
+                <w:sz w:val="20"/>
+                <w:szCs w:val="20"/>
+                <w:lang w:eastAsia="en-US"/>
+              </w:rPr>
+            </w:pPr>
+            <w:r>
+              <w:rPr>
+                <w:sz w:val="22"/>
+                <w:szCs w:val="22"/>
+                <w:lang w:val="en-US" w:eastAsia="en-US"/>
+              </w:rPr>
+              <w:t>nikolenko</w:t>
+            </w:r>
+            <w:r>
+              <w:rPr>
+                <w:sz w:val="22"/>
+                <w:szCs w:val="22"/>
+                <w:lang w:eastAsia="en-US"/>
+              </w:rPr>
+              <w:t>-task_9_1</w:t>
+            </w:r>
+          </w:p>
+        </w:tc>
+      </w:tr>
+      <w:tr>
+        <w:trPr>
+          <w:trHeight w:val="567"/>
+        </w:trPr>
+        <w:tc>
+          <w:tcPr>
+            <w:tcW w:w="2538" w:type="dxa"/>
+            <w:tcBorders>
+              <w:top w:val="single" w:sz="18" w:space="0" w:color="999999"/>
+              <w:left w:val="single" w:sz="18" w:space="0" w:color="999999"/>
+              <w:bottom w:val="single" w:sz="18" w:space="0" w:color="999999"/>
+              <w:right w:val="single" w:sz="18" w:space="0" w:color="999999"/>
+            </w:tcBorders>
+            <w:vAlign w:val="center"/>
+            <w:hideMark/>
+          </w:tcPr>
+          <w:p>
+            <w:pPr>
+              <w:spacing w:line="256" w:lineRule="auto"/>
+              <w:ind w:right="-214"/>
+              <w:rPr>
+                <w:sz w:val="18"/>
+                <w:szCs w:val="18"/>
+                <w:lang w:eastAsia="en-US"/>
+              </w:rPr>
+            </w:pPr>
+            <w:r>
+              <w:rPr>
+                <w:sz w:val="18"/>
+                <w:szCs w:val="18"/>
+                <w:lang w:eastAsia="en-US"/>
+              </w:rPr>
+              <w:t>Рівень тестування</w:t>
+            </w:r>
+          </w:p>
+          <w:p>
+            <w:pPr>
+              <w:spacing w:line="256" w:lineRule="auto"/>
+              <w:ind w:right="-214"/>
+              <w:rPr>
+                <w:rFonts w:ascii="Arial" w:hAnsi="Arial" w:cs="Arial"/>
+                <w:sz w:val="18"/>
+                <w:szCs w:val="18"/>
+                <w:lang w:eastAsia="en-US"/>
+              </w:rPr>
+            </w:pPr>
+            <w:r>
+              <w:rPr>
+                <w:rFonts w:ascii="Arial" w:hAnsi="Arial" w:cs="Arial"/>
+                <w:sz w:val="18"/>
+                <w:szCs w:val="18"/>
+                <w:lang w:eastAsia="en-US"/>
+              </w:rPr>
+              <w:t>Level of Testing</w:t>
+            </w:r>
+          </w:p>
+        </w:tc>
+        <w:tc>
+          <w:tcPr>
+            <w:tcW w:w="3296" w:type="dxa"/>
+            <w:tcBorders>
+              <w:top w:val="single" w:sz="18" w:space="0" w:color="999999"/>
+              <w:left w:val="single" w:sz="18" w:space="0" w:color="999999"/>
+              <w:bottom w:val="single" w:sz="18" w:space="0" w:color="999999"/>
+              <w:right w:val="single" w:sz="18" w:space="0" w:color="999999"/>
+            </w:tcBorders>
+            <w:vAlign w:val="center"/>
+            <w:hideMark/>
+          </w:tcPr>
+          <w:p>
+            <w:pPr>
+              <w:spacing w:line="256" w:lineRule="auto"/>
+              <w:ind w:left="104" w:right="-218"/>
+              <w:rPr>
+                <w:rFonts w:ascii="Arial Narrow" w:hAnsi="Arial Narrow"/>
+                <w:sz w:val="20"/>
+                <w:szCs w:val="20"/>
+                <w:lang w:eastAsia="en-US"/>
+              </w:rPr>
+            </w:pPr>
+            <w:r>
+              <w:rPr>
+                <w:rFonts w:ascii="Arial Narrow" w:hAnsi="Arial Narrow"/>
+                <w:sz w:val="20"/>
+                <w:szCs w:val="20"/>
+                <w:lang w:eastAsia="en-US"/>
+              </w:rPr>
+              <w:t>системний  /  System Testing</w:t>
+            </w:r>
+          </w:p>
+        </w:tc>
+      </w:tr>
+      <w:tr>
+        <w:trPr>
+          <w:trHeight w:val="567"/>
+        </w:trPr>
+        <w:tc>
+          <w:tcPr>
+            <w:tcW w:w="2538" w:type="dxa"/>
+            <w:tcBorders>
+              <w:top w:val="single" w:sz="18" w:space="0" w:color="999999"/>
+              <w:left w:val="single" w:sz="18" w:space="0" w:color="999999"/>
+              <w:bottom w:val="single" w:sz="18" w:space="0" w:color="999999"/>
+              <w:right w:val="single" w:sz="18" w:space="0" w:color="999999"/>
+            </w:tcBorders>
+            <w:vAlign w:val="center"/>
+            <w:hideMark/>
+          </w:tcPr>
+          <w:p>
+            <w:pPr>
+              <w:spacing w:line="256" w:lineRule="auto"/>
+              <w:ind w:right="-214"/>
+              <w:rPr>
+                <w:rFonts w:ascii="Arial" w:hAnsi="Arial" w:cs="Arial"/>
+                <w:sz w:val="18"/>
+                <w:szCs w:val="18"/>
+                <w:lang w:eastAsia="en-US"/>
+              </w:rPr>
+            </w:pPr>
+            <w:r>
+              <w:rPr>
+                <w:sz w:val="18"/>
+                <w:szCs w:val="18"/>
+                <w:lang w:eastAsia="en-US"/>
+              </w:rPr>
+              <w:t xml:space="preserve">Автор тестсьюту </w:t>
+            </w:r>
+          </w:p>
+          <w:p>
+            <w:pPr>
+              <w:spacing w:line="256" w:lineRule="auto"/>
+              <w:ind w:right="-214"/>
+              <w:rPr>
+                <w:sz w:val="18"/>
+                <w:szCs w:val="18"/>
+                <w:lang w:eastAsia="en-US"/>
+              </w:rPr>
+            </w:pPr>
+            <w:r>
+              <w:rPr>
+                <w:rFonts w:ascii="Arial" w:hAnsi="Arial" w:cs="Arial"/>
+                <w:sz w:val="18"/>
+                <w:szCs w:val="18"/>
+                <w:lang w:eastAsia="en-US"/>
+              </w:rPr>
+              <w:t>Test Suite Author</w:t>
+            </w:r>
+          </w:p>
+        </w:tc>
+        <w:tc>
+          <w:tcPr>
+            <w:tcW w:w="3296" w:type="dxa"/>
+            <w:tcBorders>
+              <w:top w:val="single" w:sz="18" w:space="0" w:color="999999"/>
+              <w:left w:val="single" w:sz="18" w:space="0" w:color="999999"/>
+              <w:bottom w:val="single" w:sz="18" w:space="0" w:color="999999"/>
+              <w:right w:val="single" w:sz="18" w:space="0" w:color="999999"/>
+            </w:tcBorders>
+            <w:vAlign w:val="center"/>
+            <w:hideMark/>
+          </w:tcPr>
+          <w:p>
+            <w:pPr>
+              <w:spacing w:line="256" w:lineRule="auto"/>
+              <w:ind w:left="104"/>
+              <w:rPr>
+                <w:rFonts w:ascii="Arial Narrow" w:hAnsi="Arial Narrow"/>
+                <w:sz w:val="20"/>
+                <w:szCs w:val="20"/>
+                <w:lang w:eastAsia="en-US"/>
+              </w:rPr>
+            </w:pPr>
+            <w:r>
+              <w:rPr>
+                <w:rFonts w:ascii="Arial Narrow" w:hAnsi="Arial Narrow"/>
+                <w:sz w:val="20"/>
+                <w:szCs w:val="20"/>
+                <w:lang w:eastAsia="en-US"/>
+              </w:rPr>
+              <w:t>Ніколенко Святослав</w:t>
+            </w:r>
+          </w:p>
+        </w:tc>
+      </w:tr>
+      <w:tr>
+        <w:trPr>
+          <w:trHeight w:val="567"/>
+        </w:trPr>
+        <w:tc>
+          <w:tcPr>
+            <w:tcW w:w="2538" w:type="dxa"/>
+            <w:tcBorders>
+              <w:top w:val="single" w:sz="18" w:space="0" w:color="999999"/>
+              <w:left w:val="single" w:sz="18" w:space="0" w:color="999999"/>
+              <w:bottom w:val="single" w:sz="18" w:space="0" w:color="999999"/>
+              <w:right w:val="single" w:sz="18" w:space="0" w:color="999999"/>
+            </w:tcBorders>
+            <w:vAlign w:val="center"/>
+            <w:hideMark/>
+          </w:tcPr>
+          <w:p>
+            <w:pPr>
+              <w:spacing w:line="256" w:lineRule="auto"/>
+              <w:ind w:right="-214"/>
+              <w:rPr>
+                <w:sz w:val="18"/>
+                <w:szCs w:val="18"/>
+                <w:lang w:eastAsia="en-US"/>
+              </w:rPr>
+            </w:pPr>
+            <w:r>
+              <w:rPr>
+                <w:sz w:val="18"/>
+                <w:szCs w:val="18"/>
+                <w:lang w:eastAsia="en-US"/>
+              </w:rPr>
+              <w:t xml:space="preserve">Виконавець </w:t>
+            </w:r>
+          </w:p>
+          <w:p>
+            <w:pPr>
+              <w:spacing w:line="256" w:lineRule="auto"/>
+              <w:ind w:right="-214"/>
+              <w:rPr>
+                <w:sz w:val="18"/>
+                <w:szCs w:val="18"/>
+                <w:lang w:eastAsia="en-US"/>
+              </w:rPr>
+            </w:pPr>
+            <w:r>
+              <w:rPr>
+                <w:rFonts w:ascii="Arial" w:hAnsi="Arial" w:cs="Arial"/>
+                <w:sz w:val="18"/>
+                <w:szCs w:val="18"/>
+                <w:lang w:eastAsia="en-US"/>
+              </w:rPr>
+              <w:t>Implementer</w:t>
+            </w:r>
+          </w:p>
+        </w:tc>
+        <w:tc>
+          <w:tcPr>
+            <w:tcW w:w="3296" w:type="dxa"/>
+            <w:tcBorders>
+              <w:top w:val="single" w:sz="18" w:space="0" w:color="999999"/>
+              <w:left w:val="single" w:sz="18" w:space="0" w:color="999999"/>
+              <w:bottom w:val="single" w:sz="18" w:space="0" w:color="999999"/>
+              <w:right w:val="single" w:sz="18" w:space="0" w:color="999999"/>
+            </w:tcBorders>
+            <w:vAlign w:val="center"/>
+            <w:hideMark/>
+          </w:tcPr>
+          <w:p>
+            <w:pPr>
+              <w:spacing w:line="256" w:lineRule="auto"/>
+              <w:ind w:left="104"/>
+              <w:rPr>
+                <w:rFonts w:ascii="Arial Narrow" w:hAnsi="Arial Narrow"/>
+                <w:sz w:val="20"/>
+                <w:szCs w:val="20"/>
+                <w:lang w:eastAsia="en-US"/>
+              </w:rPr>
+            </w:pPr>
+            <w:r>
+              <w:rPr>
+                <w:rFonts w:ascii="Arial Narrow" w:hAnsi="Arial Narrow"/>
+                <w:sz w:val="20"/>
+                <w:szCs w:val="20"/>
+                <w:lang w:eastAsia="en-US"/>
+              </w:rPr>
+              <w:t>Ніколенко Святослав</w:t>
+            </w:r>
+          </w:p>
+        </w:tc>
+      </w:tr>
+    </w:tbl>
+    <w:p>
+      <w:pPr>
+        <w:jc w:val="center"/>
+        <w:rPr>
+          <w:color w:val="606060"/>
+          <w:spacing w:val="-13"/>
+          <w:lang w:val="en-US"/>
+        </w:rPr>
+      </w:pPr>
+      <w:r>
+        <w:rPr>
+          <w:sz w:val="30"/>
+          <w:szCs w:val="30"/>
+          <w:lang w:val="en-US"/>
+        </w:rPr>
+        <w:br w:type="textWrapping" w:clear="all"/>
+      </w:r>
+    </w:p>
+    <w:tbl>
+      <w:tblPr>
+        <w:tblW w:w="10386" w:type="dxa"/>
+        <w:jc w:val="right"/>
+        <w:tblBorders>
+          <w:top w:val="single" w:sz="18" w:space="0" w:color="999999"/>
+          <w:left w:val="single" w:sz="18" w:space="0" w:color="999999"/>
+          <w:bottom w:val="single" w:sz="18" w:space="0" w:color="999999"/>
+          <w:right w:val="single" w:sz="18" w:space="0" w:color="999999"/>
+          <w:insideH w:val="single" w:sz="18" w:space="0" w:color="999999"/>
+          <w:insideV w:val="single" w:sz="18" w:space="0" w:color="999999"/>
+        </w:tblBorders>
+        <w:tblLook w:val="01E0" w:firstRow="1" w:lastRow="1" w:firstColumn="1" w:lastColumn="1" w:noHBand="0" w:noVBand="0"/>
+      </w:tblPr>
+      <w:tblGrid>
+        <w:gridCol w:w="1009"/>
+        <w:gridCol w:w="4400"/>
+        <w:gridCol w:w="3190"/>
+        <w:gridCol w:w="1787"/>
+      </w:tblGrid>
+      <w:tr>
+        <w:trPr>
+          <w:trHeight w:val="1260"/>
+          <w:jc w:val="right"/>
+        </w:trPr>
+        <w:tc>
+          <w:tcPr>
+            <w:tcW w:w="1009" w:type="dxa"/>
+            <w:tcBorders>
+              <w:top w:val="single" w:sz="18" w:space="0" w:color="999999"/>
+              <w:left w:val="single" w:sz="18" w:space="0" w:color="999999"/>
+              <w:bottom w:val="single" w:sz="18" w:space="0" w:color="999999"/>
+              <w:right w:val="single" w:sz="18" w:space="0" w:color="999999"/>
+            </w:tcBorders>
+            <w:shd w:val="clear" w:color="auto" w:fill="F3F3F3"/>
+            <w:vAlign w:val="center"/>
+            <w:hideMark/>
+          </w:tcPr>
+          <w:p>
+            <w:pPr>
+              <w:spacing w:line="192" w:lineRule="auto"/>
+              <w:jc w:val="center"/>
+              <w:rPr>
+                <w:sz w:val="20"/>
+                <w:szCs w:val="20"/>
+                <w:lang w:eastAsia="en-US"/>
+              </w:rPr>
+            </w:pPr>
+            <w:r>
+              <w:rPr>
+                <w:sz w:val="20"/>
+                <w:szCs w:val="20"/>
+                <w:lang w:eastAsia="en-US"/>
+              </w:rPr>
+              <w:t xml:space="preserve">Ід-р тест-кейса / </w:t>
+            </w:r>
+            <w:r>
+              <w:rPr>
+                <w:rFonts w:ascii="Arial" w:hAnsi="Arial" w:cs="Arial"/>
+                <w:sz w:val="20"/>
+                <w:szCs w:val="20"/>
+                <w:lang w:eastAsia="en-US"/>
+              </w:rPr>
+              <w:t>Test Case ID</w:t>
+            </w:r>
+          </w:p>
+        </w:tc>
+        <w:tc>
+          <w:tcPr>
+            <w:tcW w:w="4400" w:type="dxa"/>
+            <w:tcBorders>
+              <w:top w:val="single" w:sz="18" w:space="0" w:color="999999"/>
+              <w:left w:val="single" w:sz="18" w:space="0" w:color="999999"/>
+              <w:bottom w:val="single" w:sz="18" w:space="0" w:color="999999"/>
+              <w:right w:val="single" w:sz="18" w:space="0" w:color="999999"/>
+            </w:tcBorders>
+            <w:shd w:val="clear" w:color="auto" w:fill="F3F3F3"/>
+            <w:vAlign w:val="center"/>
+            <w:hideMark/>
+          </w:tcPr>
+          <w:p>
+            <w:pPr>
+              <w:spacing w:line="256" w:lineRule="auto"/>
+              <w:jc w:val="center"/>
+              <w:rPr>
+                <w:rFonts w:ascii="Arial" w:hAnsi="Arial" w:cs="Arial"/>
+                <w:sz w:val="20"/>
+                <w:szCs w:val="20"/>
+                <w:lang w:val="en-US" w:eastAsia="en-US"/>
+              </w:rPr>
+            </w:pPr>
+            <w:r>
+              <w:rPr>
+                <w:sz w:val="20"/>
+                <w:szCs w:val="20"/>
+                <w:lang w:eastAsia="en-US"/>
+              </w:rPr>
+              <w:t xml:space="preserve">Дії (кроки) </w:t>
+            </w:r>
+            <w:r>
+              <w:rPr>
+                <w:rFonts w:ascii="Arial" w:hAnsi="Arial" w:cs="Arial"/>
+                <w:sz w:val="20"/>
+                <w:szCs w:val="20"/>
+                <w:lang w:eastAsia="en-US"/>
+              </w:rPr>
+              <w:t xml:space="preserve">/ </w:t>
+            </w:r>
+          </w:p>
+          <w:p>
+            <w:pPr>
+              <w:spacing w:line="256" w:lineRule="auto"/>
+              <w:jc w:val="center"/>
+              <w:rPr>
+                <w:rFonts w:ascii="Georgia" w:hAnsi="Georgia"/>
+                <w:b/>
+                <w:bCs/>
+                <w:color w:val="2A2A2A"/>
+                <w:sz w:val="20"/>
+                <w:szCs w:val="20"/>
+                <w:lang w:eastAsia="en-US"/>
+              </w:rPr>
+            </w:pPr>
+            <w:r>
+              <w:rPr>
+                <w:rFonts w:ascii="Arial" w:hAnsi="Arial" w:cs="Arial"/>
+                <w:sz w:val="20"/>
+                <w:szCs w:val="20"/>
+                <w:lang w:eastAsia="en-US"/>
+              </w:rPr>
+              <w:t>Action (Test Step</w:t>
+            </w:r>
+            <w:r>
+              <w:rPr>
+                <w:rFonts w:ascii="Arial" w:hAnsi="Arial" w:cs="Arial"/>
+                <w:sz w:val="20"/>
+                <w:szCs w:val="20"/>
+                <w:lang w:val="en-US" w:eastAsia="en-US"/>
+              </w:rPr>
+              <w:t>s</w:t>
+            </w:r>
+            <w:r>
+              <w:rPr>
+                <w:rFonts w:ascii="Arial" w:hAnsi="Arial" w:cs="Arial"/>
+                <w:sz w:val="20"/>
+                <w:szCs w:val="20"/>
+                <w:lang w:eastAsia="en-US"/>
+              </w:rPr>
+              <w:t>)</w:t>
+            </w:r>
+          </w:p>
+        </w:tc>
+        <w:tc>
+          <w:tcPr>
+            <w:tcW w:w="3190" w:type="dxa"/>
+            <w:tcBorders>
+              <w:top w:val="single" w:sz="18" w:space="0" w:color="999999"/>
+              <w:left w:val="single" w:sz="18" w:space="0" w:color="999999"/>
+              <w:bottom w:val="single" w:sz="18" w:space="0" w:color="999999"/>
+              <w:right w:val="single" w:sz="18" w:space="0" w:color="999999"/>
+            </w:tcBorders>
+            <w:shd w:val="clear" w:color="auto" w:fill="F3F3F3"/>
+            <w:vAlign w:val="center"/>
+            <w:hideMark/>
+          </w:tcPr>
+          <w:p>
+            <w:pPr>
+              <w:spacing w:line="256" w:lineRule="auto"/>
+              <w:jc w:val="center"/>
+              <w:rPr>
+                <w:sz w:val="20"/>
+                <w:szCs w:val="20"/>
+                <w:lang w:val="ru-RU" w:eastAsia="en-US"/>
+              </w:rPr>
+            </w:pPr>
+            <w:r>
+              <w:rPr>
+                <w:sz w:val="20"/>
+                <w:szCs w:val="20"/>
+                <w:lang w:eastAsia="en-US"/>
+              </w:rPr>
+              <w:t xml:space="preserve">Очікуваний </w:t>
+            </w:r>
+          </w:p>
+          <w:p>
+            <w:pPr>
+              <w:spacing w:line="256" w:lineRule="auto"/>
+              <w:jc w:val="center"/>
+              <w:rPr>
+                <w:sz w:val="20"/>
+                <w:szCs w:val="20"/>
+                <w:lang w:val="ru-RU" w:eastAsia="en-US"/>
+              </w:rPr>
+            </w:pPr>
+            <w:r>
+              <w:rPr>
+                <w:sz w:val="20"/>
+                <w:szCs w:val="20"/>
+                <w:lang w:eastAsia="en-US"/>
+              </w:rPr>
+              <w:t xml:space="preserve">результат / </w:t>
+            </w:r>
+          </w:p>
+          <w:p>
+            <w:pPr>
+              <w:spacing w:line="256" w:lineRule="auto"/>
+              <w:jc w:val="center"/>
+              <w:rPr>
+                <w:sz w:val="20"/>
+                <w:szCs w:val="20"/>
+                <w:lang w:eastAsia="en-US"/>
+              </w:rPr>
+            </w:pPr>
+            <w:r>
+              <w:rPr>
+                <w:rFonts w:ascii="Arial" w:hAnsi="Arial" w:cs="Arial"/>
+                <w:sz w:val="20"/>
+                <w:szCs w:val="20"/>
+                <w:lang w:eastAsia="en-US"/>
+              </w:rPr>
+              <w:t>Expected Result</w:t>
+            </w:r>
+          </w:p>
+        </w:tc>
+        <w:tc>
+          <w:tcPr>
+            <w:tcW w:w="1787" w:type="dxa"/>
+            <w:tcBorders>
+              <w:top w:val="single" w:sz="18" w:space="0" w:color="999999"/>
+              <w:left w:val="single" w:sz="18" w:space="0" w:color="999999"/>
+              <w:bottom w:val="single" w:sz="18" w:space="0" w:color="999999"/>
+              <w:right w:val="single" w:sz="18" w:space="0" w:color="999999"/>
+            </w:tcBorders>
+            <w:shd w:val="clear" w:color="auto" w:fill="F3F3F3"/>
+            <w:vAlign w:val="center"/>
+            <w:hideMark/>
+          </w:tcPr>
+          <w:p>
+            <w:pPr>
+              <w:spacing w:line="256" w:lineRule="auto"/>
+              <w:ind w:left="-57" w:right="-57"/>
+              <w:jc w:val="center"/>
+              <w:rPr>
+                <w:rFonts w:ascii="Arial" w:hAnsi="Arial" w:cs="Arial"/>
+                <w:sz w:val="20"/>
+                <w:szCs w:val="20"/>
+                <w:lang w:eastAsia="en-US"/>
+              </w:rPr>
+            </w:pPr>
+            <w:r>
+              <w:rPr>
+                <w:sz w:val="20"/>
+                <w:szCs w:val="20"/>
+                <w:lang w:eastAsia="en-US"/>
+              </w:rPr>
+              <w:t xml:space="preserve">Результат тестування </w:t>
+            </w:r>
+            <w:r>
+              <w:rPr>
+                <w:rFonts w:ascii="Arial" w:hAnsi="Arial" w:cs="Arial"/>
+                <w:sz w:val="20"/>
+                <w:szCs w:val="20"/>
+                <w:lang w:eastAsia="en-US"/>
+              </w:rPr>
+              <w:t xml:space="preserve">/ </w:t>
+            </w:r>
+          </w:p>
+          <w:p>
+            <w:pPr>
+              <w:spacing w:line="256" w:lineRule="auto"/>
+              <w:ind w:left="-57" w:right="-57"/>
+              <w:jc w:val="center"/>
+              <w:rPr>
+                <w:sz w:val="20"/>
+                <w:szCs w:val="20"/>
+                <w:lang w:eastAsia="en-US"/>
+              </w:rPr>
+            </w:pPr>
+            <w:r>
+              <w:rPr>
+                <w:rFonts w:ascii="Arial" w:hAnsi="Arial" w:cs="Arial"/>
+                <w:sz w:val="20"/>
+                <w:szCs w:val="20"/>
+                <w:lang w:eastAsia="en-US"/>
+              </w:rPr>
+              <w:t>Test Result</w:t>
+            </w:r>
+          </w:p>
+        </w:tc>
+      </w:tr>
+      <w:tr>
+        <w:trPr>
+          <w:jc w:val="right"/>
+        </w:trPr>
+        <w:tc>
+          <w:tcPr>
+            <w:tcW w:w="1009" w:type="dxa"/>
+            <w:tcBorders>
+              <w:top w:val="single" w:sz="18" w:space="0" w:color="999999"/>
+              <w:left w:val="single" w:sz="18" w:space="0" w:color="999999"/>
+              <w:bottom w:val="single" w:sz="18" w:space="0" w:color="999999"/>
+              <w:right w:val="single" w:sz="18" w:space="0" w:color="999999"/>
+            </w:tcBorders>
+            <w:hideMark/>
+          </w:tcPr>
+          <w:p>
+            <w:pPr>
+              <w:spacing w:line="256" w:lineRule="auto"/>
+              <w:rPr>
+                <w:lang w:eastAsia="en-US"/>
+              </w:rPr>
+            </w:pPr>
+            <w:r>
+              <w:rPr>
+                <w:lang w:eastAsia="en-US"/>
+              </w:rPr>
+              <w:t>TC-1.1</w:t>
+            </w:r>
+          </w:p>
+        </w:tc>
+        <w:tc>
+          <w:tcPr>
+            <w:tcW w:w="4400" w:type="dxa"/>
+            <w:tcBorders>
+              <w:top w:val="single" w:sz="18" w:space="0" w:color="999999"/>
+              <w:left w:val="single" w:sz="18" w:space="0" w:color="999999"/>
+              <w:bottom w:val="single" w:sz="18" w:space="0" w:color="999999"/>
+              <w:right w:val="single" w:sz="18" w:space="0" w:color="999999"/>
+            </w:tcBorders>
+            <w:hideMark/>
+          </w:tcPr>
+          <w:p>
+            <w:pPr>
+              <w:spacing w:line="256" w:lineRule="auto"/>
+              <w:rPr>
+                <w:lang w:eastAsia="en-US"/>
+              </w:rPr>
+            </w:pPr>
+            <w:r>
+              <w:rPr>
+                <w:lang w:eastAsia="en-US"/>
+              </w:rPr>
+              <w:t>1. Викликати функцію task_9_1(0)</w:t>
+            </w:r>
+          </w:p>
+        </w:tc>
+        <w:tc>
+          <w:tcPr>
+            <w:tcW w:w="3190" w:type="dxa"/>
+            <w:tcBorders>
+              <w:top w:val="single" w:sz="18" w:space="0" w:color="999999"/>
+              <w:left w:val="single" w:sz="18" w:space="0" w:color="999999"/>
+              <w:bottom w:val="single" w:sz="18" w:space="0" w:color="999999"/>
+              <w:right w:val="single" w:sz="18" w:space="0" w:color="999999"/>
+            </w:tcBorders>
+            <w:hideMark/>
+          </w:tcPr>
+          <w:p>
+            <w:pPr>
+              <w:spacing w:line="256" w:lineRule="auto"/>
+              <w:rPr>
+                <w:lang w:eastAsia="en-US"/>
+              </w:rPr>
+            </w:pPr>
+            <w:r>
+              <w:rPr>
+                <w:lang w:eastAsia="en-US"/>
+              </w:rPr>
+              <w:t>Вікно застосунку виведе: CALM-GLASSY, 0 METERS</w:t>
+            </w:r>
+          </w:p>
+        </w:tc>
+        <w:tc>
+          <w:tcPr>
+            <w:tcW w:w="1787" w:type="dxa"/>
+            <w:tcBorders>
+              <w:top w:val="single" w:sz="18" w:space="0" w:color="999999"/>
+              <w:left w:val="single" w:sz="18" w:space="0" w:color="999999"/>
+              <w:bottom w:val="single" w:sz="18" w:space="0" w:color="999999"/>
+              <w:right w:val="single" w:sz="18" w:space="0" w:color="999999"/>
+            </w:tcBorders>
+            <w:hideMark/>
+          </w:tcPr>
+          <w:p>
+            <w:pPr>
+              <w:spacing w:line="256" w:lineRule="auto"/>
+              <w:rPr>
+                <w:lang w:eastAsia="en-US"/>
+              </w:rPr>
+            </w:pPr>
+            <w:r>
+              <w:rPr>
+                <w:lang w:eastAsia="en-US"/>
+              </w:rPr>
+              <w:t>passed</w:t>
+            </w:r>
+          </w:p>
+        </w:tc>
+      </w:tr>
+      <w:tr>
+        <w:trPr>
+          <w:jc w:val="right"/>
+        </w:trPr>
+        <w:tc>
+          <w:tcPr>
+            <w:tcW w:w="1009" w:type="dxa"/>
+            <w:tcBorders>
+              <w:top w:val="single" w:sz="18" w:space="0" w:color="999999"/>
+              <w:left w:val="single" w:sz="18" w:space="0" w:color="999999"/>
+              <w:bottom w:val="single" w:sz="18" w:space="0" w:color="999999"/>
+              <w:right w:val="single" w:sz="18" w:space="0" w:color="999999"/>
+            </w:tcBorders>
+            <w:hideMark/>
+          </w:tcPr>
+          <w:p>
+            <w:pPr>
+              <w:spacing w:line="256" w:lineRule="auto"/>
+              <w:rPr>
+                <w:lang w:eastAsia="en-US"/>
+              </w:rPr>
+            </w:pPr>
+            <w:r>
+              <w:rPr>
+                <w:lang w:eastAsia="en-US"/>
+              </w:rPr>
+              <w:t>TC-1.2</w:t>
+            </w:r>
+          </w:p>
+        </w:tc>
+        <w:tc>
+          <w:tcPr>
+            <w:tcW w:w="4400" w:type="dxa"/>
+            <w:tcBorders>
+              <w:top w:val="single" w:sz="18" w:space="0" w:color="999999"/>
+              <w:left w:val="single" w:sz="18" w:space="0" w:color="999999"/>
+              <w:bottom w:val="single" w:sz="18" w:space="0" w:color="999999"/>
+              <w:right w:val="single" w:sz="18" w:space="0" w:color="999999"/>
+            </w:tcBorders>
+            <w:hideMark/>
+          </w:tcPr>
+          <w:p>
+            <w:pPr>
+              <w:spacing w:line="256" w:lineRule="auto"/>
+              <w:rPr>
+                <w:lang w:eastAsia="en-US"/>
+              </w:rPr>
+            </w:pPr>
+            <w:r>
+              <w:rPr>
+                <w:lang w:eastAsia="en-US"/>
+              </w:rPr>
+              <w:t>1. Викликати функцію task_9_1(4)</w:t>
+            </w:r>
+          </w:p>
+        </w:tc>
+        <w:tc>
+          <w:tcPr>
+            <w:tcW w:w="3190" w:type="dxa"/>
+            <w:tcBorders>
+              <w:top w:val="single" w:sz="18" w:space="0" w:color="999999"/>
+              <w:left w:val="single" w:sz="18" w:space="0" w:color="999999"/>
+              <w:bottom w:val="single" w:sz="18" w:space="0" w:color="999999"/>
+              <w:right w:val="single" w:sz="18" w:space="0" w:color="999999"/>
+            </w:tcBorders>
+            <w:hideMark/>
+          </w:tcPr>
+          <w:p>
+            <w:pPr>
+              <w:spacing w:line="256" w:lineRule="auto"/>
+              <w:rPr>
+                <w:lang w:eastAsia="en-US"/>
+              </w:rPr>
+            </w:pPr>
+            <w:r>
+              <w:rPr>
+                <w:lang w:eastAsia="en-US"/>
+              </w:rPr>
+              <w:t>Вікно застосунку виведе: MODERATE, 1.25-2.50 METERS</w:t>
+            </w:r>
+          </w:p>
+        </w:tc>
+        <w:tc>
+          <w:tcPr>
+            <w:tcW w:w="1787" w:type="dxa"/>
+            <w:tcBorders>
+              <w:top w:val="single" w:sz="18" w:space="0" w:color="999999"/>
+              <w:left w:val="single" w:sz="18" w:space="0" w:color="999999"/>
+              <w:bottom w:val="single" w:sz="18" w:space="0" w:color="999999"/>
+              <w:right w:val="single" w:sz="18" w:space="0" w:color="999999"/>
+            </w:tcBorders>
+            <w:hideMark/>
+          </w:tcPr>
+          <w:p>
+            <w:pPr>
+              <w:spacing w:line="256" w:lineRule="auto"/>
+              <w:rPr>
+                <w:lang w:eastAsia="en-US"/>
+              </w:rPr>
+            </w:pPr>
+            <w:r>
+              <w:rPr>
+                <w:lang w:eastAsia="en-US"/>
+              </w:rPr>
+              <w:t>passed</w:t>
+            </w:r>
+          </w:p>
+        </w:tc>
+      </w:tr>
+      <w:tr>
+        <w:trPr>
+          <w:jc w:val="right"/>
+        </w:trPr>
+        <w:tc>
+          <w:tcPr>
+            <w:tcW w:w="1009" w:type="dxa"/>
+            <w:tcBorders>
+              <w:top w:val="single" w:sz="18" w:space="0" w:color="999999"/>
+              <w:left w:val="single" w:sz="18" w:space="0" w:color="999999"/>
+              <w:bottom w:val="single" w:sz="18" w:space="0" w:color="999999"/>
+              <w:right w:val="single" w:sz="18" w:space="0" w:color="999999"/>
+            </w:tcBorders>
+            <w:hideMark/>
+          </w:tcPr>
+          <w:p>
+            <w:pPr>
+              <w:spacing w:line="256" w:lineRule="auto"/>
+              <w:rPr>
+                <w:lang w:eastAsia="en-US"/>
+              </w:rPr>
+            </w:pPr>
+            <w:r>
+              <w:rPr>
+                <w:lang w:eastAsia="en-US"/>
+              </w:rPr>
+              <w:t>TC-1.3</w:t>
+            </w:r>
+          </w:p>
+        </w:tc>
+        <w:tc>
+          <w:tcPr>
+            <w:tcW w:w="4400" w:type="dxa"/>
+            <w:tcBorders>
+              <w:top w:val="single" w:sz="18" w:space="0" w:color="999999"/>
+              <w:left w:val="single" w:sz="18" w:space="0" w:color="999999"/>
+              <w:bottom w:val="single" w:sz="18" w:space="0" w:color="999999"/>
+              <w:right w:val="single" w:sz="18" w:space="0" w:color="999999"/>
+            </w:tcBorders>
+            <w:hideMark/>
+          </w:tcPr>
+          <w:p>
+            <w:pPr>
+              <w:spacing w:line="256" w:lineRule="auto"/>
+              <w:rPr>
+                <w:lang w:eastAsia="en-US"/>
+              </w:rPr>
+            </w:pPr>
+            <w:r>
+              <w:rPr>
+                <w:lang w:eastAsia="en-US"/>
+              </w:rPr>
+              <w:t>1. Викликати функцію task_9_1(10)</w:t>
+            </w:r>
+          </w:p>
+        </w:tc>
+        <w:tc>
+          <w:tcPr>
+            <w:tcW w:w="3190" w:type="dxa"/>
+            <w:tcBorders>
+              <w:top w:val="single" w:sz="18" w:space="0" w:color="999999"/>
+              <w:left w:val="single" w:sz="18" w:space="0" w:color="999999"/>
+              <w:bottom w:val="single" w:sz="18" w:space="0" w:color="999999"/>
+              <w:right w:val="single" w:sz="18" w:space="0" w:color="999999"/>
+            </w:tcBorders>
+            <w:hideMark/>
+          </w:tcPr>
+          <w:p>
+            <w:pPr>
+              <w:spacing w:line="256" w:lineRule="auto"/>
+              <w:rPr>
+                <w:lang w:eastAsia="en-US"/>
+              </w:rPr>
+            </w:pPr>
+            <w:r>
+              <w:rPr>
+                <w:lang w:eastAsia="en-US"/>
+              </w:rPr>
+              <w:t>Вікно застосунку виведе повідомлення про помилку та згенерує звуковий сигнал.</w:t>
+            </w:r>
+          </w:p>
+        </w:tc>
+        <w:tc>
+          <w:tcPr>
+            <w:tcW w:w="1787" w:type="dxa"/>
+            <w:tcBorders>
+              <w:top w:val="single" w:sz="18" w:space="0" w:color="999999"/>
+              <w:left w:val="single" w:sz="18" w:space="0" w:color="999999"/>
+              <w:bottom w:val="single" w:sz="18" w:space="0" w:color="999999"/>
+              <w:right w:val="single" w:sz="18" w:space="0" w:color="999999"/>
+            </w:tcBorders>
+            <w:hideMark/>
+          </w:tcPr>
+          <w:p>
+            <w:pPr>
+              <w:spacing w:line="256" w:lineRule="auto"/>
+              <w:rPr>
+                <w:lang w:eastAsia="en-US"/>
+              </w:rPr>
+            </w:pPr>
+            <w:r>
+              <w:rPr>
+                <w:lang w:eastAsia="en-US"/>
+              </w:rPr>
+              <w:t>passed</w:t>
+            </w:r>
+          </w:p>
+        </w:tc>
+      </w:tr>
+    </w:tbl>
+    <w:p/>
+    <w:p/>
+    <w:tbl>
+      <w:tblPr>
+        <w:tblpPr w:leftFromText="180" w:rightFromText="180" w:bottomFromText="160" w:vertAnchor="text" w:tblpXSpec="right" w:tblpY="1"/>
+        <w:tblOverlap w:val="never"/>
+        <w:tblW w:w="0" w:type="auto"/>
+        <w:tblBorders>
+          <w:top w:val="single" w:sz="18" w:space="0" w:color="999999"/>
+          <w:left w:val="single" w:sz="18" w:space="0" w:color="999999"/>
+          <w:bottom w:val="single" w:sz="18" w:space="0" w:color="999999"/>
+          <w:right w:val="single" w:sz="18" w:space="0" w:color="999999"/>
+          <w:insideH w:val="single" w:sz="18" w:space="0" w:color="999999"/>
+          <w:insideV w:val="single" w:sz="18" w:space="0" w:color="999999"/>
+        </w:tblBorders>
+        <w:tblLook w:val="01E0" w:firstRow="1" w:lastRow="1" w:firstColumn="1" w:lastColumn="1" w:noHBand="0" w:noVBand="0"/>
+      </w:tblPr>
+      <w:tblGrid>
+        <w:gridCol w:w="2538"/>
+        <w:gridCol w:w="3296"/>
+      </w:tblGrid>
+      <w:tr>
+        <w:trPr>
+          <w:trHeight w:val="567"/>
+        </w:trPr>
+        <w:tc>
+          <w:tcPr>
+            <w:tcW w:w="2538" w:type="dxa"/>
+            <w:tcBorders>
+              <w:top w:val="single" w:sz="18" w:space="0" w:color="999999"/>
+              <w:left w:val="single" w:sz="18" w:space="0" w:color="999999"/>
+              <w:bottom w:val="single" w:sz="18" w:space="0" w:color="999999"/>
+              <w:right w:val="single" w:sz="18" w:space="0" w:color="999999"/>
+            </w:tcBorders>
+            <w:vAlign w:val="center"/>
+            <w:hideMark/>
+          </w:tcPr>
+          <w:p>
+            <w:pPr>
+              <w:spacing w:line="256" w:lineRule="auto"/>
+              <w:ind w:right="-214"/>
+              <w:rPr>
+                <w:sz w:val="18"/>
+                <w:szCs w:val="18"/>
+                <w:lang w:eastAsia="en-US"/>
+              </w:rPr>
+            </w:pPr>
+            <w:r>
+              <w:rPr>
+                <w:sz w:val="18"/>
+                <w:szCs w:val="18"/>
+                <w:lang w:eastAsia="en-US"/>
+              </w:rPr>
+              <w:t>Назва тестового набору</w:t>
+            </w:r>
+          </w:p>
+          <w:p>
+            <w:pPr>
+              <w:spacing w:line="256" w:lineRule="auto"/>
+              <w:ind w:right="-214"/>
+              <w:rPr>
+                <w:sz w:val="18"/>
+                <w:szCs w:val="18"/>
+                <w:lang w:eastAsia="en-US"/>
+              </w:rPr>
+            </w:pPr>
+            <w:r>
+              <w:rPr>
+                <w:rFonts w:ascii="Arial" w:hAnsi="Arial" w:cs="Arial"/>
+                <w:sz w:val="18"/>
+                <w:szCs w:val="18"/>
+                <w:lang w:eastAsia="en-US"/>
+              </w:rPr>
+              <w:t>Test Suite Description</w:t>
+            </w:r>
+          </w:p>
+        </w:tc>
+        <w:tc>
+          <w:tcPr>
+            <w:tcW w:w="3296" w:type="dxa"/>
+            <w:tcBorders>
+              <w:top w:val="single" w:sz="18" w:space="0" w:color="999999"/>
+              <w:left w:val="single" w:sz="18" w:space="0" w:color="999999"/>
+              <w:bottom w:val="single" w:sz="18" w:space="0" w:color="999999"/>
+              <w:right w:val="single" w:sz="18" w:space="0" w:color="999999"/>
+            </w:tcBorders>
+            <w:vAlign w:val="center"/>
+            <w:hideMark/>
+          </w:tcPr>
+          <w:p>
+            <w:pPr>
+              <w:spacing w:line="256" w:lineRule="auto"/>
+              <w:ind w:left="104"/>
+              <w:rPr>
+                <w:rFonts w:ascii="Arial Narrow" w:hAnsi="Arial Narrow"/>
+                <w:sz w:val="20"/>
+                <w:szCs w:val="20"/>
+                <w:lang w:eastAsia="en-US"/>
+              </w:rPr>
+            </w:pPr>
+            <w:r>
+              <w:rPr>
+                <w:rFonts w:ascii="Arial Narrow" w:hAnsi="Arial Narrow"/>
+                <w:sz w:val="20"/>
+                <w:szCs w:val="20"/>
+                <w:lang w:val="en-US" w:eastAsia="en-US"/>
+              </w:rPr>
+              <w:t>TS_9_2</w:t>
+            </w:r>
+          </w:p>
+        </w:tc>
+      </w:tr>
+      <w:tr>
+        <w:trPr>
+          <w:trHeight w:val="567"/>
+        </w:trPr>
+        <w:tc>
+          <w:tcPr>
+            <w:tcW w:w="2538" w:type="dxa"/>
+            <w:tcBorders>
+              <w:top w:val="single" w:sz="18" w:space="0" w:color="999999"/>
+              <w:left w:val="single" w:sz="18" w:space="0" w:color="999999"/>
+              <w:bottom w:val="single" w:sz="18" w:space="0" w:color="999999"/>
+              <w:right w:val="single" w:sz="18" w:space="0" w:color="999999"/>
+            </w:tcBorders>
+            <w:vAlign w:val="center"/>
+            <w:hideMark/>
+          </w:tcPr>
+          <w:p>
+            <w:pPr>
+              <w:spacing w:line="256" w:lineRule="auto"/>
+              <w:ind w:right="-214"/>
+              <w:rPr>
+                <w:sz w:val="18"/>
+                <w:szCs w:val="18"/>
+                <w:lang w:eastAsia="en-US"/>
+              </w:rPr>
+            </w:pPr>
+            <w:r>
+              <w:rPr>
+                <w:sz w:val="18"/>
+                <w:szCs w:val="18"/>
+                <w:lang w:eastAsia="en-US"/>
+              </w:rPr>
+              <w:t>Назва проекта / ПЗ</w:t>
+            </w:r>
+          </w:p>
+          <w:p>
+            <w:pPr>
+              <w:spacing w:line="256" w:lineRule="auto"/>
+              <w:ind w:right="-214"/>
+              <w:rPr>
+                <w:sz w:val="18"/>
+                <w:szCs w:val="18"/>
+                <w:lang w:eastAsia="en-US"/>
+              </w:rPr>
+            </w:pPr>
+            <w:r>
+              <w:rPr>
+                <w:rFonts w:ascii="Arial" w:hAnsi="Arial" w:cs="Arial"/>
+                <w:sz w:val="18"/>
+                <w:szCs w:val="18"/>
+                <w:lang w:eastAsia="en-US"/>
+              </w:rPr>
+              <w:t>Name of Project / Software</w:t>
+            </w:r>
+          </w:p>
+        </w:tc>
+        <w:tc>
+          <w:tcPr>
+            <w:tcW w:w="3296" w:type="dxa"/>
+            <w:tcBorders>
+              <w:top w:val="single" w:sz="18" w:space="0" w:color="999999"/>
+              <w:left w:val="single" w:sz="18" w:space="0" w:color="999999"/>
+              <w:bottom w:val="single" w:sz="18" w:space="0" w:color="999999"/>
+              <w:right w:val="single" w:sz="18" w:space="0" w:color="999999"/>
+            </w:tcBorders>
+            <w:vAlign w:val="center"/>
+            <w:hideMark/>
+          </w:tcPr>
+          <w:p>
+            <w:pPr>
+              <w:spacing w:line="256" w:lineRule="auto"/>
+              <w:ind w:left="104"/>
+              <w:rPr>
+                <w:rFonts w:ascii="Arial Narrow" w:hAnsi="Arial Narrow"/>
+                <w:sz w:val="20"/>
+                <w:szCs w:val="20"/>
+                <w:lang w:val="en-US" w:eastAsia="en-US"/>
+              </w:rPr>
+            </w:pPr>
+            <w:r>
+              <w:rPr>
+                <w:sz w:val="22"/>
+                <w:szCs w:val="22"/>
+                <w:lang w:val="en-US" w:eastAsia="en-US"/>
+              </w:rPr>
+              <w:t>nikolenko</w:t>
+            </w:r>
+            <w:r>
+              <w:rPr>
+                <w:sz w:val="22"/>
+                <w:szCs w:val="22"/>
+                <w:lang w:eastAsia="en-US"/>
+              </w:rPr>
+              <w:t>-task_9_2</w:t>
+            </w:r>
+          </w:p>
+        </w:tc>
+      </w:tr>
+      <w:tr>
+        <w:trPr>
+          <w:trHeight w:val="567"/>
+        </w:trPr>
+        <w:tc>
+          <w:tcPr>
+            <w:tcW w:w="2538" w:type="dxa"/>
+            <w:tcBorders>
+              <w:top w:val="single" w:sz="18" w:space="0" w:color="999999"/>
+              <w:left w:val="single" w:sz="18" w:space="0" w:color="999999"/>
+              <w:bottom w:val="single" w:sz="18" w:space="0" w:color="999999"/>
+              <w:right w:val="single" w:sz="18" w:space="0" w:color="999999"/>
+            </w:tcBorders>
+            <w:vAlign w:val="center"/>
+            <w:hideMark/>
+          </w:tcPr>
+          <w:p>
+            <w:pPr>
+              <w:spacing w:line="256" w:lineRule="auto"/>
+              <w:ind w:right="-214"/>
+              <w:rPr>
+                <w:sz w:val="18"/>
+                <w:szCs w:val="18"/>
+                <w:lang w:eastAsia="en-US"/>
+              </w:rPr>
+            </w:pPr>
+            <w:r>
+              <w:rPr>
+                <w:sz w:val="18"/>
+                <w:szCs w:val="18"/>
+                <w:lang w:eastAsia="en-US"/>
+              </w:rPr>
+              <w:t>Рівень тестування</w:t>
+            </w:r>
+          </w:p>
+          <w:p>
+            <w:pPr>
+              <w:spacing w:line="256" w:lineRule="auto"/>
+              <w:ind w:right="-214"/>
+              <w:rPr>
+                <w:rFonts w:ascii="Arial" w:hAnsi="Arial" w:cs="Arial"/>
+                <w:sz w:val="18"/>
+                <w:szCs w:val="18"/>
+                <w:lang w:eastAsia="en-US"/>
+              </w:rPr>
+            </w:pPr>
+            <w:r>
+              <w:rPr>
+                <w:rFonts w:ascii="Arial" w:hAnsi="Arial" w:cs="Arial"/>
+                <w:sz w:val="18"/>
+                <w:szCs w:val="18"/>
+                <w:lang w:eastAsia="en-US"/>
+              </w:rPr>
+              <w:t>Level of Testing</w:t>
+            </w:r>
+          </w:p>
+        </w:tc>
+        <w:tc>
+          <w:tcPr>
+            <w:tcW w:w="3296" w:type="dxa"/>
+            <w:tcBorders>
+              <w:top w:val="single" w:sz="18" w:space="0" w:color="999999"/>
+              <w:left w:val="single" w:sz="18" w:space="0" w:color="999999"/>
+              <w:bottom w:val="single" w:sz="18" w:space="0" w:color="999999"/>
+              <w:right w:val="single" w:sz="18" w:space="0" w:color="999999"/>
+            </w:tcBorders>
+            <w:vAlign w:val="center"/>
+            <w:hideMark/>
+          </w:tcPr>
+          <w:p>
+            <w:pPr>
+              <w:spacing w:line="256" w:lineRule="auto"/>
+              <w:ind w:left="104" w:right="-218"/>
+              <w:rPr>
+                <w:rFonts w:ascii="Arial Narrow" w:hAnsi="Arial Narrow"/>
+                <w:sz w:val="20"/>
+                <w:szCs w:val="20"/>
+                <w:lang w:eastAsia="en-US"/>
+              </w:rPr>
+            </w:pPr>
+            <w:r>
+              <w:rPr>
+                <w:rFonts w:ascii="Arial Narrow" w:hAnsi="Arial Narrow"/>
+                <w:sz w:val="20"/>
+                <w:szCs w:val="20"/>
+                <w:lang w:eastAsia="en-US"/>
+              </w:rPr>
+              <w:t>системний  /  System Testing</w:t>
+            </w:r>
+          </w:p>
+        </w:tc>
+      </w:tr>
+      <w:tr>
+        <w:trPr>
+          <w:trHeight w:val="567"/>
+        </w:trPr>
+        <w:tc>
+          <w:tcPr>
+            <w:tcW w:w="2538" w:type="dxa"/>
+            <w:tcBorders>
+              <w:top w:val="single" w:sz="18" w:space="0" w:color="999999"/>
+              <w:left w:val="single" w:sz="18" w:space="0" w:color="999999"/>
+              <w:bottom w:val="single" w:sz="18" w:space="0" w:color="999999"/>
+              <w:right w:val="single" w:sz="18" w:space="0" w:color="999999"/>
+            </w:tcBorders>
+            <w:vAlign w:val="center"/>
+            <w:hideMark/>
+          </w:tcPr>
+          <w:p>
+            <w:pPr>
+              <w:spacing w:line="256" w:lineRule="auto"/>
+              <w:ind w:right="-214"/>
+              <w:rPr>
+                <w:rFonts w:ascii="Arial" w:hAnsi="Arial" w:cs="Arial"/>
+                <w:sz w:val="18"/>
+                <w:szCs w:val="18"/>
+                <w:lang w:eastAsia="en-US"/>
+              </w:rPr>
+            </w:pPr>
+            <w:r>
+              <w:rPr>
+                <w:sz w:val="18"/>
+                <w:szCs w:val="18"/>
+                <w:lang w:eastAsia="en-US"/>
+              </w:rPr>
+              <w:t xml:space="preserve">Автор тестсьюту </w:t>
+            </w:r>
+          </w:p>
+          <w:p>
+            <w:pPr>
+              <w:spacing w:line="256" w:lineRule="auto"/>
+              <w:ind w:right="-214"/>
+              <w:rPr>
+                <w:sz w:val="18"/>
+                <w:szCs w:val="18"/>
+                <w:lang w:eastAsia="en-US"/>
+              </w:rPr>
+            </w:pPr>
+            <w:r>
+              <w:rPr>
+                <w:rFonts w:ascii="Arial" w:hAnsi="Arial" w:cs="Arial"/>
+                <w:sz w:val="18"/>
+                <w:szCs w:val="18"/>
+                <w:lang w:eastAsia="en-US"/>
+              </w:rPr>
+              <w:t>Test Suite Author</w:t>
+            </w:r>
+          </w:p>
+        </w:tc>
+        <w:tc>
+          <w:tcPr>
+            <w:tcW w:w="3296" w:type="dxa"/>
+            <w:tcBorders>
+              <w:top w:val="single" w:sz="18" w:space="0" w:color="999999"/>
+              <w:left w:val="single" w:sz="18" w:space="0" w:color="999999"/>
+              <w:bottom w:val="single" w:sz="18" w:space="0" w:color="999999"/>
+              <w:right w:val="single" w:sz="18" w:space="0" w:color="999999"/>
+            </w:tcBorders>
+            <w:vAlign w:val="center"/>
+            <w:hideMark/>
+          </w:tcPr>
+          <w:p>
+            <w:pPr>
+              <w:spacing w:line="256" w:lineRule="auto"/>
+              <w:ind w:left="104"/>
+              <w:rPr>
+                <w:rFonts w:ascii="Arial Narrow" w:hAnsi="Arial Narrow"/>
+                <w:sz w:val="20"/>
+                <w:szCs w:val="20"/>
+                <w:lang w:eastAsia="en-US"/>
+              </w:rPr>
+            </w:pPr>
+            <w:r>
+              <w:rPr>
+                <w:rFonts w:ascii="Arial Narrow" w:hAnsi="Arial Narrow"/>
+                <w:sz w:val="20"/>
+                <w:szCs w:val="20"/>
+                <w:lang w:eastAsia="en-US"/>
+              </w:rPr>
+              <w:t>Ніколенко Святослав</w:t>
+            </w:r>
+          </w:p>
+        </w:tc>
+      </w:tr>
+      <w:tr>
+        <w:trPr>
+          <w:trHeight w:val="567"/>
+        </w:trPr>
+        <w:tc>
+          <w:tcPr>
+            <w:tcW w:w="2538" w:type="dxa"/>
+            <w:tcBorders>
+              <w:top w:val="single" w:sz="18" w:space="0" w:color="999999"/>
+              <w:left w:val="single" w:sz="18" w:space="0" w:color="999999"/>
+              <w:bottom w:val="single" w:sz="18" w:space="0" w:color="999999"/>
+              <w:right w:val="single" w:sz="18" w:space="0" w:color="999999"/>
+            </w:tcBorders>
+            <w:vAlign w:val="center"/>
+            <w:hideMark/>
+          </w:tcPr>
+          <w:p>
+            <w:pPr>
+              <w:spacing w:line="256" w:lineRule="auto"/>
+              <w:ind w:right="-214"/>
+              <w:rPr>
+                <w:sz w:val="18"/>
+                <w:szCs w:val="18"/>
+                <w:lang w:eastAsia="en-US"/>
+              </w:rPr>
+            </w:pPr>
+            <w:r>
+              <w:rPr>
+                <w:sz w:val="18"/>
+                <w:szCs w:val="18"/>
+                <w:lang w:eastAsia="en-US"/>
+              </w:rPr>
+              <w:t xml:space="preserve">Виконавець </w:t>
+            </w:r>
+          </w:p>
+          <w:p>
+            <w:pPr>
+              <w:spacing w:line="256" w:lineRule="auto"/>
+              <w:ind w:right="-214"/>
+              <w:rPr>
+                <w:sz w:val="18"/>
+                <w:szCs w:val="18"/>
+                <w:lang w:eastAsia="en-US"/>
+              </w:rPr>
+            </w:pPr>
+            <w:r>
+              <w:rPr>
+                <w:rFonts w:ascii="Arial" w:hAnsi="Arial" w:cs="Arial"/>
+                <w:sz w:val="18"/>
+                <w:szCs w:val="18"/>
+                <w:lang w:eastAsia="en-US"/>
+              </w:rPr>
+              <w:t>Implementer</w:t>
+            </w:r>
+          </w:p>
+        </w:tc>
+        <w:tc>
+          <w:tcPr>
+            <w:tcW w:w="3296" w:type="dxa"/>
+            <w:tcBorders>
+              <w:top w:val="single" w:sz="18" w:space="0" w:color="999999"/>
+              <w:left w:val="single" w:sz="18" w:space="0" w:color="999999"/>
+              <w:bottom w:val="single" w:sz="18" w:space="0" w:color="999999"/>
+              <w:right w:val="single" w:sz="18" w:space="0" w:color="999999"/>
+            </w:tcBorders>
+            <w:vAlign w:val="center"/>
+            <w:hideMark/>
+          </w:tcPr>
+          <w:p>
+            <w:pPr>
+              <w:spacing w:line="256" w:lineRule="auto"/>
+              <w:ind w:left="104"/>
+              <w:rPr>
+                <w:rFonts w:ascii="Arial Narrow" w:hAnsi="Arial Narrow"/>
+                <w:sz w:val="20"/>
+                <w:szCs w:val="20"/>
+                <w:lang w:eastAsia="en-US"/>
+              </w:rPr>
+            </w:pPr>
+            <w:r>
+              <w:rPr>
+                <w:rFonts w:ascii="Arial Narrow" w:hAnsi="Arial Narrow"/>
+                <w:sz w:val="20"/>
+                <w:szCs w:val="20"/>
+                <w:lang w:eastAsia="en-US"/>
+              </w:rPr>
+              <w:t>Ніколенко Святослав</w:t>
+            </w:r>
+          </w:p>
+        </w:tc>
+      </w:tr>
+    </w:tbl>
+    <w:p>
+      <w:pPr>
+        <w:jc w:val="center"/>
+        <w:rPr>
+          <w:color w:val="606060"/>
+          <w:spacing w:val="-13"/>
+          <w:lang w:val="en-US"/>
+        </w:rPr>
+      </w:pPr>
+      <w:r>
+        <w:rPr>
+          <w:sz w:val="30"/>
+          <w:szCs w:val="30"/>
+          <w:lang w:val="en-US"/>
+        </w:rPr>
+        <w:br w:type="textWrapping" w:clear="all"/>
+      </w:r>
+    </w:p>
+    <w:tbl>
+      <w:tblPr>
+        <w:tblW w:w="10386" w:type="dxa"/>
+        <w:jc w:val="right"/>
+        <w:tblBorders>
+          <w:top w:val="single" w:sz="18" w:space="0" w:color="999999"/>
+          <w:left w:val="single" w:sz="18" w:space="0" w:color="999999"/>
+          <w:bottom w:val="single" w:sz="18" w:space="0" w:color="999999"/>
+          <w:right w:val="single" w:sz="18" w:space="0" w:color="999999"/>
+          <w:insideH w:val="single" w:sz="18" w:space="0" w:color="999999"/>
+          <w:insideV w:val="single" w:sz="18" w:space="0" w:color="999999"/>
+        </w:tblBorders>
+        <w:tblLook w:val="01E0" w:firstRow="1" w:lastRow="1" w:firstColumn="1" w:lastColumn="1" w:noHBand="0" w:noVBand="0"/>
+      </w:tblPr>
+      <w:tblGrid>
+        <w:gridCol w:w="1009"/>
+        <w:gridCol w:w="4400"/>
+        <w:gridCol w:w="3190"/>
+        <w:gridCol w:w="1787"/>
+      </w:tblGrid>
+      <w:tr>
+        <w:trPr>
+          <w:trHeight w:val="1260"/>
+          <w:jc w:val="right"/>
+        </w:trPr>
+        <w:tc>
+          <w:tcPr>
+            <w:tcW w:w="1009" w:type="dxa"/>
+            <w:tcBorders>
+              <w:top w:val="single" w:sz="18" w:space="0" w:color="999999"/>
+              <w:left w:val="single" w:sz="18" w:space="0" w:color="999999"/>
+              <w:bottom w:val="single" w:sz="18" w:space="0" w:color="999999"/>
+              <w:right w:val="single" w:sz="18" w:space="0" w:color="999999"/>
+            </w:tcBorders>
+            <w:shd w:val="clear" w:color="auto" w:fill="F3F3F3"/>
+            <w:vAlign w:val="center"/>
+            <w:hideMark/>
+          </w:tcPr>
+          <w:p>
+            <w:pPr>
+              <w:spacing w:line="192" w:lineRule="auto"/>
+              <w:jc w:val="center"/>
+              <w:rPr>
+                <w:sz w:val="20"/>
+                <w:szCs w:val="20"/>
+                <w:lang w:eastAsia="en-US"/>
+              </w:rPr>
+            </w:pPr>
+            <w:r>
+              <w:rPr>
+                <w:sz w:val="20"/>
+                <w:szCs w:val="20"/>
+                <w:lang w:eastAsia="en-US"/>
+              </w:rPr>
+              <w:t xml:space="preserve">Ід-р тест-кейса / </w:t>
+            </w:r>
+            <w:r>
+              <w:rPr>
+                <w:rFonts w:ascii="Arial" w:hAnsi="Arial" w:cs="Arial"/>
+                <w:sz w:val="20"/>
+                <w:szCs w:val="20"/>
+                <w:lang w:eastAsia="en-US"/>
+              </w:rPr>
+              <w:t>Test Case ID</w:t>
+            </w:r>
+          </w:p>
+        </w:tc>
+        <w:tc>
+          <w:tcPr>
+            <w:tcW w:w="4400" w:type="dxa"/>
+            <w:tcBorders>
+              <w:top w:val="single" w:sz="18" w:space="0" w:color="999999"/>
+              <w:left w:val="single" w:sz="18" w:space="0" w:color="999999"/>
+              <w:bottom w:val="single" w:sz="18" w:space="0" w:color="999999"/>
+              <w:right w:val="single" w:sz="18" w:space="0" w:color="999999"/>
+            </w:tcBorders>
+            <w:shd w:val="clear" w:color="auto" w:fill="F3F3F3"/>
+            <w:vAlign w:val="center"/>
+            <w:hideMark/>
+          </w:tcPr>
+          <w:p>
+            <w:pPr>
+              <w:spacing w:line="256" w:lineRule="auto"/>
+              <w:jc w:val="center"/>
+              <w:rPr>
+                <w:rFonts w:ascii="Arial" w:hAnsi="Arial" w:cs="Arial"/>
+                <w:sz w:val="20"/>
+                <w:szCs w:val="20"/>
+                <w:lang w:val="en-US" w:eastAsia="en-US"/>
+              </w:rPr>
+            </w:pPr>
+            <w:r>
+              <w:rPr>
+                <w:sz w:val="20"/>
+                <w:szCs w:val="20"/>
+                <w:lang w:eastAsia="en-US"/>
+              </w:rPr>
+              <w:t xml:space="preserve">Дії (кроки) </w:t>
+            </w:r>
+            <w:r>
+              <w:rPr>
+                <w:rFonts w:ascii="Arial" w:hAnsi="Arial" w:cs="Arial"/>
+                <w:sz w:val="20"/>
+                <w:szCs w:val="20"/>
+                <w:lang w:eastAsia="en-US"/>
+              </w:rPr>
+              <w:t xml:space="preserve">/ </w:t>
+            </w:r>
+          </w:p>
+          <w:p>
+            <w:pPr>
+              <w:spacing w:line="256" w:lineRule="auto"/>
+              <w:jc w:val="center"/>
+              <w:rPr>
+                <w:rFonts w:ascii="Georgia" w:hAnsi="Georgia"/>
+                <w:b/>
+                <w:bCs/>
+                <w:color w:val="2A2A2A"/>
+                <w:sz w:val="20"/>
+                <w:szCs w:val="20"/>
+                <w:lang w:eastAsia="en-US"/>
+              </w:rPr>
+            </w:pPr>
+            <w:r>
+              <w:rPr>
+                <w:rFonts w:ascii="Arial" w:hAnsi="Arial" w:cs="Arial"/>
+                <w:sz w:val="20"/>
+                <w:szCs w:val="20"/>
+                <w:lang w:eastAsia="en-US"/>
+              </w:rPr>
+              <w:t>Action (Test Step</w:t>
+            </w:r>
+            <w:r>
+              <w:rPr>
+                <w:rFonts w:ascii="Arial" w:hAnsi="Arial" w:cs="Arial"/>
+                <w:sz w:val="20"/>
+                <w:szCs w:val="20"/>
+                <w:lang w:val="en-US" w:eastAsia="en-US"/>
+              </w:rPr>
+              <w:t>s</w:t>
+            </w:r>
+            <w:r>
+              <w:rPr>
+                <w:rFonts w:ascii="Arial" w:hAnsi="Arial" w:cs="Arial"/>
+                <w:sz w:val="20"/>
+                <w:szCs w:val="20"/>
+                <w:lang w:eastAsia="en-US"/>
+              </w:rPr>
+              <w:t>)</w:t>
+            </w:r>
+          </w:p>
+        </w:tc>
+        <w:tc>
+          <w:tcPr>
+            <w:tcW w:w="3190" w:type="dxa"/>
+            <w:tcBorders>
+              <w:top w:val="single" w:sz="18" w:space="0" w:color="999999"/>
+              <w:left w:val="single" w:sz="18" w:space="0" w:color="999999"/>
+              <w:bottom w:val="single" w:sz="18" w:space="0" w:color="999999"/>
+              <w:right w:val="single" w:sz="18" w:space="0" w:color="999999"/>
+            </w:tcBorders>
+            <w:shd w:val="clear" w:color="auto" w:fill="F3F3F3"/>
+            <w:vAlign w:val="center"/>
+            <w:hideMark/>
+          </w:tcPr>
+          <w:p>
+            <w:pPr>
+              <w:spacing w:line="256" w:lineRule="auto"/>
+              <w:jc w:val="center"/>
+              <w:rPr>
+                <w:sz w:val="20"/>
+                <w:szCs w:val="20"/>
+                <w:lang w:val="ru-RU" w:eastAsia="en-US"/>
+              </w:rPr>
+            </w:pPr>
+            <w:r>
+              <w:rPr>
+                <w:sz w:val="20"/>
+                <w:szCs w:val="20"/>
+                <w:lang w:eastAsia="en-US"/>
+              </w:rPr>
+              <w:t xml:space="preserve">Очікуваний </w:t>
+            </w:r>
+          </w:p>
+          <w:p>
+            <w:pPr>
+              <w:spacing w:line="256" w:lineRule="auto"/>
+              <w:jc w:val="center"/>
+              <w:rPr>
+                <w:sz w:val="20"/>
+                <w:szCs w:val="20"/>
+                <w:lang w:val="ru-RU" w:eastAsia="en-US"/>
+              </w:rPr>
+            </w:pPr>
+            <w:r>
+              <w:rPr>
+                <w:sz w:val="20"/>
+                <w:szCs w:val="20"/>
+                <w:lang w:eastAsia="en-US"/>
+              </w:rPr>
+              <w:t xml:space="preserve">результат / </w:t>
+            </w:r>
+          </w:p>
+          <w:p>
+            <w:pPr>
+              <w:spacing w:line="256" w:lineRule="auto"/>
+              <w:jc w:val="center"/>
+              <w:rPr>
+                <w:sz w:val="20"/>
+                <w:szCs w:val="20"/>
+                <w:lang w:eastAsia="en-US"/>
+              </w:rPr>
+            </w:pPr>
+            <w:r>
+              <w:rPr>
+                <w:rFonts w:ascii="Arial" w:hAnsi="Arial" w:cs="Arial"/>
+                <w:sz w:val="20"/>
+                <w:szCs w:val="20"/>
+                <w:lang w:eastAsia="en-US"/>
+              </w:rPr>
+              <w:t>Expected Result</w:t>
+            </w:r>
+          </w:p>
+        </w:tc>
+        <w:tc>
+          <w:tcPr>
+            <w:tcW w:w="1787" w:type="dxa"/>
+            <w:tcBorders>
+              <w:top w:val="single" w:sz="18" w:space="0" w:color="999999"/>
+              <w:left w:val="single" w:sz="18" w:space="0" w:color="999999"/>
+              <w:bottom w:val="single" w:sz="18" w:space="0" w:color="999999"/>
+              <w:right w:val="single" w:sz="18" w:space="0" w:color="999999"/>
+            </w:tcBorders>
+            <w:shd w:val="clear" w:color="auto" w:fill="F3F3F3"/>
+            <w:vAlign w:val="center"/>
+            <w:hideMark/>
+          </w:tcPr>
+          <w:p>
+            <w:pPr>
+              <w:spacing w:line="256" w:lineRule="auto"/>
+              <w:ind w:left="-57" w:right="-57"/>
+              <w:jc w:val="center"/>
+              <w:rPr>
+                <w:rFonts w:ascii="Arial" w:hAnsi="Arial" w:cs="Arial"/>
+                <w:sz w:val="20"/>
+                <w:szCs w:val="20"/>
+                <w:lang w:eastAsia="en-US"/>
+              </w:rPr>
+            </w:pPr>
+            <w:r>
+              <w:rPr>
+                <w:sz w:val="20"/>
+                <w:szCs w:val="20"/>
+                <w:lang w:eastAsia="en-US"/>
+              </w:rPr>
+              <w:t xml:space="preserve">Результат тестування </w:t>
+            </w:r>
+            <w:r>
+              <w:rPr>
+                <w:rFonts w:ascii="Arial" w:hAnsi="Arial" w:cs="Arial"/>
+                <w:sz w:val="20"/>
+                <w:szCs w:val="20"/>
+                <w:lang w:eastAsia="en-US"/>
+              </w:rPr>
+              <w:t xml:space="preserve">/ </w:t>
+            </w:r>
+          </w:p>
+          <w:p>
+            <w:pPr>
+              <w:spacing w:line="256" w:lineRule="auto"/>
+              <w:ind w:left="-57" w:right="-57"/>
+              <w:jc w:val="center"/>
+              <w:rPr>
+                <w:sz w:val="20"/>
+                <w:szCs w:val="20"/>
+                <w:lang w:eastAsia="en-US"/>
+              </w:rPr>
+            </w:pPr>
+            <w:r>
+              <w:rPr>
+                <w:rFonts w:ascii="Arial" w:hAnsi="Arial" w:cs="Arial"/>
+                <w:sz w:val="20"/>
+                <w:szCs w:val="20"/>
+                <w:lang w:eastAsia="en-US"/>
+              </w:rPr>
+              <w:t>Test Result</w:t>
+            </w:r>
+          </w:p>
+        </w:tc>
+      </w:tr>
+      <w:tr>
+        <w:trPr>
+          <w:jc w:val="right"/>
+        </w:trPr>
+        <w:tc>
+          <w:tcPr>
+            <w:tcW w:w="1009" w:type="dxa"/>
+            <w:tcBorders>
+              <w:top w:val="single" w:sz="18" w:space="0" w:color="999999"/>
+              <w:left w:val="single" w:sz="18" w:space="0" w:color="999999"/>
+              <w:bottom w:val="single" w:sz="18" w:space="0" w:color="999999"/>
+              <w:right w:val="single" w:sz="18" w:space="0" w:color="999999"/>
+            </w:tcBorders>
+            <w:hideMark/>
+          </w:tcPr>
+          <w:p>
+            <w:pPr>
+              <w:spacing w:line="256" w:lineRule="auto"/>
+              <w:rPr>
+                <w:lang w:eastAsia="en-US"/>
+              </w:rPr>
+            </w:pPr>
+            <w:r>
+              <w:rPr>
+                <w:lang w:eastAsia="en-US"/>
+              </w:rPr>
+              <w:t>TC-2.1</w:t>
+            </w:r>
+          </w:p>
+        </w:tc>
+        <w:tc>
+          <w:tcPr>
+            <w:tcW w:w="4400" w:type="dxa"/>
+            <w:tcBorders>
+              <w:top w:val="single" w:sz="18" w:space="0" w:color="999999"/>
+              <w:left w:val="single" w:sz="18" w:space="0" w:color="999999"/>
+              <w:bottom w:val="single" w:sz="18" w:space="0" w:color="999999"/>
+              <w:right w:val="single" w:sz="18" w:space="0" w:color="999999"/>
+            </w:tcBorders>
+            <w:hideMark/>
+          </w:tcPr>
+          <w:p>
+            <w:pPr>
+              <w:spacing w:line="256" w:lineRule="auto"/>
+              <w:rPr>
+                <w:lang w:eastAsia="en-US"/>
+              </w:rPr>
+            </w:pPr>
+            <w:r>
+              <w:rPr>
+                <w:lang w:eastAsia="en-US"/>
+              </w:rPr>
+              <w:t>1. Викликати функцію task_9_2(4)</w:t>
+            </w:r>
+            <w:r>
+              <w:rPr>
+                <w:lang w:eastAsia="en-US"/>
+              </w:rPr>
+              <w:br/>
+              <w:t>2. Ввести числа: -5, 0, 10, 2000</w:t>
+            </w:r>
+          </w:p>
+        </w:tc>
+        <w:tc>
+          <w:tcPr>
+            <w:tcW w:w="3190" w:type="dxa"/>
+            <w:tcBorders>
+              <w:top w:val="single" w:sz="18" w:space="0" w:color="999999"/>
+              <w:left w:val="single" w:sz="18" w:space="0" w:color="999999"/>
+              <w:bottom w:val="single" w:sz="18" w:space="0" w:color="999999"/>
+              <w:right w:val="single" w:sz="18" w:space="0" w:color="999999"/>
+            </w:tcBorders>
+            <w:hideMark/>
+          </w:tcPr>
+          <w:p>
+            <w:pPr>
+              <w:spacing w:line="256" w:lineRule="auto"/>
+              <w:rPr>
+                <w:lang w:eastAsia="en-US"/>
+              </w:rPr>
+            </w:pPr>
+            <w:r>
+              <w:rPr>
+                <w:lang w:eastAsia="en-US"/>
+              </w:rPr>
+              <w:t>Вікно застосунку виведе:</w:t>
+            </w:r>
+            <w:r>
+              <w:rPr>
+                <w:lang w:eastAsia="en-US"/>
+              </w:rPr>
+              <w:br/>
+              <w:t>Від'ємних: 1</w:t>
+            </w:r>
+            <w:r>
+              <w:rPr>
+                <w:lang w:eastAsia="en-US"/>
+              </w:rPr>
+              <w:br/>
+              <w:t>Нулів: 1</w:t>
+            </w:r>
+            <w:r>
+              <w:rPr>
+                <w:lang w:eastAsia="en-US"/>
+              </w:rPr>
+              <w:br/>
+              <w:t>У діапазоні [5; 1024]: 1</w:t>
+            </w:r>
+          </w:p>
+        </w:tc>
+        <w:tc>
+          <w:tcPr>
+            <w:tcW w:w="1787" w:type="dxa"/>
+            <w:tcBorders>
+              <w:top w:val="single" w:sz="18" w:space="0" w:color="999999"/>
+              <w:left w:val="single" w:sz="18" w:space="0" w:color="999999"/>
+              <w:bottom w:val="single" w:sz="18" w:space="0" w:color="999999"/>
+              <w:right w:val="single" w:sz="18" w:space="0" w:color="999999"/>
+            </w:tcBorders>
+            <w:hideMark/>
+          </w:tcPr>
+          <w:p>
+            <w:pPr>
+              <w:spacing w:line="256" w:lineRule="auto"/>
+              <w:rPr>
+                <w:lang w:eastAsia="en-US"/>
+              </w:rPr>
+            </w:pPr>
+            <w:r>
+              <w:rPr>
+                <w:lang w:eastAsia="en-US"/>
+              </w:rPr>
+              <w:t>passed</w:t>
+            </w:r>
+          </w:p>
+        </w:tc>
+      </w:tr>
+      <w:tr>
+        <w:trPr>
+          <w:jc w:val="right"/>
+        </w:trPr>
+        <w:tc>
+          <w:tcPr>
+            <w:tcW w:w="1009" w:type="dxa"/>
+            <w:tcBorders>
+              <w:top w:val="single" w:sz="18" w:space="0" w:color="999999"/>
+              <w:left w:val="single" w:sz="18" w:space="0" w:color="999999"/>
+              <w:bottom w:val="single" w:sz="18" w:space="0" w:color="999999"/>
+              <w:right w:val="single" w:sz="18" w:space="0" w:color="999999"/>
+            </w:tcBorders>
+            <w:hideMark/>
+          </w:tcPr>
+          <w:p>
+            <w:pPr>
+              <w:spacing w:line="256" w:lineRule="auto"/>
+              <w:rPr>
+                <w:lang w:eastAsia="en-US"/>
+              </w:rPr>
+            </w:pPr>
+            <w:r>
+              <w:rPr>
+                <w:lang w:eastAsia="en-US"/>
+              </w:rPr>
+              <w:t>TC-2.2</w:t>
+            </w:r>
+          </w:p>
+        </w:tc>
+        <w:tc>
+          <w:tcPr>
+            <w:tcW w:w="4400" w:type="dxa"/>
+            <w:tcBorders>
+              <w:top w:val="single" w:sz="18" w:space="0" w:color="999999"/>
+              <w:left w:val="single" w:sz="18" w:space="0" w:color="999999"/>
+              <w:bottom w:val="single" w:sz="18" w:space="0" w:color="999999"/>
+              <w:right w:val="single" w:sz="18" w:space="0" w:color="999999"/>
+            </w:tcBorders>
+            <w:hideMark/>
+          </w:tcPr>
+          <w:p>
+            <w:pPr>
+              <w:spacing w:line="256" w:lineRule="auto"/>
+              <w:rPr>
+                <w:lang w:eastAsia="en-US"/>
+              </w:rPr>
+            </w:pPr>
+            <w:r>
+              <w:rPr>
+                <w:lang w:eastAsia="en-US"/>
+              </w:rPr>
+              <w:t>1. Викликати функцію task_9_2(3)</w:t>
+            </w:r>
+            <w:r>
+              <w:rPr>
+                <w:lang w:eastAsia="en-US"/>
+              </w:rPr>
+              <w:br/>
+              <w:t>2. Ввести числа: 0, 0, 0</w:t>
+            </w:r>
+          </w:p>
+        </w:tc>
+        <w:tc>
+          <w:tcPr>
+            <w:tcW w:w="3190" w:type="dxa"/>
+            <w:tcBorders>
+              <w:top w:val="single" w:sz="18" w:space="0" w:color="999999"/>
+              <w:left w:val="single" w:sz="18" w:space="0" w:color="999999"/>
+              <w:bottom w:val="single" w:sz="18" w:space="0" w:color="999999"/>
+              <w:right w:val="single" w:sz="18" w:space="0" w:color="999999"/>
+            </w:tcBorders>
+            <w:hideMark/>
+          </w:tcPr>
+          <w:p>
+            <w:pPr>
+              <w:spacing w:line="256" w:lineRule="auto"/>
+              <w:rPr>
+                <w:lang w:eastAsia="en-US"/>
+              </w:rPr>
+            </w:pPr>
+            <w:r>
+              <w:rPr>
+                <w:lang w:eastAsia="en-US"/>
+              </w:rPr>
+              <w:t>Вікно застосунку виведе:</w:t>
+            </w:r>
+            <w:r>
+              <w:rPr>
+                <w:lang w:eastAsia="en-US"/>
+              </w:rPr>
+              <w:br/>
+              <w:t>Від'ємних: 0</w:t>
+            </w:r>
+            <w:r>
+              <w:rPr>
+                <w:lang w:eastAsia="en-US"/>
+              </w:rPr>
+              <w:br/>
+            </w:r>
+            <w:r>
+              <w:rPr>
+                <w:lang w:eastAsia="en-US"/>
+              </w:rPr>
+              <w:lastRenderedPageBreak/>
+              <w:t>Нулів: 3</w:t>
+            </w:r>
+            <w:r>
+              <w:rPr>
+                <w:lang w:eastAsia="en-US"/>
+              </w:rPr>
+              <w:br/>
+              <w:t>У діапазоні [5; 1024]: 0</w:t>
+            </w:r>
+          </w:p>
+        </w:tc>
+        <w:tc>
+          <w:tcPr>
+            <w:tcW w:w="1787" w:type="dxa"/>
+            <w:tcBorders>
+              <w:top w:val="single" w:sz="18" w:space="0" w:color="999999"/>
+              <w:left w:val="single" w:sz="18" w:space="0" w:color="999999"/>
+              <w:bottom w:val="single" w:sz="18" w:space="0" w:color="999999"/>
+              <w:right w:val="single" w:sz="18" w:space="0" w:color="999999"/>
+            </w:tcBorders>
+            <w:hideMark/>
+          </w:tcPr>
+          <w:p>
+            <w:pPr>
+              <w:spacing w:line="256" w:lineRule="auto"/>
+              <w:rPr>
+                <w:lang w:eastAsia="en-US"/>
+              </w:rPr>
+            </w:pPr>
+            <w:r>
+              <w:rPr>
+                <w:lang w:eastAsia="en-US"/>
+              </w:rPr>
+              <w:lastRenderedPageBreak/>
+              <w:t>passed</w:t>
+            </w:r>
+          </w:p>
+        </w:tc>
+      </w:tr>
+      <w:tr>
+        <w:trPr>
+          <w:jc w:val="right"/>
+        </w:trPr>
+        <w:tc>
+          <w:tcPr>
+            <w:tcW w:w="1009" w:type="dxa"/>
+            <w:tcBorders>
+              <w:top w:val="single" w:sz="18" w:space="0" w:color="999999"/>
+              <w:left w:val="single" w:sz="18" w:space="0" w:color="999999"/>
+              <w:bottom w:val="single" w:sz="18" w:space="0" w:color="999999"/>
+              <w:right w:val="single" w:sz="18" w:space="0" w:color="999999"/>
+            </w:tcBorders>
+            <w:hideMark/>
+          </w:tcPr>
+          <w:p>
+            <w:pPr>
+              <w:spacing w:line="256" w:lineRule="auto"/>
+              <w:rPr>
+                <w:lang w:eastAsia="en-US"/>
+              </w:rPr>
+            </w:pPr>
+            <w:r>
+              <w:rPr>
+                <w:lang w:eastAsia="en-US"/>
+              </w:rPr>
+              <w:t>TC-2.3</w:t>
+            </w:r>
+          </w:p>
+        </w:tc>
+        <w:tc>
+          <w:tcPr>
+            <w:tcW w:w="4400" w:type="dxa"/>
+            <w:tcBorders>
+              <w:top w:val="single" w:sz="18" w:space="0" w:color="999999"/>
+              <w:left w:val="single" w:sz="18" w:space="0" w:color="999999"/>
+              <w:bottom w:val="single" w:sz="18" w:space="0" w:color="999999"/>
+              <w:right w:val="single" w:sz="18" w:space="0" w:color="999999"/>
+            </w:tcBorders>
+            <w:hideMark/>
+          </w:tcPr>
+          <w:p>
+            <w:pPr>
+              <w:spacing w:line="256" w:lineRule="auto"/>
+              <w:rPr>
+                <w:lang w:eastAsia="en-US"/>
+              </w:rPr>
+            </w:pPr>
+            <w:r>
+              <w:rPr>
+                <w:lang w:eastAsia="en-US"/>
+              </w:rPr>
+              <w:t>1. Викликати функцію task_9_2(3)</w:t>
+            </w:r>
+            <w:r>
+              <w:rPr>
+                <w:lang w:eastAsia="en-US"/>
+              </w:rPr>
+              <w:br/>
+              <w:t>2. Ввести числа: 5, 1024, -10</w:t>
+            </w:r>
+          </w:p>
+        </w:tc>
+        <w:tc>
+          <w:tcPr>
+            <w:tcW w:w="3190" w:type="dxa"/>
+            <w:tcBorders>
+              <w:top w:val="single" w:sz="18" w:space="0" w:color="999999"/>
+              <w:left w:val="single" w:sz="18" w:space="0" w:color="999999"/>
+              <w:bottom w:val="single" w:sz="18" w:space="0" w:color="999999"/>
+              <w:right w:val="single" w:sz="18" w:space="0" w:color="999999"/>
+            </w:tcBorders>
+            <w:hideMark/>
+          </w:tcPr>
+          <w:p>
+            <w:pPr>
+              <w:spacing w:line="256" w:lineRule="auto"/>
+              <w:rPr>
+                <w:lang w:eastAsia="en-US"/>
+              </w:rPr>
+            </w:pPr>
+            <w:r>
+              <w:rPr>
+                <w:lang w:eastAsia="en-US"/>
+              </w:rPr>
+              <w:t>Вікно застосунку виведе:</w:t>
+            </w:r>
+            <w:r>
+              <w:rPr>
+                <w:lang w:eastAsia="en-US"/>
+              </w:rPr>
+              <w:br/>
+              <w:t>Від'ємних: 1</w:t>
+            </w:r>
+            <w:r>
+              <w:rPr>
+                <w:lang w:eastAsia="en-US"/>
+              </w:rPr>
+              <w:br/>
+              <w:t>Нулів: 0</w:t>
+            </w:r>
+            <w:r>
+              <w:rPr>
+                <w:lang w:eastAsia="en-US"/>
+              </w:rPr>
+              <w:br/>
+              <w:t>У діапазоні [5; 1024]: 2</w:t>
+            </w:r>
+          </w:p>
+        </w:tc>
+        <w:tc>
+          <w:tcPr>
+            <w:tcW w:w="1787" w:type="dxa"/>
+            <w:tcBorders>
+              <w:top w:val="single" w:sz="18" w:space="0" w:color="999999"/>
+              <w:left w:val="single" w:sz="18" w:space="0" w:color="999999"/>
+              <w:bottom w:val="single" w:sz="18" w:space="0" w:color="999999"/>
+              <w:right w:val="single" w:sz="18" w:space="0" w:color="999999"/>
+            </w:tcBorders>
+            <w:hideMark/>
+          </w:tcPr>
+          <w:p>
+            <w:pPr>
+              <w:spacing w:line="256" w:lineRule="auto"/>
+              <w:rPr>
+                <w:lang w:eastAsia="en-US"/>
+              </w:rPr>
+            </w:pPr>
+            <w:r>
+              <w:rPr>
+                <w:lang w:eastAsia="en-US"/>
+              </w:rPr>
+              <w:t>passed</w:t>
+            </w:r>
+          </w:p>
+        </w:tc>
+      </w:tr>
+    </w:tbl>
+    <w:p/>
+    <w:p/>
+    <w:tbl>
+      <w:tblPr>
+        <w:tblpPr w:leftFromText="180" w:rightFromText="180" w:bottomFromText="160" w:vertAnchor="text" w:tblpXSpec="right" w:tblpY="1"/>
+        <w:tblOverlap w:val="never"/>
+        <w:tblW w:w="0" w:type="auto"/>
+        <w:tblBorders>
+          <w:top w:val="single" w:sz="18" w:space="0" w:color="999999"/>
+          <w:left w:val="single" w:sz="18" w:space="0" w:color="999999"/>
+          <w:bottom w:val="single" w:sz="18" w:space="0" w:color="999999"/>
+          <w:right w:val="single" w:sz="18" w:space="0" w:color="999999"/>
+          <w:insideH w:val="single" w:sz="18" w:space="0" w:color="999999"/>
+          <w:insideV w:val="single" w:sz="18" w:space="0" w:color="999999"/>
+        </w:tblBorders>
+        <w:tblLook w:val="01E0" w:firstRow="1" w:lastRow="1" w:firstColumn="1" w:lastColumn="1" w:noHBand="0" w:noVBand="0"/>
+      </w:tblPr>
+      <w:tblGrid>
+        <w:gridCol w:w="2538"/>
+        <w:gridCol w:w="3296"/>
+      </w:tblGrid>
+      <w:tr>
+        <w:trPr>
+          <w:trHeight w:val="567"/>
+        </w:trPr>
+        <w:tc>
+          <w:tcPr>
+            <w:tcW w:w="2538" w:type="dxa"/>
+            <w:tcBorders>
+              <w:top w:val="single" w:sz="18" w:space="0" w:color="999999"/>
+              <w:left w:val="single" w:sz="18" w:space="0" w:color="999999"/>
+              <w:bottom w:val="single" w:sz="18" w:space="0" w:color="999999"/>
+              <w:right w:val="single" w:sz="18" w:space="0" w:color="999999"/>
+            </w:tcBorders>
+            <w:vAlign w:val="center"/>
+            <w:hideMark/>
+          </w:tcPr>
+          <w:p>
+            <w:pPr>
+              <w:spacing w:line="256" w:lineRule="auto"/>
+              <w:ind w:right="-214"/>
+              <w:rPr>
+                <w:sz w:val="18"/>
+                <w:szCs w:val="18"/>
+                <w:lang w:eastAsia="en-US"/>
+              </w:rPr>
+            </w:pPr>
+            <w:r>
+              <w:rPr>
+                <w:sz w:val="18"/>
+                <w:szCs w:val="18"/>
+                <w:lang w:eastAsia="en-US"/>
+              </w:rPr>
+              <w:t>Назва тестового набору</w:t>
+            </w:r>
+          </w:p>
+          <w:p>
+            <w:pPr>
+              <w:spacing w:line="256" w:lineRule="auto"/>
+              <w:ind w:right="-214"/>
+              <w:rPr>
+                <w:sz w:val="18"/>
+                <w:szCs w:val="18"/>
+                <w:lang w:eastAsia="en-US"/>
+              </w:rPr>
+            </w:pPr>
+            <w:r>
+              <w:rPr>
+                <w:rFonts w:ascii="Arial" w:hAnsi="Arial" w:cs="Arial"/>
+                <w:sz w:val="18"/>
+                <w:szCs w:val="18"/>
+                <w:lang w:eastAsia="en-US"/>
+              </w:rPr>
+              <w:t>Test Suite Description</w:t>
+            </w:r>
+          </w:p>
+        </w:tc>
+        <w:tc>
+          <w:tcPr>
+            <w:tcW w:w="3296" w:type="dxa"/>
+            <w:tcBorders>
+              <w:top w:val="single" w:sz="18" w:space="0" w:color="999999"/>
+              <w:left w:val="single" w:sz="18" w:space="0" w:color="999999"/>
+              <w:bottom w:val="single" w:sz="18" w:space="0" w:color="999999"/>
+              <w:right w:val="single" w:sz="18" w:space="0" w:color="999999"/>
+            </w:tcBorders>
+            <w:vAlign w:val="center"/>
+            <w:hideMark/>
+          </w:tcPr>
+          <w:p>
+            <w:pPr>
+              <w:spacing w:line="256" w:lineRule="auto"/>
+              <w:ind w:left="104"/>
+              <w:rPr>
+                <w:rFonts w:ascii="Arial Narrow" w:hAnsi="Arial Narrow"/>
+                <w:sz w:val="20"/>
+                <w:szCs w:val="20"/>
+                <w:lang w:eastAsia="en-US"/>
+              </w:rPr>
+            </w:pPr>
+            <w:r>
+              <w:rPr>
+                <w:rFonts w:ascii="Arial Narrow" w:hAnsi="Arial Narrow"/>
+                <w:sz w:val="20"/>
+                <w:szCs w:val="20"/>
+                <w:lang w:val="en-US" w:eastAsia="en-US"/>
+              </w:rPr>
+              <w:t>TS_9_3</w:t>
+            </w:r>
+          </w:p>
+        </w:tc>
+      </w:tr>
+      <w:tr>
+        <w:trPr>
+          <w:trHeight w:val="567"/>
+        </w:trPr>
+        <w:tc>
+          <w:tcPr>
+            <w:tcW w:w="2538" w:type="dxa"/>
+            <w:tcBorders>
+              <w:top w:val="single" w:sz="18" w:space="0" w:color="999999"/>
+              <w:left w:val="single" w:sz="18" w:space="0" w:color="999999"/>
+              <w:bottom w:val="single" w:sz="18" w:space="0" w:color="999999"/>
+              <w:right w:val="single" w:sz="18" w:space="0" w:color="999999"/>
+            </w:tcBorders>
+            <w:vAlign w:val="center"/>
+            <w:hideMark/>
+          </w:tcPr>
+          <w:p>
+            <w:pPr>
+              <w:spacing w:line="256" w:lineRule="auto"/>
+              <w:ind w:right="-214"/>
+              <w:rPr>
+                <w:sz w:val="18"/>
+                <w:szCs w:val="18"/>
+                <w:lang w:eastAsia="en-US"/>
+              </w:rPr>
+            </w:pPr>
+            <w:r>
+              <w:rPr>
+                <w:sz w:val="18"/>
+                <w:szCs w:val="18"/>
+                <w:lang w:eastAsia="en-US"/>
+              </w:rPr>
+              <w:t>Назва проекта / ПЗ</w:t>
+            </w:r>
+          </w:p>
+          <w:p>
+            <w:pPr>
+              <w:spacing w:line="256" w:lineRule="auto"/>
+              <w:ind w:right="-214"/>
+              <w:rPr>
+                <w:sz w:val="18"/>
+                <w:szCs w:val="18"/>
+                <w:lang w:eastAsia="en-US"/>
+              </w:rPr>
+            </w:pPr>
+            <w:r>
+              <w:rPr>
+                <w:rFonts w:ascii="Arial" w:hAnsi="Arial" w:cs="Arial"/>
+                <w:sz w:val="18"/>
+                <w:szCs w:val="18"/>
+                <w:lang w:eastAsia="en-US"/>
+              </w:rPr>
+              <w:t>Name of Project / Software</w:t>
+            </w:r>
+          </w:p>
+        </w:tc>
+        <w:tc>
+          <w:tcPr>
+            <w:tcW w:w="3296" w:type="dxa"/>
+            <w:tcBorders>
+              <w:top w:val="single" w:sz="18" w:space="0" w:color="999999"/>
+              <w:left w:val="single" w:sz="18" w:space="0" w:color="999999"/>
+              <w:bottom w:val="single" w:sz="18" w:space="0" w:color="999999"/>
+              <w:right w:val="single" w:sz="18" w:space="0" w:color="999999"/>
+            </w:tcBorders>
+            <w:vAlign w:val="center"/>
+            <w:hideMark/>
+          </w:tcPr>
+          <w:p>
+            <w:pPr>
+              <w:spacing w:line="256" w:lineRule="auto"/>
+              <w:ind w:left="104"/>
+              <w:rPr>
+                <w:rFonts w:ascii="Arial Narrow" w:hAnsi="Arial Narrow"/>
+                <w:sz w:val="20"/>
+                <w:szCs w:val="20"/>
+                <w:lang w:eastAsia="en-US"/>
+              </w:rPr>
+            </w:pPr>
+            <w:r>
+              <w:rPr>
+                <w:sz w:val="22"/>
+                <w:szCs w:val="22"/>
+                <w:lang w:val="en-US" w:eastAsia="en-US"/>
+              </w:rPr>
+              <w:t>nikolenko</w:t>
+            </w:r>
+            <w:r>
+              <w:rPr>
+                <w:sz w:val="22"/>
+                <w:szCs w:val="22"/>
+                <w:lang w:eastAsia="en-US"/>
+              </w:rPr>
+              <w:t>-task_9_</w:t>
+            </w:r>
+            <w:r>
+              <w:rPr>
+                <w:sz w:val="22"/>
+                <w:szCs w:val="22"/>
+                <w:lang w:val="en-US" w:eastAsia="en-US"/>
+              </w:rPr>
+              <w:t>3</w:t>
+            </w:r>
+          </w:p>
+        </w:tc>
+      </w:tr>
+      <w:tr>
+        <w:trPr>
+          <w:trHeight w:val="567"/>
+        </w:trPr>
+        <w:tc>
+          <w:tcPr>
+            <w:tcW w:w="2538" w:type="dxa"/>
+            <w:tcBorders>
+              <w:top w:val="single" w:sz="18" w:space="0" w:color="999999"/>
+              <w:left w:val="single" w:sz="18" w:space="0" w:color="999999"/>
+              <w:bottom w:val="single" w:sz="18" w:space="0" w:color="999999"/>
+              <w:right w:val="single" w:sz="18" w:space="0" w:color="999999"/>
+            </w:tcBorders>
+            <w:vAlign w:val="center"/>
+            <w:hideMark/>
+          </w:tcPr>
+          <w:p>
+            <w:pPr>
+              <w:spacing w:line="256" w:lineRule="auto"/>
+              <w:ind w:right="-214"/>
+              <w:rPr>
+                <w:sz w:val="18"/>
+                <w:szCs w:val="18"/>
+                <w:lang w:eastAsia="en-US"/>
+              </w:rPr>
+            </w:pPr>
+            <w:r>
+              <w:rPr>
+                <w:sz w:val="18"/>
+                <w:szCs w:val="18"/>
+                <w:lang w:eastAsia="en-US"/>
+              </w:rPr>
+              <w:t>Рівень тестування</w:t>
+            </w:r>
+          </w:p>
+          <w:p>
+            <w:pPr>
+              <w:spacing w:line="256" w:lineRule="auto"/>
+              <w:ind w:right="-214"/>
+              <w:rPr>
+                <w:rFonts w:ascii="Arial" w:hAnsi="Arial" w:cs="Arial"/>
+                <w:sz w:val="18"/>
+                <w:szCs w:val="18"/>
+                <w:lang w:eastAsia="en-US"/>
+              </w:rPr>
+            </w:pPr>
+            <w:r>
+              <w:rPr>
+                <w:rFonts w:ascii="Arial" w:hAnsi="Arial" w:cs="Arial"/>
+                <w:sz w:val="18"/>
+                <w:szCs w:val="18"/>
+                <w:lang w:eastAsia="en-US"/>
+              </w:rPr>
+              <w:t>Level of Testing</w:t>
+            </w:r>
+          </w:p>
+        </w:tc>
+        <w:tc>
+          <w:tcPr>
+            <w:tcW w:w="3296" w:type="dxa"/>
+            <w:tcBorders>
+              <w:top w:val="single" w:sz="18" w:space="0" w:color="999999"/>
+              <w:left w:val="single" w:sz="18" w:space="0" w:color="999999"/>
+              <w:bottom w:val="single" w:sz="18" w:space="0" w:color="999999"/>
+              <w:right w:val="single" w:sz="18" w:space="0" w:color="999999"/>
+            </w:tcBorders>
+            <w:vAlign w:val="center"/>
+            <w:hideMark/>
+          </w:tcPr>
+          <w:p>
+            <w:pPr>
+              <w:spacing w:line="256" w:lineRule="auto"/>
+              <w:ind w:left="104" w:right="-218"/>
+              <w:rPr>
+                <w:rFonts w:ascii="Arial Narrow" w:hAnsi="Arial Narrow"/>
+                <w:sz w:val="20"/>
+                <w:szCs w:val="20"/>
+                <w:lang w:eastAsia="en-US"/>
+              </w:rPr>
+            </w:pPr>
+            <w:r>
+              <w:rPr>
+                <w:rFonts w:ascii="Arial Narrow" w:hAnsi="Arial Narrow"/>
+                <w:sz w:val="20"/>
+                <w:szCs w:val="20"/>
+                <w:lang w:eastAsia="en-US"/>
+              </w:rPr>
+              <w:t>системний  /  System Testing</w:t>
+            </w:r>
+          </w:p>
+        </w:tc>
+      </w:tr>
+      <w:tr>
+        <w:trPr>
+          <w:trHeight w:val="567"/>
+        </w:trPr>
+        <w:tc>
+          <w:tcPr>
+            <w:tcW w:w="2538" w:type="dxa"/>
+            <w:tcBorders>
+              <w:top w:val="single" w:sz="18" w:space="0" w:color="999999"/>
+              <w:left w:val="single" w:sz="18" w:space="0" w:color="999999"/>
+              <w:bottom w:val="single" w:sz="18" w:space="0" w:color="999999"/>
+              <w:right w:val="single" w:sz="18" w:space="0" w:color="999999"/>
+            </w:tcBorders>
+            <w:vAlign w:val="center"/>
+            <w:hideMark/>
+          </w:tcPr>
+          <w:p>
+            <w:pPr>
+              <w:spacing w:line="256" w:lineRule="auto"/>
+              <w:ind w:right="-214"/>
+              <w:rPr>
+                <w:rFonts w:ascii="Arial" w:hAnsi="Arial" w:cs="Arial"/>
+                <w:sz w:val="18"/>
+                <w:szCs w:val="18"/>
+                <w:lang w:eastAsia="en-US"/>
+              </w:rPr>
+            </w:pPr>
+            <w:r>
+              <w:rPr>
+                <w:sz w:val="18"/>
+                <w:szCs w:val="18"/>
+                <w:lang w:eastAsia="en-US"/>
+              </w:rPr>
+              <w:t xml:space="preserve">Автор тестсьюту </w:t>
+            </w:r>
+          </w:p>
+          <w:p>
+            <w:pPr>
+              <w:spacing w:line="256" w:lineRule="auto"/>
+              <w:ind w:right="-214"/>
+              <w:rPr>
+                <w:sz w:val="18"/>
+                <w:szCs w:val="18"/>
+                <w:lang w:eastAsia="en-US"/>
+              </w:rPr>
+            </w:pPr>
+            <w:r>
+              <w:rPr>
+                <w:rFonts w:ascii="Arial" w:hAnsi="Arial" w:cs="Arial"/>
+                <w:sz w:val="18"/>
+                <w:szCs w:val="18"/>
+                <w:lang w:eastAsia="en-US"/>
+              </w:rPr>
+              <w:t>Test Suite Author</w:t>
+            </w:r>
+          </w:p>
+        </w:tc>
+        <w:tc>
+          <w:tcPr>
+            <w:tcW w:w="3296" w:type="dxa"/>
+            <w:tcBorders>
+              <w:top w:val="single" w:sz="18" w:space="0" w:color="999999"/>
+              <w:left w:val="single" w:sz="18" w:space="0" w:color="999999"/>
+              <w:bottom w:val="single" w:sz="18" w:space="0" w:color="999999"/>
+              <w:right w:val="single" w:sz="18" w:space="0" w:color="999999"/>
+            </w:tcBorders>
+            <w:vAlign w:val="center"/>
+            <w:hideMark/>
+          </w:tcPr>
+          <w:p>
+            <w:pPr>
+              <w:spacing w:line="256" w:lineRule="auto"/>
+              <w:ind w:left="104"/>
+              <w:rPr>
+                <w:rFonts w:ascii="Arial Narrow" w:hAnsi="Arial Narrow"/>
+                <w:sz w:val="20"/>
+                <w:szCs w:val="20"/>
+                <w:lang w:eastAsia="en-US"/>
+              </w:rPr>
+            </w:pPr>
+            <w:r>
+              <w:rPr>
+                <w:rFonts w:ascii="Arial Narrow" w:hAnsi="Arial Narrow"/>
+                <w:sz w:val="20"/>
+                <w:szCs w:val="20"/>
+                <w:lang w:eastAsia="en-US"/>
+              </w:rPr>
+              <w:t>Ніколенко Святослав</w:t>
+            </w:r>
+          </w:p>
+        </w:tc>
+      </w:tr>
+      <w:tr>
+        <w:trPr>
+          <w:trHeight w:val="567"/>
+        </w:trPr>
+        <w:tc>
+          <w:tcPr>
+            <w:tcW w:w="2538" w:type="dxa"/>
+            <w:tcBorders>
+              <w:top w:val="single" w:sz="18" w:space="0" w:color="999999"/>
+              <w:left w:val="single" w:sz="18" w:space="0" w:color="999999"/>
+              <w:bottom w:val="single" w:sz="18" w:space="0" w:color="999999"/>
+              <w:right w:val="single" w:sz="18" w:space="0" w:color="999999"/>
+            </w:tcBorders>
+            <w:vAlign w:val="center"/>
+            <w:hideMark/>
+          </w:tcPr>
+          <w:p>
+            <w:pPr>
+              <w:spacing w:line="256" w:lineRule="auto"/>
+              <w:ind w:right="-214"/>
+              <w:rPr>
+                <w:sz w:val="18"/>
+                <w:szCs w:val="18"/>
+                <w:lang w:eastAsia="en-US"/>
+              </w:rPr>
+            </w:pPr>
+            <w:r>
+              <w:rPr>
+                <w:sz w:val="18"/>
+                <w:szCs w:val="18"/>
+                <w:lang w:eastAsia="en-US"/>
+              </w:rPr>
+              <w:t xml:space="preserve">Виконавець </w:t>
+            </w:r>
+          </w:p>
+          <w:p>
+            <w:pPr>
+              <w:spacing w:line="256" w:lineRule="auto"/>
+              <w:ind w:right="-214"/>
+              <w:rPr>
+                <w:sz w:val="18"/>
+                <w:szCs w:val="18"/>
+                <w:lang w:eastAsia="en-US"/>
+              </w:rPr>
+            </w:pPr>
+            <w:r>
+              <w:rPr>
+                <w:rFonts w:ascii="Arial" w:hAnsi="Arial" w:cs="Arial"/>
+                <w:sz w:val="18"/>
+                <w:szCs w:val="18"/>
+                <w:lang w:eastAsia="en-US"/>
+              </w:rPr>
+              <w:t>Implementer</w:t>
+            </w:r>
+          </w:p>
+        </w:tc>
+        <w:tc>
+          <w:tcPr>
+            <w:tcW w:w="3296" w:type="dxa"/>
+            <w:tcBorders>
+              <w:top w:val="single" w:sz="18" w:space="0" w:color="999999"/>
+              <w:left w:val="single" w:sz="18" w:space="0" w:color="999999"/>
+              <w:bottom w:val="single" w:sz="18" w:space="0" w:color="999999"/>
+              <w:right w:val="single" w:sz="18" w:space="0" w:color="999999"/>
+            </w:tcBorders>
+            <w:vAlign w:val="center"/>
+            <w:hideMark/>
+          </w:tcPr>
+          <w:p>
+            <w:pPr>
+              <w:spacing w:line="256" w:lineRule="auto"/>
+              <w:ind w:left="104"/>
+              <w:rPr>
+                <w:rFonts w:ascii="Arial Narrow" w:hAnsi="Arial Narrow"/>
+                <w:sz w:val="20"/>
+                <w:szCs w:val="20"/>
+                <w:lang w:eastAsia="en-US"/>
+              </w:rPr>
+            </w:pPr>
+            <w:r>
+              <w:rPr>
+                <w:rFonts w:ascii="Arial Narrow" w:hAnsi="Arial Narrow"/>
+                <w:sz w:val="20"/>
+                <w:szCs w:val="20"/>
+                <w:lang w:eastAsia="en-US"/>
+              </w:rPr>
+              <w:t>Ніколенко Святослав</w:t>
+            </w:r>
+          </w:p>
+        </w:tc>
+      </w:tr>
+    </w:tbl>
+    <w:p>
+      <w:pPr>
+        <w:jc w:val="center"/>
+        <w:rPr>
+          <w:color w:val="606060"/>
+          <w:spacing w:val="-13"/>
+          <w:lang w:val="en-US"/>
+        </w:rPr>
+      </w:pPr>
+      <w:r>
+        <w:rPr>
+          <w:sz w:val="30"/>
+          <w:szCs w:val="30"/>
+          <w:lang w:val="en-US"/>
+        </w:rPr>
+        <w:br w:type="textWrapping" w:clear="all"/>
+      </w:r>
+    </w:p>
+    <w:tbl>
+      <w:tblPr>
+        <w:tblW w:w="10386" w:type="dxa"/>
+        <w:jc w:val="right"/>
+        <w:tblBorders>
+          <w:top w:val="single" w:sz="18" w:space="0" w:color="999999"/>
+          <w:left w:val="single" w:sz="18" w:space="0" w:color="999999"/>
+          <w:bottom w:val="single" w:sz="18" w:space="0" w:color="999999"/>
+          <w:right w:val="single" w:sz="18" w:space="0" w:color="999999"/>
+          <w:insideH w:val="single" w:sz="18" w:space="0" w:color="999999"/>
+          <w:insideV w:val="single" w:sz="18" w:space="0" w:color="999999"/>
+        </w:tblBorders>
+        <w:tblLook w:val="01E0" w:firstRow="1" w:lastRow="1" w:firstColumn="1" w:lastColumn="1" w:noHBand="0" w:noVBand="0"/>
+      </w:tblPr>
+      <w:tblGrid>
+        <w:gridCol w:w="1009"/>
+        <w:gridCol w:w="4400"/>
+        <w:gridCol w:w="3190"/>
+        <w:gridCol w:w="1787"/>
+      </w:tblGrid>
+      <w:tr>
+        <w:trPr>
+          <w:trHeight w:val="1260"/>
+          <w:jc w:val="right"/>
+        </w:trPr>
+        <w:tc>
+          <w:tcPr>
+            <w:tcW w:w="1009" w:type="dxa"/>
+            <w:tcBorders>
+              <w:top w:val="single" w:sz="18" w:space="0" w:color="999999"/>
+              <w:left w:val="single" w:sz="18" w:space="0" w:color="999999"/>
+              <w:bottom w:val="single" w:sz="18" w:space="0" w:color="999999"/>
+              <w:right w:val="single" w:sz="18" w:space="0" w:color="999999"/>
+            </w:tcBorders>
+            <w:shd w:val="clear" w:color="auto" w:fill="F3F3F3"/>
+            <w:vAlign w:val="center"/>
+            <w:hideMark/>
+          </w:tcPr>
+          <w:p>
+            <w:pPr>
+              <w:spacing w:line="192" w:lineRule="auto"/>
+              <w:jc w:val="center"/>
+              <w:rPr>
+                <w:sz w:val="20"/>
+                <w:szCs w:val="20"/>
+                <w:lang w:eastAsia="en-US"/>
+              </w:rPr>
+            </w:pPr>
+            <w:r>
+              <w:rPr>
+                <w:sz w:val="20"/>
+                <w:szCs w:val="20"/>
+                <w:lang w:eastAsia="en-US"/>
+              </w:rPr>
+              <w:t xml:space="preserve">Ід-р тест-кейса / </w:t>
+            </w:r>
+            <w:r>
+              <w:rPr>
+                <w:rFonts w:ascii="Arial" w:hAnsi="Arial" w:cs="Arial"/>
+                <w:sz w:val="20"/>
+                <w:szCs w:val="20"/>
+                <w:lang w:eastAsia="en-US"/>
+              </w:rPr>
+              <w:t>Test Case ID</w:t>
+            </w:r>
+          </w:p>
+        </w:tc>
+        <w:tc>
+          <w:tcPr>
+            <w:tcW w:w="4400" w:type="dxa"/>
+            <w:tcBorders>
+              <w:top w:val="single" w:sz="18" w:space="0" w:color="999999"/>
+              <w:left w:val="single" w:sz="18" w:space="0" w:color="999999"/>
+              <w:bottom w:val="single" w:sz="18" w:space="0" w:color="999999"/>
+              <w:right w:val="single" w:sz="18" w:space="0" w:color="999999"/>
+            </w:tcBorders>
+            <w:shd w:val="clear" w:color="auto" w:fill="F3F3F3"/>
+            <w:vAlign w:val="center"/>
+            <w:hideMark/>
+          </w:tcPr>
+          <w:p>
+            <w:pPr>
+              <w:spacing w:line="256" w:lineRule="auto"/>
+              <w:jc w:val="center"/>
+              <w:rPr>
+                <w:rFonts w:ascii="Arial" w:hAnsi="Arial" w:cs="Arial"/>
+                <w:sz w:val="20"/>
+                <w:szCs w:val="20"/>
+                <w:lang w:val="en-US" w:eastAsia="en-US"/>
+              </w:rPr>
+            </w:pPr>
+            <w:r>
+              <w:rPr>
+                <w:sz w:val="20"/>
+                <w:szCs w:val="20"/>
+                <w:lang w:eastAsia="en-US"/>
+              </w:rPr>
+              <w:t xml:space="preserve">Дії (кроки) </w:t>
+            </w:r>
+            <w:r>
+              <w:rPr>
+                <w:rFonts w:ascii="Arial" w:hAnsi="Arial" w:cs="Arial"/>
+                <w:sz w:val="20"/>
+                <w:szCs w:val="20"/>
+                <w:lang w:eastAsia="en-US"/>
+              </w:rPr>
+              <w:t xml:space="preserve">/ </w:t>
+            </w:r>
+          </w:p>
+          <w:p>
+            <w:pPr>
+              <w:spacing w:line="256" w:lineRule="auto"/>
+              <w:jc w:val="center"/>
+              <w:rPr>
+                <w:rFonts w:ascii="Georgia" w:hAnsi="Georgia"/>
+                <w:b/>
+                <w:bCs/>
+                <w:color w:val="2A2A2A"/>
+                <w:sz w:val="20"/>
+                <w:szCs w:val="20"/>
+                <w:lang w:eastAsia="en-US"/>
+              </w:rPr>
+            </w:pPr>
+            <w:r>
+              <w:rPr>
+                <w:rFonts w:ascii="Arial" w:hAnsi="Arial" w:cs="Arial"/>
+                <w:sz w:val="20"/>
+                <w:szCs w:val="20"/>
+                <w:lang w:eastAsia="en-US"/>
+              </w:rPr>
+              <w:t>Action (Test Step</w:t>
+            </w:r>
+            <w:r>
+              <w:rPr>
+                <w:rFonts w:ascii="Arial" w:hAnsi="Arial" w:cs="Arial"/>
+                <w:sz w:val="20"/>
+                <w:szCs w:val="20"/>
+                <w:lang w:val="en-US" w:eastAsia="en-US"/>
+              </w:rPr>
+              <w:t>s</w:t>
+            </w:r>
+            <w:r>
+              <w:rPr>
+                <w:rFonts w:ascii="Arial" w:hAnsi="Arial" w:cs="Arial"/>
+                <w:sz w:val="20"/>
+                <w:szCs w:val="20"/>
+                <w:lang w:eastAsia="en-US"/>
+              </w:rPr>
+              <w:t>)</w:t>
+            </w:r>
+          </w:p>
+        </w:tc>
+        <w:tc>
+          <w:tcPr>
+            <w:tcW w:w="3190" w:type="dxa"/>
+            <w:tcBorders>
+              <w:top w:val="single" w:sz="18" w:space="0" w:color="999999"/>
+              <w:left w:val="single" w:sz="18" w:space="0" w:color="999999"/>
+              <w:bottom w:val="single" w:sz="18" w:space="0" w:color="999999"/>
+              <w:right w:val="single" w:sz="18" w:space="0" w:color="999999"/>
+            </w:tcBorders>
+            <w:shd w:val="clear" w:color="auto" w:fill="F3F3F3"/>
+            <w:vAlign w:val="center"/>
+            <w:hideMark/>
+          </w:tcPr>
+          <w:p>
+            <w:pPr>
+              <w:spacing w:line="256" w:lineRule="auto"/>
+              <w:jc w:val="center"/>
+              <w:rPr>
+                <w:sz w:val="20"/>
+                <w:szCs w:val="20"/>
+                <w:lang w:val="ru-RU" w:eastAsia="en-US"/>
+              </w:rPr>
+            </w:pPr>
+            <w:r>
+              <w:rPr>
+                <w:sz w:val="20"/>
+                <w:szCs w:val="20"/>
+                <w:lang w:eastAsia="en-US"/>
+              </w:rPr>
+              <w:t xml:space="preserve">Очікуваний </w:t>
+            </w:r>
+          </w:p>
+          <w:p>
+            <w:pPr>
+              <w:spacing w:line="256" w:lineRule="auto"/>
+              <w:jc w:val="center"/>
+              <w:rPr>
+                <w:sz w:val="20"/>
+                <w:szCs w:val="20"/>
+                <w:lang w:val="ru-RU" w:eastAsia="en-US"/>
+              </w:rPr>
+            </w:pPr>
+            <w:r>
+              <w:rPr>
+                <w:sz w:val="20"/>
+                <w:szCs w:val="20"/>
+                <w:lang w:eastAsia="en-US"/>
+              </w:rPr>
+              <w:t xml:space="preserve">результат / </w:t>
+            </w:r>
+          </w:p>
+          <w:p>
+            <w:pPr>
+              <w:spacing w:line="256" w:lineRule="auto"/>
+              <w:jc w:val="center"/>
+              <w:rPr>
+                <w:sz w:val="20"/>
+                <w:szCs w:val="20"/>
+                <w:lang w:eastAsia="en-US"/>
+              </w:rPr>
+            </w:pPr>
+            <w:r>
+              <w:rPr>
+                <w:rFonts w:ascii="Arial" w:hAnsi="Arial" w:cs="Arial"/>
+                <w:sz w:val="20"/>
+                <w:szCs w:val="20"/>
+                <w:lang w:eastAsia="en-US"/>
+              </w:rPr>
+              <w:t>Expected Result</w:t>
+            </w:r>
+          </w:p>
+        </w:tc>
+        <w:tc>
+          <w:tcPr>
+            <w:tcW w:w="1787" w:type="dxa"/>
+            <w:tcBorders>
+              <w:top w:val="single" w:sz="18" w:space="0" w:color="999999"/>
+              <w:left w:val="single" w:sz="18" w:space="0" w:color="999999"/>
+              <w:bottom w:val="single" w:sz="18" w:space="0" w:color="999999"/>
+              <w:right w:val="single" w:sz="18" w:space="0" w:color="999999"/>
+            </w:tcBorders>
+            <w:shd w:val="clear" w:color="auto" w:fill="F3F3F3"/>
+            <w:vAlign w:val="center"/>
+            <w:hideMark/>
+          </w:tcPr>
+          <w:p>
+            <w:pPr>
+              <w:spacing w:line="256" w:lineRule="auto"/>
+              <w:ind w:left="-57" w:right="-57"/>
+              <w:jc w:val="center"/>
+              <w:rPr>
+                <w:rFonts w:ascii="Arial" w:hAnsi="Arial" w:cs="Arial"/>
+                <w:sz w:val="20"/>
+                <w:szCs w:val="20"/>
+                <w:lang w:eastAsia="en-US"/>
+              </w:rPr>
+            </w:pPr>
+            <w:r>
+              <w:rPr>
+                <w:sz w:val="20"/>
+                <w:szCs w:val="20"/>
+                <w:lang w:eastAsia="en-US"/>
+              </w:rPr>
+              <w:t xml:space="preserve">Результат тестування </w:t>
+            </w:r>
+            <w:r>
+              <w:rPr>
+                <w:rFonts w:ascii="Arial" w:hAnsi="Arial" w:cs="Arial"/>
+                <w:sz w:val="20"/>
+                <w:szCs w:val="20"/>
+                <w:lang w:eastAsia="en-US"/>
+              </w:rPr>
+              <w:t xml:space="preserve">/ </w:t>
+            </w:r>
+          </w:p>
+          <w:p>
+            <w:pPr>
+              <w:spacing w:line="256" w:lineRule="auto"/>
+              <w:ind w:left="-57" w:right="-57"/>
+              <w:jc w:val="center"/>
+              <w:rPr>
+                <w:sz w:val="20"/>
+                <w:szCs w:val="20"/>
+                <w:lang w:eastAsia="en-US"/>
+              </w:rPr>
+            </w:pPr>
+            <w:r>
+              <w:rPr>
+                <w:rFonts w:ascii="Arial" w:hAnsi="Arial" w:cs="Arial"/>
+                <w:sz w:val="20"/>
+                <w:szCs w:val="20"/>
+                <w:lang w:eastAsia="en-US"/>
+              </w:rPr>
+              <w:t>Test Result</w:t>
+            </w:r>
+          </w:p>
+        </w:tc>
+      </w:tr>
+      <w:tr>
+        <w:trPr>
+          <w:jc w:val="right"/>
+        </w:trPr>
+        <w:tc>
+          <w:tcPr>
+            <w:tcW w:w="1009" w:type="dxa"/>
+            <w:tcBorders>
+              <w:top w:val="single" w:sz="18" w:space="0" w:color="999999"/>
+              <w:left w:val="single" w:sz="18" w:space="0" w:color="999999"/>
+              <w:bottom w:val="single" w:sz="18" w:space="0" w:color="999999"/>
+              <w:right w:val="single" w:sz="18" w:space="0" w:color="999999"/>
+            </w:tcBorders>
+            <w:hideMark/>
+          </w:tcPr>
+          <w:p>
+            <w:pPr>
+              <w:spacing w:line="256" w:lineRule="auto"/>
+              <w:rPr>
+                <w:lang w:eastAsia="en-US"/>
+              </w:rPr>
+            </w:pPr>
+            <w:r>
+              <w:rPr>
+                <w:lang w:eastAsia="en-US"/>
+              </w:rPr>
+              <w:t>TC-3.1</w:t>
+            </w:r>
+          </w:p>
+        </w:tc>
+        <w:tc>
+          <w:tcPr>
+            <w:tcW w:w="4400" w:type="dxa"/>
+            <w:tcBorders>
+              <w:top w:val="single" w:sz="18" w:space="0" w:color="999999"/>
+              <w:left w:val="single" w:sz="18" w:space="0" w:color="999999"/>
+              <w:bottom w:val="single" w:sz="18" w:space="0" w:color="999999"/>
+              <w:right w:val="single" w:sz="18" w:space="0" w:color="999999"/>
+            </w:tcBorders>
+            <w:hideMark/>
+          </w:tcPr>
+          <w:p>
+            <w:pPr>
+              <w:spacing w:line="256" w:lineRule="auto"/>
+              <w:rPr>
+                <w:lang w:eastAsia="en-US"/>
+              </w:rPr>
+            </w:pPr>
+            <w:r>
+              <w:rPr>
+                <w:lang w:eastAsia="en-US"/>
+              </w:rPr>
+              <w:t>1. Викликати функцію task_9_3(5)</w:t>
+            </w:r>
+          </w:p>
+        </w:tc>
+        <w:tc>
+          <w:tcPr>
+            <w:tcW w:w="3190" w:type="dxa"/>
+            <w:tcBorders>
+              <w:top w:val="single" w:sz="18" w:space="0" w:color="999999"/>
+              <w:left w:val="single" w:sz="18" w:space="0" w:color="999999"/>
+              <w:bottom w:val="single" w:sz="18" w:space="0" w:color="999999"/>
+              <w:right w:val="single" w:sz="18" w:space="0" w:color="999999"/>
+            </w:tcBorders>
+            <w:hideMark/>
+          </w:tcPr>
+          <w:p>
+            <w:pPr>
+              <w:spacing w:line="256" w:lineRule="auto"/>
+              <w:rPr>
+                <w:lang w:eastAsia="en-US"/>
+              </w:rPr>
+            </w:pPr>
+            <w:r>
+              <w:rPr>
+                <w:lang w:eastAsia="en-US"/>
+              </w:rPr>
+              <w:t>Функція поверне значення 2 (біт D1=0, кількість 1 дорівнює 2)</w:t>
+            </w:r>
+          </w:p>
+        </w:tc>
+        <w:tc>
+          <w:tcPr>
+            <w:tcW w:w="1787" w:type="dxa"/>
+            <w:tcBorders>
+              <w:top w:val="single" w:sz="18" w:space="0" w:color="999999"/>
+              <w:left w:val="single" w:sz="18" w:space="0" w:color="999999"/>
+              <w:bottom w:val="single" w:sz="18" w:space="0" w:color="999999"/>
+              <w:right w:val="single" w:sz="18" w:space="0" w:color="999999"/>
+            </w:tcBorders>
+            <w:hideMark/>
+          </w:tcPr>
+          <w:p>
+            <w:pPr>
+              <w:spacing w:line="256" w:lineRule="auto"/>
+              <w:rPr>
+                <w:lang w:eastAsia="en-US"/>
+              </w:rPr>
+            </w:pPr>
+            <w:r>
+              <w:rPr>
+                <w:lang w:eastAsia="en-US"/>
+              </w:rPr>
+              <w:t>passed</w:t>
+            </w:r>
+          </w:p>
+        </w:tc>
+      </w:tr>
+      <w:tr>
+        <w:trPr>
+          <w:jc w:val="right"/>
+        </w:trPr>
+        <w:tc>
+          <w:tcPr>
+            <w:tcW w:w="1009" w:type="dxa"/>
+            <w:tcBorders>
+              <w:top w:val="single" w:sz="18" w:space="0" w:color="999999"/>
+              <w:left w:val="single" w:sz="18" w:space="0" w:color="999999"/>
+              <w:bottom w:val="single" w:sz="18" w:space="0" w:color="999999"/>
+              <w:right w:val="single" w:sz="18" w:space="0" w:color="999999"/>
+            </w:tcBorders>
+            <w:hideMark/>
+          </w:tcPr>
+          <w:p>
+            <w:pPr>
+              <w:spacing w:line="256" w:lineRule="auto"/>
+              <w:rPr>
+                <w:lang w:eastAsia="en-US"/>
+              </w:rPr>
+            </w:pPr>
+            <w:r>
+              <w:rPr>
+                <w:lang w:eastAsia="en-US"/>
+              </w:rPr>
+              <w:t>TC-3.2</w:t>
+            </w:r>
+          </w:p>
+        </w:tc>
+        <w:tc>
+          <w:tcPr>
+            <w:tcW w:w="4400" w:type="dxa"/>
+            <w:tcBorders>
+              <w:top w:val="single" w:sz="18" w:space="0" w:color="999999"/>
+              <w:left w:val="single" w:sz="18" w:space="0" w:color="999999"/>
+              <w:bottom w:val="single" w:sz="18" w:space="0" w:color="999999"/>
+              <w:right w:val="single" w:sz="18" w:space="0" w:color="999999"/>
+            </w:tcBorders>
+            <w:hideMark/>
+          </w:tcPr>
+          <w:p>
+            <w:pPr>
+              <w:spacing w:line="256" w:lineRule="auto"/>
+              <w:rPr>
+                <w:lang w:eastAsia="en-US"/>
+              </w:rPr>
+            </w:pPr>
+            <w:r>
+              <w:rPr>
+                <w:lang w:eastAsia="en-US"/>
+              </w:rPr>
+              <w:t>1. Викликати функцію task_9_3(2)</w:t>
+            </w:r>
+          </w:p>
+        </w:tc>
+        <w:tc>
+          <w:tcPr>
+            <w:tcW w:w="3190" w:type="dxa"/>
+            <w:tcBorders>
+              <w:top w:val="single" w:sz="18" w:space="0" w:color="999999"/>
+              <w:left w:val="single" w:sz="18" w:space="0" w:color="999999"/>
+              <w:bottom w:val="single" w:sz="18" w:space="0" w:color="999999"/>
+              <w:right w:val="single" w:sz="18" w:space="0" w:color="999999"/>
+            </w:tcBorders>
+            <w:hideMark/>
+          </w:tcPr>
+          <w:p>
+            <w:pPr>
+              <w:spacing w:line="256" w:lineRule="auto"/>
+              <w:rPr>
+                <w:lang w:eastAsia="en-US"/>
+              </w:rPr>
+            </w:pPr>
+            <w:r>
+              <w:rPr>
+                <w:lang w:eastAsia="en-US"/>
+              </w:rPr>
+              <w:t>Функція поверне значення 31 (біт D1=1, кількість 0 дорівнює 31 для 32-бітного числа)</w:t>
+            </w:r>
+          </w:p>
+        </w:tc>
+        <w:tc>
+          <w:tcPr>
+            <w:tcW w:w="1787" w:type="dxa"/>
+            <w:tcBorders>
+              <w:top w:val="single" w:sz="18" w:space="0" w:color="999999"/>
+              <w:left w:val="single" w:sz="18" w:space="0" w:color="999999"/>
+              <w:bottom w:val="single" w:sz="18" w:space="0" w:color="999999"/>
+              <w:right w:val="single" w:sz="18" w:space="0" w:color="999999"/>
+            </w:tcBorders>
+            <w:hideMark/>
+          </w:tcPr>
+          <w:p>
+            <w:pPr>
+              <w:spacing w:line="256" w:lineRule="auto"/>
+              <w:rPr>
+                <w:lang w:eastAsia="en-US"/>
+              </w:rPr>
+            </w:pPr>
+            <w:r>
+              <w:rPr>
+                <w:lang w:eastAsia="en-US"/>
+              </w:rPr>
+              <w:t>passed</w:t>
+            </w:r>
+          </w:p>
+        </w:tc>
+      </w:tr>
+      <w:tr>
+        <w:trPr>
+          <w:jc w:val="right"/>
+        </w:trPr>
+        <w:tc>
+          <w:tcPr>
+            <w:tcW w:w="1009" w:type="dxa"/>
+            <w:tcBorders>
+              <w:top w:val="single" w:sz="18" w:space="0" w:color="999999"/>
+              <w:left w:val="single" w:sz="18" w:space="0" w:color="999999"/>
+              <w:bottom w:val="single" w:sz="18" w:space="0" w:color="999999"/>
+              <w:right w:val="single" w:sz="18" w:space="0" w:color="999999"/>
+            </w:tcBorders>
+            <w:hideMark/>
+          </w:tcPr>
+          <w:p>
+            <w:pPr>
+              <w:spacing w:line="256" w:lineRule="auto"/>
+              <w:rPr>
+                <w:lang w:eastAsia="en-US"/>
+              </w:rPr>
+            </w:pPr>
+            <w:r>
+              <w:rPr>
+                <w:lang w:eastAsia="en-US"/>
+              </w:rPr>
+              <w:t>TC-3.3</w:t>
+            </w:r>
+          </w:p>
+        </w:tc>
+        <w:tc>
+          <w:tcPr>
+            <w:tcW w:w="4400" w:type="dxa"/>
+            <w:tcBorders>
+              <w:top w:val="single" w:sz="18" w:space="0" w:color="999999"/>
+              <w:left w:val="single" w:sz="18" w:space="0" w:color="999999"/>
+              <w:bottom w:val="single" w:sz="18" w:space="0" w:color="999999"/>
+              <w:right w:val="single" w:sz="18" w:space="0" w:color="999999"/>
+            </w:tcBorders>
+            <w:hideMark/>
+          </w:tcPr>
+          <w:p>
+            <w:pPr>
+              <w:spacing w:line="256" w:lineRule="auto"/>
+              <w:rPr>
+                <w:lang w:eastAsia="en-US"/>
+              </w:rPr>
+            </w:pPr>
+            <w:r>
+              <w:rPr>
+                <w:lang w:eastAsia="en-US"/>
+              </w:rPr>
+              <w:t>1. Викликати функцію task_9_3(75000)</w:t>
+            </w:r>
+          </w:p>
+        </w:tc>
+        <w:tc>
+          <w:tcPr>
+            <w:tcW w:w="3190" w:type="dxa"/>
+            <w:tcBorders>
+              <w:top w:val="single" w:sz="18" w:space="0" w:color="999999"/>
+              <w:left w:val="single" w:sz="18" w:space="0" w:color="999999"/>
+              <w:bottom w:val="single" w:sz="18" w:space="0" w:color="999999"/>
+              <w:right w:val="single" w:sz="18" w:space="0" w:color="999999"/>
+            </w:tcBorders>
+            <w:hideMark/>
+          </w:tcPr>
+          <w:p>
+            <w:pPr>
+              <w:spacing w:line="256" w:lineRule="auto"/>
+              <w:rPr>
+                <w:lang w:eastAsia="en-US"/>
+              </w:rPr>
+            </w:pPr>
+            <w:r>
+              <w:rPr>
+                <w:lang w:eastAsia="en-US"/>
+              </w:rPr>
+              <w:t>Функція поверне код помилки -1 (число поза ОДЗ)</w:t>
+            </w:r>
+          </w:p>
+        </w:tc>
+        <w:tc>
+          <w:tcPr>
+            <w:tcW w:w="1787" w:type="dxa"/>
+            <w:tcBorders>
+              <w:top w:val="single" w:sz="18" w:space="0" w:color="999999"/>
+              <w:left w:val="single" w:sz="18" w:space="0" w:color="999999"/>
+              <w:bottom w:val="single" w:sz="18" w:space="0" w:color="999999"/>
+              <w:right w:val="single" w:sz="18" w:space="0" w:color="999999"/>
+            </w:tcBorders>
+            <w:hideMark/>
+          </w:tcPr>
+          <w:p>
+            <w:pPr>
+              <w:spacing w:line="256" w:lineRule="auto"/>
+              <w:rPr>
+                <w:lang w:eastAsia="en-US"/>
+              </w:rPr>
+            </w:pPr>
+            <w:r>
+              <w:rPr>
+                <w:lang w:eastAsia="en-US"/>
+              </w:rPr>
+              <w:t>passed</w:t>
+            </w:r>
+          </w:p>
+        </w:tc>
+      </w:tr>
+    </w:tbl>
     <w:p>
       <w:pPr>
         <w:rPr>

</xml_diff>

<commit_message>
Added results about test driver
</commit_message>
<xml_diff>
--- a/lab09/Report/Report.docx
+++ b/lab09/Report/Report.docx
@@ -6485,6 +6485,3335 @@
     <w:p>
       <w:pPr>
         <w:rPr>
+          <w:lang w:val="en-US"/>
+        </w:rPr>
+      </w:pPr>
+      <w:r>
+        <w:t>Лістинг програми</w:t>
+      </w:r>
+      <w:r>
+        <w:rPr>
+          <w:lang w:val="en-US"/>
+        </w:rPr>
+        <w:t>:</w:t>
+      </w:r>
+    </w:p>
+    <w:p>
+      <w:pPr>
+        <w:rPr>
+          <w:lang w:val="en-US"/>
+        </w:rPr>
+      </w:pPr>
+    </w:p>
+    <w:p>
+      <w:pPr>
+        <w:rPr>
+          <w:rFonts w:ascii="Courier New" w:hAnsi="Courier New" w:cs="Courier New"/>
+          <w:sz w:val="20"/>
+          <w:szCs w:val="20"/>
+          <w:lang w:val="en-US"/>
+        </w:rPr>
+      </w:pPr>
+      <w:r>
+        <w:rPr>
+          <w:rFonts w:ascii="Courier New" w:hAnsi="Courier New" w:cs="Courier New"/>
+          <w:sz w:val="20"/>
+          <w:szCs w:val="20"/>
+          <w:lang w:val="en-US"/>
+        </w:rPr>
+        <w:t>#include &lt;iostream&gt;</w:t>
+      </w:r>
+    </w:p>
+    <w:p>
+      <w:pPr>
+        <w:rPr>
+          <w:rFonts w:ascii="Courier New" w:hAnsi="Courier New" w:cs="Courier New"/>
+          <w:sz w:val="20"/>
+          <w:szCs w:val="20"/>
+          <w:lang w:val="en-US"/>
+        </w:rPr>
+      </w:pPr>
+      <w:r>
+        <w:rPr>
+          <w:rFonts w:ascii="Courier New" w:hAnsi="Courier New" w:cs="Courier New"/>
+          <w:sz w:val="20"/>
+          <w:szCs w:val="20"/>
+          <w:lang w:val="en-US"/>
+        </w:rPr>
+        <w:t>#include "D:\Nikolenko-Sviatoslav-KN25\lab08\prj\ModulesNikolenko.h"</w:t>
+      </w:r>
+    </w:p>
+    <w:p>
+      <w:pPr>
+        <w:rPr>
+          <w:rFonts w:ascii="Courier New" w:hAnsi="Courier New" w:cs="Courier New"/>
+          <w:sz w:val="20"/>
+          <w:szCs w:val="20"/>
+          <w:lang w:val="en-US"/>
+        </w:rPr>
+      </w:pPr>
+    </w:p>
+    <w:p>
+      <w:pPr>
+        <w:rPr>
+          <w:rFonts w:ascii="Courier New" w:hAnsi="Courier New" w:cs="Courier New"/>
+          <w:sz w:val="20"/>
+          <w:szCs w:val="20"/>
+          <w:lang w:val="en-US"/>
+        </w:rPr>
+      </w:pPr>
+      <w:r>
+        <w:rPr>
+          <w:rFonts w:ascii="Courier New" w:hAnsi="Courier New" w:cs="Courier New"/>
+          <w:sz w:val="20"/>
+          <w:szCs w:val="20"/>
+          <w:lang w:val="en-US"/>
+        </w:rPr>
+        <w:t>using namespace std;</w:t>
+      </w:r>
+    </w:p>
+    <w:p>
+      <w:pPr>
+        <w:rPr>
+          <w:rFonts w:ascii="Courier New" w:hAnsi="Courier New" w:cs="Courier New"/>
+          <w:sz w:val="20"/>
+          <w:szCs w:val="20"/>
+          <w:lang w:val="en-US"/>
+        </w:rPr>
+      </w:pPr>
+    </w:p>
+    <w:p>
+      <w:pPr>
+        <w:rPr>
+          <w:rFonts w:ascii="Courier New" w:hAnsi="Courier New" w:cs="Courier New"/>
+          <w:sz w:val="20"/>
+          <w:szCs w:val="20"/>
+          <w:lang w:val="en-US"/>
+        </w:rPr>
+      </w:pPr>
+      <w:r>
+        <w:rPr>
+          <w:rFonts w:ascii="Courier New" w:hAnsi="Courier New" w:cs="Courier New"/>
+          <w:sz w:val="20"/>
+          <w:szCs w:val="20"/>
+          <w:lang w:val="en-US"/>
+        </w:rPr>
+        <w:t>// ==========================================</w:t>
+      </w:r>
+    </w:p>
+    <w:p>
+      <w:pPr>
+        <w:rPr>
+          <w:rFonts w:ascii="Courier New" w:hAnsi="Courier New" w:cs="Courier New"/>
+          <w:sz w:val="20"/>
+          <w:szCs w:val="20"/>
+          <w:lang w:val="en-US"/>
+        </w:rPr>
+      </w:pPr>
+      <w:r>
+        <w:rPr>
+          <w:rFonts w:ascii="Courier New" w:hAnsi="Courier New" w:cs="Courier New"/>
+          <w:sz w:val="20"/>
+          <w:szCs w:val="20"/>
+          <w:lang w:val="en-US"/>
+        </w:rPr>
+        <w:t>// РЕАЛІЗАЦІЯ ЗАДАЧІ 9.1</w:t>
+      </w:r>
+    </w:p>
+    <w:p>
+      <w:pPr>
+        <w:rPr>
+          <w:rFonts w:ascii="Courier New" w:hAnsi="Courier New" w:cs="Courier New"/>
+          <w:sz w:val="20"/>
+          <w:szCs w:val="20"/>
+          <w:lang w:val="en-US"/>
+        </w:rPr>
+      </w:pPr>
+      <w:r>
+        <w:rPr>
+          <w:rFonts w:ascii="Courier New" w:hAnsi="Courier New" w:cs="Courier New"/>
+          <w:sz w:val="20"/>
+          <w:szCs w:val="20"/>
+          <w:lang w:val="en-US"/>
+        </w:rPr>
+        <w:t>// ==========================================</w:t>
+      </w:r>
+    </w:p>
+    <w:p>
+      <w:pPr>
+        <w:rPr>
+          <w:rFonts w:ascii="Courier New" w:hAnsi="Courier New" w:cs="Courier New"/>
+          <w:sz w:val="20"/>
+          <w:szCs w:val="20"/>
+          <w:lang w:val="en-US"/>
+        </w:rPr>
+      </w:pPr>
+      <w:r>
+        <w:rPr>
+          <w:rFonts w:ascii="Courier New" w:hAnsi="Courier New" w:cs="Courier New"/>
+          <w:sz w:val="20"/>
+          <w:szCs w:val="20"/>
+          <w:lang w:val="en-US"/>
+        </w:rPr>
+        <w:t>void task_9_1(int grade) {</w:t>
+      </w:r>
+    </w:p>
+    <w:p>
+      <w:pPr>
+        <w:rPr>
+          <w:rFonts w:ascii="Courier New" w:hAnsi="Courier New" w:cs="Courier New"/>
+          <w:sz w:val="20"/>
+          <w:szCs w:val="20"/>
+          <w:lang w:val="en-US"/>
+        </w:rPr>
+      </w:pPr>
+      <w:r>
+        <w:rPr>
+          <w:rFonts w:ascii="Courier New" w:hAnsi="Courier New" w:cs="Courier New"/>
+          <w:sz w:val="20"/>
+          <w:szCs w:val="20"/>
+          <w:lang w:val="en-US"/>
+        </w:rPr>
+        <w:t xml:space="preserve">    switch (grade) {</w:t>
+      </w:r>
+    </w:p>
+    <w:p>
+      <w:pPr>
+        <w:rPr>
+          <w:rFonts w:ascii="Courier New" w:hAnsi="Courier New" w:cs="Courier New"/>
+          <w:sz w:val="20"/>
+          <w:szCs w:val="20"/>
+          <w:lang w:val="en-US"/>
+        </w:rPr>
+      </w:pPr>
+      <w:r>
+        <w:rPr>
+          <w:rFonts w:ascii="Courier New" w:hAnsi="Courier New" w:cs="Courier New"/>
+          <w:sz w:val="20"/>
+          <w:szCs w:val="20"/>
+          <w:lang w:val="en-US"/>
+        </w:rPr>
+        <w:t xml:space="preserve">        case 0: cout &lt;&lt; "CALM-GLASSY, 0 METERS\n"; break;</w:t>
+      </w:r>
+    </w:p>
+    <w:p>
+      <w:pPr>
+        <w:rPr>
+          <w:rFonts w:ascii="Courier New" w:hAnsi="Courier New" w:cs="Courier New"/>
+          <w:sz w:val="20"/>
+          <w:szCs w:val="20"/>
+          <w:lang w:val="en-US"/>
+        </w:rPr>
+      </w:pPr>
+      <w:r>
+        <w:rPr>
+          <w:rFonts w:ascii="Courier New" w:hAnsi="Courier New" w:cs="Courier New"/>
+          <w:sz w:val="20"/>
+          <w:szCs w:val="20"/>
+          <w:lang w:val="en-US"/>
+        </w:rPr>
+        <w:t xml:space="preserve">        case 1: cout &lt;&lt; "CALM-RIPPLED, 0-0.1 METERS\n"; break;</w:t>
+      </w:r>
+    </w:p>
+    <w:p>
+      <w:pPr>
+        <w:rPr>
+          <w:rFonts w:ascii="Courier New" w:hAnsi="Courier New" w:cs="Courier New"/>
+          <w:sz w:val="20"/>
+          <w:szCs w:val="20"/>
+          <w:lang w:val="en-US"/>
+        </w:rPr>
+      </w:pPr>
+      <w:r>
+        <w:rPr>
+          <w:rFonts w:ascii="Courier New" w:hAnsi="Courier New" w:cs="Courier New"/>
+          <w:sz w:val="20"/>
+          <w:szCs w:val="20"/>
+          <w:lang w:val="en-US"/>
+        </w:rPr>
+        <w:t xml:space="preserve">        case 2: cout &lt;&lt; "SMOOTH-WAVELET, 0.1-0.5 METERS\n"; break;</w:t>
+      </w:r>
+    </w:p>
+    <w:p>
+      <w:pPr>
+        <w:rPr>
+          <w:rFonts w:ascii="Courier New" w:hAnsi="Courier New" w:cs="Courier New"/>
+          <w:sz w:val="20"/>
+          <w:szCs w:val="20"/>
+          <w:lang w:val="en-US"/>
+        </w:rPr>
+      </w:pPr>
+      <w:r>
+        <w:rPr>
+          <w:rFonts w:ascii="Courier New" w:hAnsi="Courier New" w:cs="Courier New"/>
+          <w:sz w:val="20"/>
+          <w:szCs w:val="20"/>
+          <w:lang w:val="en-US"/>
+        </w:rPr>
+        <w:t xml:space="preserve">        case 3: cout &lt;&lt; "SLIGHT, 0.5-1.25 METERS\n"; break;</w:t>
+      </w:r>
+    </w:p>
+    <w:p>
+      <w:pPr>
+        <w:rPr>
+          <w:rFonts w:ascii="Courier New" w:hAnsi="Courier New" w:cs="Courier New"/>
+          <w:sz w:val="20"/>
+          <w:szCs w:val="20"/>
+          <w:lang w:val="en-US"/>
+        </w:rPr>
+      </w:pPr>
+      <w:r>
+        <w:rPr>
+          <w:rFonts w:ascii="Courier New" w:hAnsi="Courier New" w:cs="Courier New"/>
+          <w:sz w:val="20"/>
+          <w:szCs w:val="20"/>
+          <w:lang w:val="en-US"/>
+        </w:rPr>
+        <w:t xml:space="preserve">        case 4: cout &lt;&lt; "MODERATE, 1.25-2.50 METERS\n"; break;</w:t>
+      </w:r>
+    </w:p>
+    <w:p>
+      <w:pPr>
+        <w:rPr>
+          <w:rFonts w:ascii="Courier New" w:hAnsi="Courier New" w:cs="Courier New"/>
+          <w:sz w:val="20"/>
+          <w:szCs w:val="20"/>
+          <w:lang w:val="en-US"/>
+        </w:rPr>
+      </w:pPr>
+      <w:r>
+        <w:rPr>
+          <w:rFonts w:ascii="Courier New" w:hAnsi="Courier New" w:cs="Courier New"/>
+          <w:sz w:val="20"/>
+          <w:szCs w:val="20"/>
+          <w:lang w:val="en-US"/>
+        </w:rPr>
+        <w:t xml:space="preserve">        case 5: cout &lt;&lt; "ROUGH, 2.50-4.0 METERS\n"; break;</w:t>
+      </w:r>
+    </w:p>
+    <w:p>
+      <w:pPr>
+        <w:rPr>
+          <w:rFonts w:ascii="Courier New" w:hAnsi="Courier New" w:cs="Courier New"/>
+          <w:sz w:val="20"/>
+          <w:szCs w:val="20"/>
+          <w:lang w:val="en-US"/>
+        </w:rPr>
+      </w:pPr>
+      <w:r>
+        <w:rPr>
+          <w:rFonts w:ascii="Courier New" w:hAnsi="Courier New" w:cs="Courier New"/>
+          <w:sz w:val="20"/>
+          <w:szCs w:val="20"/>
+          <w:lang w:val="en-US"/>
+        </w:rPr>
+        <w:t xml:space="preserve">        case 6: cout &lt;&lt; "VERY ROUGH, 4-6 METERS\n"; break;</w:t>
+      </w:r>
+    </w:p>
+    <w:p>
+      <w:pPr>
+        <w:rPr>
+          <w:rFonts w:ascii="Courier New" w:hAnsi="Courier New" w:cs="Courier New"/>
+          <w:sz w:val="20"/>
+          <w:szCs w:val="20"/>
+          <w:lang w:val="en-US"/>
+        </w:rPr>
+      </w:pPr>
+      <w:r>
+        <w:rPr>
+          <w:rFonts w:ascii="Courier New" w:hAnsi="Courier New" w:cs="Courier New"/>
+          <w:sz w:val="20"/>
+          <w:szCs w:val="20"/>
+          <w:lang w:val="en-US"/>
+        </w:rPr>
+        <w:t xml:space="preserve">        case 7: cout &lt;&lt; "HIGH, 6-9 METERS\n"; break;</w:t>
+      </w:r>
+    </w:p>
+    <w:p>
+      <w:pPr>
+        <w:rPr>
+          <w:rFonts w:ascii="Courier New" w:hAnsi="Courier New" w:cs="Courier New"/>
+          <w:sz w:val="20"/>
+          <w:szCs w:val="20"/>
+          <w:lang w:val="en-US"/>
+        </w:rPr>
+      </w:pPr>
+      <w:r>
+        <w:rPr>
+          <w:rFonts w:ascii="Courier New" w:hAnsi="Courier New" w:cs="Courier New"/>
+          <w:sz w:val="20"/>
+          <w:szCs w:val="20"/>
+          <w:lang w:val="en-US"/>
+        </w:rPr>
+        <w:lastRenderedPageBreak/>
+        <w:t xml:space="preserve">        case 8: cout &lt;&lt; "VERY HIGH, 9-14 METERS\n"; break;</w:t>
+      </w:r>
+    </w:p>
+    <w:p>
+      <w:pPr>
+        <w:rPr>
+          <w:rFonts w:ascii="Courier New" w:hAnsi="Courier New" w:cs="Courier New"/>
+          <w:sz w:val="20"/>
+          <w:szCs w:val="20"/>
+          <w:lang w:val="en-US"/>
+        </w:rPr>
+      </w:pPr>
+      <w:r>
+        <w:rPr>
+          <w:rFonts w:ascii="Courier New" w:hAnsi="Courier New" w:cs="Courier New"/>
+          <w:sz w:val="20"/>
+          <w:szCs w:val="20"/>
+          <w:lang w:val="en-US"/>
+        </w:rPr>
+        <w:t xml:space="preserve">        case 9: cout &lt;&lt; "PHENOMENAL, &gt;14 METERS\n"; break;</w:t>
+      </w:r>
+    </w:p>
+    <w:p>
+      <w:pPr>
+        <w:rPr>
+          <w:rFonts w:ascii="Courier New" w:hAnsi="Courier New" w:cs="Courier New"/>
+          <w:sz w:val="20"/>
+          <w:szCs w:val="20"/>
+          <w:lang w:val="en-US"/>
+        </w:rPr>
+      </w:pPr>
+      <w:r>
+        <w:rPr>
+          <w:rFonts w:ascii="Courier New" w:hAnsi="Courier New" w:cs="Courier New"/>
+          <w:sz w:val="20"/>
+          <w:szCs w:val="20"/>
+          <w:lang w:val="en-US"/>
+        </w:rPr>
+        <w:t xml:space="preserve">        default:</w:t>
+      </w:r>
+    </w:p>
+    <w:p>
+      <w:pPr>
+        <w:rPr>
+          <w:rFonts w:ascii="Courier New" w:hAnsi="Courier New" w:cs="Courier New"/>
+          <w:sz w:val="20"/>
+          <w:szCs w:val="20"/>
+          <w:lang w:val="en-US"/>
+        </w:rPr>
+      </w:pPr>
+      <w:r>
+        <w:rPr>
+          <w:rFonts w:ascii="Courier New" w:hAnsi="Courier New" w:cs="Courier New"/>
+          <w:sz w:val="20"/>
+          <w:szCs w:val="20"/>
+          <w:lang w:val="en-US"/>
+        </w:rPr>
+        <w:t xml:space="preserve">           </w:t>
+      </w:r>
+    </w:p>
+    <w:p>
+      <w:pPr>
+        <w:rPr>
+          <w:rFonts w:ascii="Courier New" w:hAnsi="Courier New" w:cs="Courier New"/>
+          <w:sz w:val="20"/>
+          <w:szCs w:val="20"/>
+          <w:lang w:val="en-US"/>
+        </w:rPr>
+      </w:pPr>
+      <w:r>
+        <w:rPr>
+          <w:rFonts w:ascii="Courier New" w:hAnsi="Courier New" w:cs="Courier New"/>
+          <w:sz w:val="20"/>
+          <w:szCs w:val="20"/>
+          <w:lang w:val="en-US"/>
+        </w:rPr>
+        <w:t xml:space="preserve">            cout &lt;&lt; "\aError: Invalid sea state grade! Must be 0-9.\n";</w:t>
+      </w:r>
+    </w:p>
+    <w:p>
+      <w:pPr>
+        <w:rPr>
+          <w:rFonts w:ascii="Courier New" w:hAnsi="Courier New" w:cs="Courier New"/>
+          <w:sz w:val="20"/>
+          <w:szCs w:val="20"/>
+          <w:lang w:val="en-US"/>
+        </w:rPr>
+      </w:pPr>
+      <w:r>
+        <w:rPr>
+          <w:rFonts w:ascii="Courier New" w:hAnsi="Courier New" w:cs="Courier New"/>
+          <w:sz w:val="20"/>
+          <w:szCs w:val="20"/>
+          <w:lang w:val="en-US"/>
+        </w:rPr>
+        <w:t xml:space="preserve">            break;</w:t>
+      </w:r>
+    </w:p>
+    <w:p>
+      <w:pPr>
+        <w:rPr>
+          <w:rFonts w:ascii="Courier New" w:hAnsi="Courier New" w:cs="Courier New"/>
+          <w:sz w:val="20"/>
+          <w:szCs w:val="20"/>
+          <w:lang w:val="en-US"/>
+        </w:rPr>
+      </w:pPr>
+      <w:r>
+        <w:rPr>
+          <w:rFonts w:ascii="Courier New" w:hAnsi="Courier New" w:cs="Courier New"/>
+          <w:sz w:val="20"/>
+          <w:szCs w:val="20"/>
+          <w:lang w:val="en-US"/>
+        </w:rPr>
+        <w:t xml:space="preserve">    }</w:t>
+      </w:r>
+    </w:p>
+    <w:p>
+      <w:pPr>
+        <w:rPr>
+          <w:rFonts w:ascii="Courier New" w:hAnsi="Courier New" w:cs="Courier New"/>
+          <w:sz w:val="20"/>
+          <w:szCs w:val="20"/>
+          <w:lang w:val="en-US"/>
+        </w:rPr>
+      </w:pPr>
+      <w:r>
+        <w:rPr>
+          <w:rFonts w:ascii="Courier New" w:hAnsi="Courier New" w:cs="Courier New"/>
+          <w:sz w:val="20"/>
+          <w:szCs w:val="20"/>
+          <w:lang w:val="en-US"/>
+        </w:rPr>
+        <w:t>}</w:t>
+      </w:r>
+    </w:p>
+    <w:p>
+      <w:pPr>
+        <w:rPr>
+          <w:rFonts w:ascii="Courier New" w:hAnsi="Courier New" w:cs="Courier New"/>
+          <w:sz w:val="20"/>
+          <w:szCs w:val="20"/>
+          <w:lang w:val="en-US"/>
+        </w:rPr>
+      </w:pPr>
+    </w:p>
+    <w:p>
+      <w:pPr>
+        <w:rPr>
+          <w:rFonts w:ascii="Courier New" w:hAnsi="Courier New" w:cs="Courier New"/>
+          <w:sz w:val="20"/>
+          <w:szCs w:val="20"/>
+          <w:lang w:val="en-US"/>
+        </w:rPr>
+      </w:pPr>
+      <w:r>
+        <w:rPr>
+          <w:rFonts w:ascii="Courier New" w:hAnsi="Courier New" w:cs="Courier New"/>
+          <w:sz w:val="20"/>
+          <w:szCs w:val="20"/>
+          <w:lang w:val="en-US"/>
+        </w:rPr>
+        <w:t>// ==========================================</w:t>
+      </w:r>
+    </w:p>
+    <w:p>
+      <w:pPr>
+        <w:rPr>
+          <w:rFonts w:ascii="Courier New" w:hAnsi="Courier New" w:cs="Courier New"/>
+          <w:sz w:val="20"/>
+          <w:szCs w:val="20"/>
+          <w:lang w:val="en-US"/>
+        </w:rPr>
+      </w:pPr>
+      <w:r>
+        <w:rPr>
+          <w:rFonts w:ascii="Courier New" w:hAnsi="Courier New" w:cs="Courier New"/>
+          <w:sz w:val="20"/>
+          <w:szCs w:val="20"/>
+          <w:lang w:val="en-US"/>
+        </w:rPr>
+        <w:t>// РЕАЛІЗАЦІЯ ЗАДАЧІ 9.2</w:t>
+      </w:r>
+    </w:p>
+    <w:p>
+      <w:pPr>
+        <w:rPr>
+          <w:rFonts w:ascii="Courier New" w:hAnsi="Courier New" w:cs="Courier New"/>
+          <w:sz w:val="20"/>
+          <w:szCs w:val="20"/>
+          <w:lang w:val="en-US"/>
+        </w:rPr>
+      </w:pPr>
+      <w:r>
+        <w:rPr>
+          <w:rFonts w:ascii="Courier New" w:hAnsi="Courier New" w:cs="Courier New"/>
+          <w:sz w:val="20"/>
+          <w:szCs w:val="20"/>
+          <w:lang w:val="en-US"/>
+        </w:rPr>
+        <w:t>// ==========================================</w:t>
+      </w:r>
+    </w:p>
+    <w:p>
+      <w:pPr>
+        <w:rPr>
+          <w:rFonts w:ascii="Courier New" w:hAnsi="Courier New" w:cs="Courier New"/>
+          <w:sz w:val="20"/>
+          <w:szCs w:val="20"/>
+          <w:lang w:val="en-US"/>
+        </w:rPr>
+      </w:pPr>
+      <w:r>
+        <w:rPr>
+          <w:rFonts w:ascii="Courier New" w:hAnsi="Courier New" w:cs="Courier New"/>
+          <w:sz w:val="20"/>
+          <w:szCs w:val="20"/>
+          <w:lang w:val="en-US"/>
+        </w:rPr>
+        <w:t>void task_9_2(int n) {</w:t>
+      </w:r>
+    </w:p>
+    <w:p>
+      <w:pPr>
+        <w:rPr>
+          <w:rFonts w:ascii="Courier New" w:hAnsi="Courier New" w:cs="Courier New"/>
+          <w:sz w:val="20"/>
+          <w:szCs w:val="20"/>
+          <w:lang w:val="en-US"/>
+        </w:rPr>
+      </w:pPr>
+      <w:r>
+        <w:rPr>
+          <w:rFonts w:ascii="Courier New" w:hAnsi="Courier New" w:cs="Courier New"/>
+          <w:sz w:val="20"/>
+          <w:szCs w:val="20"/>
+          <w:lang w:val="en-US"/>
+        </w:rPr>
+        <w:t xml:space="preserve">    if (n &lt;= 0) {</w:t>
+      </w:r>
+    </w:p>
+    <w:p>
+      <w:pPr>
+        <w:rPr>
+          <w:rFonts w:ascii="Courier New" w:hAnsi="Courier New" w:cs="Courier New"/>
+          <w:sz w:val="20"/>
+          <w:szCs w:val="20"/>
+          <w:lang w:val="en-US"/>
+        </w:rPr>
+      </w:pPr>
+      <w:r>
+        <w:rPr>
+          <w:rFonts w:ascii="Courier New" w:hAnsi="Courier New" w:cs="Courier New"/>
+          <w:sz w:val="20"/>
+          <w:szCs w:val="20"/>
+          <w:lang w:val="en-US"/>
+        </w:rPr>
+        <w:t xml:space="preserve">        cout &lt;&lt; "\aError: Number of elements (n) must be &gt; 0.\n";</w:t>
+      </w:r>
+    </w:p>
+    <w:p>
+      <w:pPr>
+        <w:rPr>
+          <w:rFonts w:ascii="Courier New" w:hAnsi="Courier New" w:cs="Courier New"/>
+          <w:sz w:val="20"/>
+          <w:szCs w:val="20"/>
+          <w:lang w:val="en-US"/>
+        </w:rPr>
+      </w:pPr>
+      <w:r>
+        <w:rPr>
+          <w:rFonts w:ascii="Courier New" w:hAnsi="Courier New" w:cs="Courier New"/>
+          <w:sz w:val="20"/>
+          <w:szCs w:val="20"/>
+          <w:lang w:val="en-US"/>
+        </w:rPr>
+        <w:t xml:space="preserve">        return;</w:t>
+      </w:r>
+    </w:p>
+    <w:p>
+      <w:pPr>
+        <w:rPr>
+          <w:rFonts w:ascii="Courier New" w:hAnsi="Courier New" w:cs="Courier New"/>
+          <w:sz w:val="20"/>
+          <w:szCs w:val="20"/>
+          <w:lang w:val="en-US"/>
+        </w:rPr>
+      </w:pPr>
+      <w:r>
+        <w:rPr>
+          <w:rFonts w:ascii="Courier New" w:hAnsi="Courier New" w:cs="Courier New"/>
+          <w:sz w:val="20"/>
+          <w:szCs w:val="20"/>
+          <w:lang w:val="en-US"/>
+        </w:rPr>
+        <w:t xml:space="preserve">    }</w:t>
+      </w:r>
+    </w:p>
+    <w:p>
+      <w:pPr>
+        <w:rPr>
+          <w:rFonts w:ascii="Courier New" w:hAnsi="Courier New" w:cs="Courier New"/>
+          <w:sz w:val="20"/>
+          <w:szCs w:val="20"/>
+          <w:lang w:val="en-US"/>
+        </w:rPr>
+      </w:pPr>
+    </w:p>
+    <w:p>
+      <w:pPr>
+        <w:rPr>
+          <w:rFonts w:ascii="Courier New" w:hAnsi="Courier New" w:cs="Courier New"/>
+          <w:sz w:val="20"/>
+          <w:szCs w:val="20"/>
+          <w:lang w:val="en-US"/>
+        </w:rPr>
+      </w:pPr>
+      <w:r>
+        <w:rPr>
+          <w:rFonts w:ascii="Courier New" w:hAnsi="Courier New" w:cs="Courier New"/>
+          <w:sz w:val="20"/>
+          <w:szCs w:val="20"/>
+          <w:lang w:val="en-US"/>
+        </w:rPr>
+        <w:t xml:space="preserve">    int count_neg = 0;</w:t>
+      </w:r>
+    </w:p>
+    <w:p>
+      <w:pPr>
+        <w:rPr>
+          <w:rFonts w:ascii="Courier New" w:hAnsi="Courier New" w:cs="Courier New"/>
+          <w:sz w:val="20"/>
+          <w:szCs w:val="20"/>
+          <w:lang w:val="en-US"/>
+        </w:rPr>
+      </w:pPr>
+      <w:r>
+        <w:rPr>
+          <w:rFonts w:ascii="Courier New" w:hAnsi="Courier New" w:cs="Courier New"/>
+          <w:sz w:val="20"/>
+          <w:szCs w:val="20"/>
+          <w:lang w:val="en-US"/>
+        </w:rPr>
+        <w:t xml:space="preserve">    int count_zero = 0;</w:t>
+      </w:r>
+    </w:p>
+    <w:p>
+      <w:pPr>
+        <w:rPr>
+          <w:rFonts w:ascii="Courier New" w:hAnsi="Courier New" w:cs="Courier New"/>
+          <w:sz w:val="20"/>
+          <w:szCs w:val="20"/>
+          <w:lang w:val="en-US"/>
+        </w:rPr>
+      </w:pPr>
+      <w:r>
+        <w:rPr>
+          <w:rFonts w:ascii="Courier New" w:hAnsi="Courier New" w:cs="Courier New"/>
+          <w:sz w:val="20"/>
+          <w:szCs w:val="20"/>
+          <w:lang w:val="en-US"/>
+        </w:rPr>
+        <w:t xml:space="preserve">    int count_range = 0;</w:t>
+      </w:r>
+    </w:p>
+    <w:p>
+      <w:pPr>
+        <w:rPr>
+          <w:rFonts w:ascii="Courier New" w:hAnsi="Courier New" w:cs="Courier New"/>
+          <w:sz w:val="20"/>
+          <w:szCs w:val="20"/>
+          <w:lang w:val="en-US"/>
+        </w:rPr>
+      </w:pPr>
+      <w:r>
+        <w:rPr>
+          <w:rFonts w:ascii="Courier New" w:hAnsi="Courier New" w:cs="Courier New"/>
+          <w:sz w:val="20"/>
+          <w:szCs w:val="20"/>
+          <w:lang w:val="en-US"/>
+        </w:rPr>
+        <w:t xml:space="preserve">    double num;</w:t>
+      </w:r>
+    </w:p>
+    <w:p>
+      <w:pPr>
+        <w:rPr>
+          <w:rFonts w:ascii="Courier New" w:hAnsi="Courier New" w:cs="Courier New"/>
+          <w:sz w:val="20"/>
+          <w:szCs w:val="20"/>
+          <w:lang w:val="en-US"/>
+        </w:rPr>
+      </w:pPr>
+    </w:p>
+    <w:p>
+      <w:pPr>
+        <w:rPr>
+          <w:rFonts w:ascii="Courier New" w:hAnsi="Courier New" w:cs="Courier New"/>
+          <w:sz w:val="20"/>
+          <w:szCs w:val="20"/>
+          <w:lang w:val="en-US"/>
+        </w:rPr>
+      </w:pPr>
+      <w:r>
+        <w:rPr>
+          <w:rFonts w:ascii="Courier New" w:hAnsi="Courier New" w:cs="Courier New"/>
+          <w:sz w:val="20"/>
+          <w:szCs w:val="20"/>
+          <w:lang w:val="en-US"/>
+        </w:rPr>
+        <w:t xml:space="preserve">    for (int i = 0; i &lt; n; i++) {</w:t>
+      </w:r>
+    </w:p>
+    <w:p>
+      <w:pPr>
+        <w:rPr>
+          <w:rFonts w:ascii="Courier New" w:hAnsi="Courier New" w:cs="Courier New"/>
+          <w:sz w:val="20"/>
+          <w:szCs w:val="20"/>
+          <w:lang w:val="en-US"/>
+        </w:rPr>
+      </w:pPr>
+      <w:r>
+        <w:rPr>
+          <w:rFonts w:ascii="Courier New" w:hAnsi="Courier New" w:cs="Courier New"/>
+          <w:sz w:val="20"/>
+          <w:szCs w:val="20"/>
+          <w:lang w:val="en-US"/>
+        </w:rPr>
+        <w:t xml:space="preserve">        cout &lt;&lt; "Enter number " &lt;&lt; (i + 1) &lt;&lt; ": ";</w:t>
+      </w:r>
+    </w:p>
+    <w:p>
+      <w:pPr>
+        <w:rPr>
+          <w:rFonts w:ascii="Courier New" w:hAnsi="Courier New" w:cs="Courier New"/>
+          <w:sz w:val="20"/>
+          <w:szCs w:val="20"/>
+          <w:lang w:val="en-US"/>
+        </w:rPr>
+      </w:pPr>
+      <w:r>
+        <w:rPr>
+          <w:rFonts w:ascii="Courier New" w:hAnsi="Courier New" w:cs="Courier New"/>
+          <w:sz w:val="20"/>
+          <w:szCs w:val="20"/>
+          <w:lang w:val="en-US"/>
+        </w:rPr>
+        <w:t xml:space="preserve">        cin &gt;&gt; num;</w:t>
+      </w:r>
+    </w:p>
+    <w:p>
+      <w:pPr>
+        <w:rPr>
+          <w:rFonts w:ascii="Courier New" w:hAnsi="Courier New" w:cs="Courier New"/>
+          <w:sz w:val="20"/>
+          <w:szCs w:val="20"/>
+          <w:lang w:val="en-US"/>
+        </w:rPr>
+      </w:pPr>
+    </w:p>
+    <w:p>
+      <w:pPr>
+        <w:rPr>
+          <w:rFonts w:ascii="Courier New" w:hAnsi="Courier New" w:cs="Courier New"/>
+          <w:sz w:val="20"/>
+          <w:szCs w:val="20"/>
+          <w:lang w:val="en-US"/>
+        </w:rPr>
+      </w:pPr>
+      <w:r>
+        <w:rPr>
+          <w:rFonts w:ascii="Courier New" w:hAnsi="Courier New" w:cs="Courier New"/>
+          <w:sz w:val="20"/>
+          <w:szCs w:val="20"/>
+          <w:lang w:val="en-US"/>
+        </w:rPr>
+        <w:t xml:space="preserve">        if (num &lt; 0) {</w:t>
+      </w:r>
+    </w:p>
+    <w:p>
+      <w:pPr>
+        <w:rPr>
+          <w:rFonts w:ascii="Courier New" w:hAnsi="Courier New" w:cs="Courier New"/>
+          <w:sz w:val="20"/>
+          <w:szCs w:val="20"/>
+          <w:lang w:val="en-US"/>
+        </w:rPr>
+      </w:pPr>
+      <w:r>
+        <w:rPr>
+          <w:rFonts w:ascii="Courier New" w:hAnsi="Courier New" w:cs="Courier New"/>
+          <w:sz w:val="20"/>
+          <w:szCs w:val="20"/>
+          <w:lang w:val="en-US"/>
+        </w:rPr>
+        <w:t xml:space="preserve">            count_neg++;</w:t>
+      </w:r>
+    </w:p>
+    <w:p>
+      <w:pPr>
+        <w:rPr>
+          <w:rFonts w:ascii="Courier New" w:hAnsi="Courier New" w:cs="Courier New"/>
+          <w:sz w:val="20"/>
+          <w:szCs w:val="20"/>
+          <w:lang w:val="en-US"/>
+        </w:rPr>
+      </w:pPr>
+      <w:r>
+        <w:rPr>
+          <w:rFonts w:ascii="Courier New" w:hAnsi="Courier New" w:cs="Courier New"/>
+          <w:sz w:val="20"/>
+          <w:szCs w:val="20"/>
+          <w:lang w:val="en-US"/>
+        </w:rPr>
+        <w:t xml:space="preserve">        }</w:t>
+      </w:r>
+    </w:p>
+    <w:p>
+      <w:pPr>
+        <w:rPr>
+          <w:rFonts w:ascii="Courier New" w:hAnsi="Courier New" w:cs="Courier New"/>
+          <w:sz w:val="20"/>
+          <w:szCs w:val="20"/>
+          <w:lang w:val="en-US"/>
+        </w:rPr>
+      </w:pPr>
+      <w:r>
+        <w:rPr>
+          <w:rFonts w:ascii="Courier New" w:hAnsi="Courier New" w:cs="Courier New"/>
+          <w:sz w:val="20"/>
+          <w:szCs w:val="20"/>
+          <w:lang w:val="en-US"/>
+        </w:rPr>
+        <w:t xml:space="preserve">        if (num == 0) {</w:t>
+      </w:r>
+    </w:p>
+    <w:p>
+      <w:pPr>
+        <w:rPr>
+          <w:rFonts w:ascii="Courier New" w:hAnsi="Courier New" w:cs="Courier New"/>
+          <w:sz w:val="20"/>
+          <w:szCs w:val="20"/>
+          <w:lang w:val="en-US"/>
+        </w:rPr>
+      </w:pPr>
+      <w:r>
+        <w:rPr>
+          <w:rFonts w:ascii="Courier New" w:hAnsi="Courier New" w:cs="Courier New"/>
+          <w:sz w:val="20"/>
+          <w:szCs w:val="20"/>
+          <w:lang w:val="en-US"/>
+        </w:rPr>
+        <w:t xml:space="preserve">            count_zero++;</w:t>
+      </w:r>
+    </w:p>
+    <w:p>
+      <w:pPr>
+        <w:rPr>
+          <w:rFonts w:ascii="Courier New" w:hAnsi="Courier New" w:cs="Courier New"/>
+          <w:sz w:val="20"/>
+          <w:szCs w:val="20"/>
+          <w:lang w:val="en-US"/>
+        </w:rPr>
+      </w:pPr>
+      <w:r>
+        <w:rPr>
+          <w:rFonts w:ascii="Courier New" w:hAnsi="Courier New" w:cs="Courier New"/>
+          <w:sz w:val="20"/>
+          <w:szCs w:val="20"/>
+          <w:lang w:val="en-US"/>
+        </w:rPr>
+        <w:t xml:space="preserve">        }</w:t>
+      </w:r>
+    </w:p>
+    <w:p>
+      <w:pPr>
+        <w:rPr>
+          <w:rFonts w:ascii="Courier New" w:hAnsi="Courier New" w:cs="Courier New"/>
+          <w:sz w:val="20"/>
+          <w:szCs w:val="20"/>
+          <w:lang w:val="en-US"/>
+        </w:rPr>
+      </w:pPr>
+      <w:r>
+        <w:rPr>
+          <w:rFonts w:ascii="Courier New" w:hAnsi="Courier New" w:cs="Courier New"/>
+          <w:sz w:val="20"/>
+          <w:szCs w:val="20"/>
+          <w:lang w:val="en-US"/>
+        </w:rPr>
+        <w:t xml:space="preserve">        if (num &gt;= 5 &amp;&amp; num &lt;= 1024) {</w:t>
+      </w:r>
+    </w:p>
+    <w:p>
+      <w:pPr>
+        <w:rPr>
+          <w:rFonts w:ascii="Courier New" w:hAnsi="Courier New" w:cs="Courier New"/>
+          <w:sz w:val="20"/>
+          <w:szCs w:val="20"/>
+          <w:lang w:val="en-US"/>
+        </w:rPr>
+      </w:pPr>
+      <w:r>
+        <w:rPr>
+          <w:rFonts w:ascii="Courier New" w:hAnsi="Courier New" w:cs="Courier New"/>
+          <w:sz w:val="20"/>
+          <w:szCs w:val="20"/>
+          <w:lang w:val="en-US"/>
+        </w:rPr>
+        <w:t xml:space="preserve">            count_range++;</w:t>
+      </w:r>
+    </w:p>
+    <w:p>
+      <w:pPr>
+        <w:rPr>
+          <w:rFonts w:ascii="Courier New" w:hAnsi="Courier New" w:cs="Courier New"/>
+          <w:sz w:val="20"/>
+          <w:szCs w:val="20"/>
+          <w:lang w:val="en-US"/>
+        </w:rPr>
+      </w:pPr>
+      <w:r>
+        <w:rPr>
+          <w:rFonts w:ascii="Courier New" w:hAnsi="Courier New" w:cs="Courier New"/>
+          <w:sz w:val="20"/>
+          <w:szCs w:val="20"/>
+          <w:lang w:val="en-US"/>
+        </w:rPr>
+        <w:t xml:space="preserve">        }</w:t>
+      </w:r>
+    </w:p>
+    <w:p>
+      <w:pPr>
+        <w:rPr>
+          <w:rFonts w:ascii="Courier New" w:hAnsi="Courier New" w:cs="Courier New"/>
+          <w:sz w:val="20"/>
+          <w:szCs w:val="20"/>
+          <w:lang w:val="en-US"/>
+        </w:rPr>
+      </w:pPr>
+      <w:r>
+        <w:rPr>
+          <w:rFonts w:ascii="Courier New" w:hAnsi="Courier New" w:cs="Courier New"/>
+          <w:sz w:val="20"/>
+          <w:szCs w:val="20"/>
+          <w:lang w:val="en-US"/>
+        </w:rPr>
+        <w:t xml:space="preserve">    }</w:t>
+      </w:r>
+    </w:p>
+    <w:p>
+      <w:pPr>
+        <w:rPr>
+          <w:rFonts w:ascii="Courier New" w:hAnsi="Courier New" w:cs="Courier New"/>
+          <w:sz w:val="20"/>
+          <w:szCs w:val="20"/>
+          <w:lang w:val="en-US"/>
+        </w:rPr>
+      </w:pPr>
+    </w:p>
+    <w:p>
+      <w:pPr>
+        <w:rPr>
+          <w:rFonts w:ascii="Courier New" w:hAnsi="Courier New" w:cs="Courier New"/>
+          <w:sz w:val="20"/>
+          <w:szCs w:val="20"/>
+          <w:lang w:val="en-US"/>
+        </w:rPr>
+      </w:pPr>
+      <w:r>
+        <w:rPr>
+          <w:rFonts w:ascii="Courier New" w:hAnsi="Courier New" w:cs="Courier New"/>
+          <w:sz w:val="20"/>
+          <w:szCs w:val="20"/>
+          <w:lang w:val="en-US"/>
+        </w:rPr>
+        <w:t xml:space="preserve">    cout &lt;&lt; "\nResults for task 9.2:" &lt;&lt; endl;</w:t>
+      </w:r>
+    </w:p>
+    <w:p>
+      <w:pPr>
+        <w:rPr>
+          <w:rFonts w:ascii="Courier New" w:hAnsi="Courier New" w:cs="Courier New"/>
+          <w:sz w:val="20"/>
+          <w:szCs w:val="20"/>
+          <w:lang w:val="en-US"/>
+        </w:rPr>
+      </w:pPr>
+      <w:r>
+        <w:rPr>
+          <w:rFonts w:ascii="Courier New" w:hAnsi="Courier New" w:cs="Courier New"/>
+          <w:sz w:val="20"/>
+          <w:szCs w:val="20"/>
+          <w:lang w:val="en-US"/>
+        </w:rPr>
+        <w:t xml:space="preserve">    cout &lt;&lt; "Count of negative numbers: " &lt;&lt; count_neg &lt;&lt; endl;</w:t>
+      </w:r>
+    </w:p>
+    <w:p>
+      <w:pPr>
+        <w:rPr>
+          <w:rFonts w:ascii="Courier New" w:hAnsi="Courier New" w:cs="Courier New"/>
+          <w:sz w:val="20"/>
+          <w:szCs w:val="20"/>
+          <w:lang w:val="en-US"/>
+        </w:rPr>
+      </w:pPr>
+      <w:r>
+        <w:rPr>
+          <w:rFonts w:ascii="Courier New" w:hAnsi="Courier New" w:cs="Courier New"/>
+          <w:sz w:val="20"/>
+          <w:szCs w:val="20"/>
+          <w:lang w:val="en-US"/>
+        </w:rPr>
+        <w:t xml:space="preserve">    cout &lt;&lt; "Count of zeros: " &lt;&lt; count_zero &lt;&lt; endl;</w:t>
+      </w:r>
+    </w:p>
+    <w:p>
+      <w:pPr>
+        <w:rPr>
+          <w:rFonts w:ascii="Courier New" w:hAnsi="Courier New" w:cs="Courier New"/>
+          <w:sz w:val="20"/>
+          <w:szCs w:val="20"/>
+          <w:lang w:val="en-US"/>
+        </w:rPr>
+      </w:pPr>
+      <w:r>
+        <w:rPr>
+          <w:rFonts w:ascii="Courier New" w:hAnsi="Courier New" w:cs="Courier New"/>
+          <w:sz w:val="20"/>
+          <w:szCs w:val="20"/>
+          <w:lang w:val="en-US"/>
+        </w:rPr>
+        <w:t xml:space="preserve">    cout &lt;&lt; "Count of numbers in range [5; 1024]: " &lt;&lt; count_range &lt;&lt; endl;</w:t>
+      </w:r>
+    </w:p>
+    <w:p>
+      <w:pPr>
+        <w:rPr>
+          <w:rFonts w:ascii="Courier New" w:hAnsi="Courier New" w:cs="Courier New"/>
+          <w:sz w:val="20"/>
+          <w:szCs w:val="20"/>
+          <w:lang w:val="en-US"/>
+        </w:rPr>
+      </w:pPr>
+      <w:r>
+        <w:rPr>
+          <w:rFonts w:ascii="Courier New" w:hAnsi="Courier New" w:cs="Courier New"/>
+          <w:sz w:val="20"/>
+          <w:szCs w:val="20"/>
+          <w:lang w:val="en-US"/>
+        </w:rPr>
+        <w:t>}</w:t>
+      </w:r>
+    </w:p>
+    <w:p>
+      <w:pPr>
+        <w:rPr>
+          <w:rFonts w:ascii="Courier New" w:hAnsi="Courier New" w:cs="Courier New"/>
+          <w:sz w:val="20"/>
+          <w:szCs w:val="20"/>
+          <w:lang w:val="en-US"/>
+        </w:rPr>
+      </w:pPr>
+    </w:p>
+    <w:p>
+      <w:pPr>
+        <w:rPr>
+          <w:rFonts w:ascii="Courier New" w:hAnsi="Courier New" w:cs="Courier New"/>
+          <w:sz w:val="20"/>
+          <w:szCs w:val="20"/>
+          <w:lang w:val="en-US"/>
+        </w:rPr>
+      </w:pPr>
+      <w:r>
+        <w:rPr>
+          <w:rFonts w:ascii="Courier New" w:hAnsi="Courier New" w:cs="Courier New"/>
+          <w:sz w:val="20"/>
+          <w:szCs w:val="20"/>
+          <w:lang w:val="en-US"/>
+        </w:rPr>
+        <w:t>// ==========================================</w:t>
+      </w:r>
+    </w:p>
+    <w:p>
+      <w:pPr>
+        <w:rPr>
+          <w:rFonts w:ascii="Courier New" w:hAnsi="Courier New" w:cs="Courier New"/>
+          <w:sz w:val="20"/>
+          <w:szCs w:val="20"/>
+          <w:lang w:val="en-US"/>
+        </w:rPr>
+      </w:pPr>
+      <w:r>
+        <w:rPr>
+          <w:rFonts w:ascii="Courier New" w:hAnsi="Courier New" w:cs="Courier New"/>
+          <w:sz w:val="20"/>
+          <w:szCs w:val="20"/>
+          <w:lang w:val="en-US"/>
+        </w:rPr>
+        <w:t>// РЕАЛІЗАЦІЯ ЗАДАЧІ 9.3</w:t>
+      </w:r>
+    </w:p>
+    <w:p>
+      <w:pPr>
+        <w:rPr>
+          <w:rFonts w:ascii="Courier New" w:hAnsi="Courier New" w:cs="Courier New"/>
+          <w:sz w:val="20"/>
+          <w:szCs w:val="20"/>
+          <w:lang w:val="en-US"/>
+        </w:rPr>
+      </w:pPr>
+      <w:r>
+        <w:rPr>
+          <w:rFonts w:ascii="Courier New" w:hAnsi="Courier New" w:cs="Courier New"/>
+          <w:sz w:val="20"/>
+          <w:szCs w:val="20"/>
+          <w:lang w:val="en-US"/>
+        </w:rPr>
+        <w:t>// ==========================================</w:t>
+      </w:r>
+    </w:p>
+    <w:p>
+      <w:pPr>
+        <w:rPr>
+          <w:rFonts w:ascii="Courier New" w:hAnsi="Courier New" w:cs="Courier New"/>
+          <w:sz w:val="20"/>
+          <w:szCs w:val="20"/>
+          <w:lang w:val="en-US"/>
+        </w:rPr>
+      </w:pPr>
+      <w:r>
+        <w:rPr>
+          <w:rFonts w:ascii="Courier New" w:hAnsi="Courier New" w:cs="Courier New"/>
+          <w:sz w:val="20"/>
+          <w:szCs w:val="20"/>
+          <w:lang w:val="en-US"/>
+        </w:rPr>
+        <w:t>int task_9_3(unsigned int N) {</w:t>
+      </w:r>
+    </w:p>
+    <w:p>
+      <w:pPr>
+        <w:rPr>
+          <w:rFonts w:ascii="Courier New" w:hAnsi="Courier New" w:cs="Courier New"/>
+          <w:sz w:val="20"/>
+          <w:szCs w:val="20"/>
+          <w:lang w:val="en-US"/>
+        </w:rPr>
+      </w:pPr>
+      <w:r>
+        <w:rPr>
+          <w:rFonts w:ascii="Courier New" w:hAnsi="Courier New" w:cs="Courier New"/>
+          <w:sz w:val="20"/>
+          <w:szCs w:val="20"/>
+          <w:lang w:val="en-US"/>
+        </w:rPr>
+        <w:t xml:space="preserve">    </w:t>
+      </w:r>
+    </w:p>
+    <w:p>
+      <w:pPr>
+        <w:rPr>
+          <w:rFonts w:ascii="Courier New" w:hAnsi="Courier New" w:cs="Courier New"/>
+          <w:sz w:val="20"/>
+          <w:szCs w:val="20"/>
+          <w:lang w:val="en-US"/>
+        </w:rPr>
+      </w:pPr>
+      <w:r>
+        <w:rPr>
+          <w:rFonts w:ascii="Courier New" w:hAnsi="Courier New" w:cs="Courier New"/>
+          <w:sz w:val="20"/>
+          <w:szCs w:val="20"/>
+          <w:lang w:val="en-US"/>
+        </w:rPr>
+        <w:t xml:space="preserve">    </w:t>
+      </w:r>
+      <w:r>
+        <w:rPr>
+          <w:rFonts w:ascii="Courier New" w:hAnsi="Courier New" w:cs="Courier New"/>
+          <w:sz w:val="20"/>
+          <w:szCs w:val="20"/>
+          <w:lang w:val="en-US"/>
+        </w:rPr>
+        <w:t>if</w:t>
+      </w:r>
+      <w:r>
+        <w:rPr>
+          <w:rFonts w:ascii="Courier New" w:hAnsi="Courier New" w:cs="Courier New"/>
+          <w:sz w:val="20"/>
+          <w:szCs w:val="20"/>
+          <w:lang w:val="en-US"/>
+        </w:rPr>
+        <w:t xml:space="preserve"> (</w:t>
+      </w:r>
+      <w:r>
+        <w:rPr>
+          <w:rFonts w:ascii="Courier New" w:hAnsi="Courier New" w:cs="Courier New"/>
+          <w:sz w:val="20"/>
+          <w:szCs w:val="20"/>
+          <w:lang w:val="en-US"/>
+        </w:rPr>
+        <w:t>N</w:t>
+      </w:r>
+      <w:r>
+        <w:rPr>
+          <w:rFonts w:ascii="Courier New" w:hAnsi="Courier New" w:cs="Courier New"/>
+          <w:sz w:val="20"/>
+          <w:szCs w:val="20"/>
+          <w:lang w:val="en-US"/>
+        </w:rPr>
+        <w:t xml:space="preserve"> &gt; 70700) {</w:t>
+      </w:r>
+    </w:p>
+    <w:p>
+      <w:pPr>
+        <w:rPr>
+          <w:rFonts w:ascii="Courier New" w:hAnsi="Courier New" w:cs="Courier New"/>
+          <w:sz w:val="20"/>
+          <w:szCs w:val="20"/>
+          <w:lang w:val="en-US"/>
+        </w:rPr>
+      </w:pPr>
+      <w:r>
+        <w:rPr>
+          <w:rFonts w:ascii="Courier New" w:hAnsi="Courier New" w:cs="Courier New"/>
+          <w:sz w:val="20"/>
+          <w:szCs w:val="20"/>
+          <w:lang w:val="en-US"/>
+        </w:rPr>
+        <w:t xml:space="preserve">        </w:t>
+      </w:r>
+      <w:r>
+        <w:rPr>
+          <w:rFonts w:ascii="Courier New" w:hAnsi="Courier New" w:cs="Courier New"/>
+          <w:sz w:val="20"/>
+          <w:szCs w:val="20"/>
+          <w:lang w:val="en-US"/>
+        </w:rPr>
+        <w:t>return</w:t>
+      </w:r>
+      <w:r>
+        <w:rPr>
+          <w:rFonts w:ascii="Courier New" w:hAnsi="Courier New" w:cs="Courier New"/>
+          <w:sz w:val="20"/>
+          <w:szCs w:val="20"/>
+          <w:lang w:val="en-US"/>
+        </w:rPr>
+        <w:t xml:space="preserve"> -1; </w:t>
+      </w:r>
+    </w:p>
+    <w:p>
+      <w:pPr>
+        <w:rPr>
+          <w:rFonts w:ascii="Courier New" w:hAnsi="Courier New" w:cs="Courier New"/>
+          <w:sz w:val="20"/>
+          <w:szCs w:val="20"/>
+          <w:lang w:val="en-US"/>
+        </w:rPr>
+      </w:pPr>
+      <w:r>
+        <w:rPr>
+          <w:rFonts w:ascii="Courier New" w:hAnsi="Courier New" w:cs="Courier New"/>
+          <w:sz w:val="20"/>
+          <w:szCs w:val="20"/>
+          <w:lang w:val="en-US"/>
+        </w:rPr>
+        <w:t xml:space="preserve">    }</w:t>
+      </w:r>
+    </w:p>
+    <w:p>
+      <w:pPr>
+        <w:rPr>
+          <w:rFonts w:ascii="Courier New" w:hAnsi="Courier New" w:cs="Courier New"/>
+          <w:sz w:val="20"/>
+          <w:szCs w:val="20"/>
+          <w:lang w:val="en-US"/>
+        </w:rPr>
+      </w:pPr>
+    </w:p>
+    <w:p>
+      <w:pPr>
+        <w:rPr>
+          <w:rFonts w:ascii="Courier New" w:hAnsi="Courier New" w:cs="Courier New"/>
+          <w:sz w:val="20"/>
+          <w:szCs w:val="20"/>
+          <w:lang w:val="en-US"/>
+        </w:rPr>
+      </w:pPr>
+      <w:r>
+        <w:rPr>
+          <w:rFonts w:ascii="Courier New" w:hAnsi="Courier New" w:cs="Courier New"/>
+          <w:sz w:val="20"/>
+          <w:szCs w:val="20"/>
+          <w:lang w:val="en-US"/>
+        </w:rPr>
+        <w:t xml:space="preserve">    </w:t>
+      </w:r>
+    </w:p>
+    <w:p>
+      <w:pPr>
+        <w:rPr>
+          <w:rFonts w:ascii="Courier New" w:hAnsi="Courier New" w:cs="Courier New"/>
+          <w:sz w:val="20"/>
+          <w:szCs w:val="20"/>
+          <w:lang w:val="en-US"/>
+        </w:rPr>
+      </w:pPr>
+      <w:r>
+        <w:rPr>
+          <w:rFonts w:ascii="Courier New" w:hAnsi="Courier New" w:cs="Courier New"/>
+          <w:sz w:val="20"/>
+          <w:szCs w:val="20"/>
+          <w:lang w:val="en-US"/>
+        </w:rPr>
+        <w:t xml:space="preserve">    </w:t>
+      </w:r>
+      <w:r>
+        <w:rPr>
+          <w:rFonts w:ascii="Courier New" w:hAnsi="Courier New" w:cs="Courier New"/>
+          <w:sz w:val="20"/>
+          <w:szCs w:val="20"/>
+          <w:lang w:val="en-US"/>
+        </w:rPr>
+        <w:t>int bit_D1 = (N &gt;&gt; 1) &amp; 1;</w:t>
+      </w:r>
+    </w:p>
+    <w:p>
+      <w:pPr>
+        <w:rPr>
+          <w:rFonts w:ascii="Courier New" w:hAnsi="Courier New" w:cs="Courier New"/>
+          <w:sz w:val="20"/>
+          <w:szCs w:val="20"/>
+          <w:lang w:val="en-US"/>
+        </w:rPr>
+      </w:pPr>
+    </w:p>
+    <w:p>
+      <w:pPr>
+        <w:rPr>
+          <w:rFonts w:ascii="Courier New" w:hAnsi="Courier New" w:cs="Courier New"/>
+          <w:sz w:val="20"/>
+          <w:szCs w:val="20"/>
+          <w:lang w:val="en-US"/>
+        </w:rPr>
+      </w:pPr>
+      <w:r>
+        <w:rPr>
+          <w:rFonts w:ascii="Courier New" w:hAnsi="Courier New" w:cs="Courier New"/>
+          <w:sz w:val="20"/>
+          <w:szCs w:val="20"/>
+          <w:lang w:val="en-US"/>
+        </w:rPr>
+        <w:t xml:space="preserve">    int count = 0;</w:t>
+      </w:r>
+    </w:p>
+    <w:p>
+      <w:pPr>
+        <w:rPr>
+          <w:rFonts w:ascii="Courier New" w:hAnsi="Courier New" w:cs="Courier New"/>
+          <w:sz w:val="20"/>
+          <w:szCs w:val="20"/>
+          <w:lang w:val="en-US"/>
+        </w:rPr>
+      </w:pPr>
+      <w:r>
+        <w:rPr>
+          <w:rFonts w:ascii="Courier New" w:hAnsi="Courier New" w:cs="Courier New"/>
+          <w:sz w:val="20"/>
+          <w:szCs w:val="20"/>
+          <w:lang w:val="en-US"/>
+        </w:rPr>
+        <w:t xml:space="preserve">    unsigned int temp = N;</w:t>
+      </w:r>
+    </w:p>
+    <w:p>
+      <w:pPr>
+        <w:rPr>
+          <w:rFonts w:ascii="Courier New" w:hAnsi="Courier New" w:cs="Courier New"/>
+          <w:sz w:val="20"/>
+          <w:szCs w:val="20"/>
+          <w:lang w:val="en-US"/>
+        </w:rPr>
+      </w:pPr>
+    </w:p>
+    <w:p>
+      <w:pPr>
+        <w:rPr>
+          <w:rFonts w:ascii="Courier New" w:hAnsi="Courier New" w:cs="Courier New"/>
+          <w:sz w:val="20"/>
+          <w:szCs w:val="20"/>
+          <w:lang w:val="en-US"/>
+        </w:rPr>
+      </w:pPr>
+      <w:r>
+        <w:rPr>
+          <w:rFonts w:ascii="Courier New" w:hAnsi="Courier New" w:cs="Courier New"/>
+          <w:sz w:val="20"/>
+          <w:szCs w:val="20"/>
+          <w:lang w:val="en-US"/>
+        </w:rPr>
+        <w:t xml:space="preserve">    for (int i = 0; i &lt; 32; i++) {</w:t>
+      </w:r>
+    </w:p>
+    <w:p>
+      <w:pPr>
+        <w:rPr>
+          <w:rFonts w:ascii="Courier New" w:hAnsi="Courier New" w:cs="Courier New"/>
+          <w:sz w:val="20"/>
+          <w:szCs w:val="20"/>
+          <w:lang w:val="en-US"/>
+        </w:rPr>
+      </w:pPr>
+      <w:r>
+        <w:rPr>
+          <w:rFonts w:ascii="Courier New" w:hAnsi="Courier New" w:cs="Courier New"/>
+          <w:sz w:val="20"/>
+          <w:szCs w:val="20"/>
+          <w:lang w:val="en-US"/>
+        </w:rPr>
+        <w:t xml:space="preserve">        </w:t>
+      </w:r>
+    </w:p>
+    <w:p>
+      <w:pPr>
+        <w:rPr>
+          <w:rFonts w:ascii="Courier New" w:hAnsi="Courier New" w:cs="Courier New"/>
+          <w:sz w:val="20"/>
+          <w:szCs w:val="20"/>
+          <w:lang w:val="en-US"/>
+        </w:rPr>
+      </w:pPr>
+      <w:r>
+        <w:rPr>
+          <w:rFonts w:ascii="Courier New" w:hAnsi="Courier New" w:cs="Courier New"/>
+          <w:sz w:val="20"/>
+          <w:szCs w:val="20"/>
+          <w:lang w:val="en-US"/>
+        </w:rPr>
+        <w:t xml:space="preserve">        int current_bit = temp &amp; 1;</w:t>
+      </w:r>
+    </w:p>
+    <w:p>
+      <w:pPr>
+        <w:rPr>
+          <w:rFonts w:ascii="Courier New" w:hAnsi="Courier New" w:cs="Courier New"/>
+          <w:sz w:val="20"/>
+          <w:szCs w:val="20"/>
+          <w:lang w:val="en-US"/>
+        </w:rPr>
+      </w:pPr>
+      <w:r>
+        <w:rPr>
+          <w:rFonts w:ascii="Courier New" w:hAnsi="Courier New" w:cs="Courier New"/>
+          <w:sz w:val="20"/>
+          <w:szCs w:val="20"/>
+          <w:lang w:val="en-US"/>
+        </w:rPr>
+        <w:t xml:space="preserve">       </w:t>
+      </w:r>
+    </w:p>
+    <w:p>
+      <w:pPr>
+        <w:rPr>
+          <w:rFonts w:ascii="Courier New" w:hAnsi="Courier New" w:cs="Courier New"/>
+          <w:sz w:val="20"/>
+          <w:szCs w:val="20"/>
+          <w:lang w:val="en-US"/>
+        </w:rPr>
+      </w:pPr>
+      <w:r>
+        <w:rPr>
+          <w:rFonts w:ascii="Courier New" w:hAnsi="Courier New" w:cs="Courier New"/>
+          <w:sz w:val="20"/>
+          <w:szCs w:val="20"/>
+          <w:lang w:val="en-US"/>
+        </w:rPr>
+        <w:t xml:space="preserve">        count += (bit_D1 == 1) ? (current_bit == 0 ? </w:t>
+      </w:r>
+      <w:r>
+        <w:rPr>
+          <w:rFonts w:ascii="Courier New" w:hAnsi="Courier New" w:cs="Courier New"/>
+          <w:sz w:val="20"/>
+          <w:szCs w:val="20"/>
+          <w:lang w:val="en-US"/>
+        </w:rPr>
+        <w:t>1 : 0) : (</w:t>
+      </w:r>
+      <w:r>
+        <w:rPr>
+          <w:rFonts w:ascii="Courier New" w:hAnsi="Courier New" w:cs="Courier New"/>
+          <w:sz w:val="20"/>
+          <w:szCs w:val="20"/>
+          <w:lang w:val="en-US"/>
+        </w:rPr>
+        <w:t>current</w:t>
+      </w:r>
+      <w:r>
+        <w:rPr>
+          <w:rFonts w:ascii="Courier New" w:hAnsi="Courier New" w:cs="Courier New"/>
+          <w:sz w:val="20"/>
+          <w:szCs w:val="20"/>
+          <w:lang w:val="en-US"/>
+        </w:rPr>
+        <w:t>_</w:t>
+      </w:r>
+      <w:r>
+        <w:rPr>
+          <w:rFonts w:ascii="Courier New" w:hAnsi="Courier New" w:cs="Courier New"/>
+          <w:sz w:val="20"/>
+          <w:szCs w:val="20"/>
+          <w:lang w:val="en-US"/>
+        </w:rPr>
+        <w:t>bit</w:t>
+      </w:r>
+      <w:r>
+        <w:rPr>
+          <w:rFonts w:ascii="Courier New" w:hAnsi="Courier New" w:cs="Courier New"/>
+          <w:sz w:val="20"/>
+          <w:szCs w:val="20"/>
+          <w:lang w:val="en-US"/>
+        </w:rPr>
+        <w:t xml:space="preserve"> == 1 ? 1 : 0);</w:t>
+      </w:r>
+    </w:p>
+    <w:p>
+      <w:pPr>
+        <w:rPr>
+          <w:rFonts w:ascii="Courier New" w:hAnsi="Courier New" w:cs="Courier New"/>
+          <w:sz w:val="20"/>
+          <w:szCs w:val="20"/>
+          <w:lang w:val="en-US"/>
+        </w:rPr>
+      </w:pPr>
+    </w:p>
+    <w:p>
+      <w:pPr>
+        <w:rPr>
+          <w:rFonts w:ascii="Courier New" w:hAnsi="Courier New" w:cs="Courier New"/>
+          <w:sz w:val="20"/>
+          <w:szCs w:val="20"/>
+          <w:lang w:val="en-US"/>
+        </w:rPr>
+      </w:pPr>
+      <w:r>
+        <w:rPr>
+          <w:rFonts w:ascii="Courier New" w:hAnsi="Courier New" w:cs="Courier New"/>
+          <w:sz w:val="20"/>
+          <w:szCs w:val="20"/>
+          <w:lang w:val="en-US"/>
+        </w:rPr>
+        <w:t xml:space="preserve">        </w:t>
+      </w:r>
+      <w:r>
+        <w:rPr>
+          <w:rFonts w:ascii="Courier New" w:hAnsi="Courier New" w:cs="Courier New"/>
+          <w:sz w:val="20"/>
+          <w:szCs w:val="20"/>
+          <w:lang w:val="en-US"/>
+        </w:rPr>
+        <w:t>temp &gt;&gt;= 1;</w:t>
+      </w:r>
+    </w:p>
+    <w:p>
+      <w:pPr>
+        <w:rPr>
+          <w:rFonts w:ascii="Courier New" w:hAnsi="Courier New" w:cs="Courier New"/>
+          <w:sz w:val="20"/>
+          <w:szCs w:val="20"/>
+          <w:lang w:val="en-US"/>
+        </w:rPr>
+      </w:pPr>
+      <w:r>
+        <w:rPr>
+          <w:rFonts w:ascii="Courier New" w:hAnsi="Courier New" w:cs="Courier New"/>
+          <w:sz w:val="20"/>
+          <w:szCs w:val="20"/>
+          <w:lang w:val="en-US"/>
+        </w:rPr>
+        <w:t xml:space="preserve">    }</w:t>
+      </w:r>
+    </w:p>
+    <w:p>
+      <w:pPr>
+        <w:rPr>
+          <w:rFonts w:ascii="Courier New" w:hAnsi="Courier New" w:cs="Courier New"/>
+          <w:sz w:val="20"/>
+          <w:szCs w:val="20"/>
+          <w:lang w:val="en-US"/>
+        </w:rPr>
+      </w:pPr>
+    </w:p>
+    <w:p>
+      <w:pPr>
+        <w:rPr>
+          <w:rFonts w:ascii="Courier New" w:hAnsi="Courier New" w:cs="Courier New"/>
+          <w:sz w:val="20"/>
+          <w:szCs w:val="20"/>
+          <w:lang w:val="en-US"/>
+        </w:rPr>
+      </w:pPr>
+      <w:r>
+        <w:rPr>
+          <w:rFonts w:ascii="Courier New" w:hAnsi="Courier New" w:cs="Courier New"/>
+          <w:sz w:val="20"/>
+          <w:szCs w:val="20"/>
+          <w:lang w:val="en-US"/>
+        </w:rPr>
+        <w:t xml:space="preserve">    return count;</w:t>
+      </w:r>
+    </w:p>
+    <w:p>
+      <w:pPr>
+        <w:rPr>
+          <w:rFonts w:ascii="Courier New" w:hAnsi="Courier New" w:cs="Courier New"/>
+          <w:sz w:val="20"/>
+          <w:szCs w:val="20"/>
+          <w:lang w:val="en-US"/>
+        </w:rPr>
+      </w:pPr>
+      <w:r>
+        <w:rPr>
+          <w:rFonts w:ascii="Courier New" w:hAnsi="Courier New" w:cs="Courier New"/>
+          <w:sz w:val="20"/>
+          <w:szCs w:val="20"/>
+          <w:lang w:val="en-US"/>
+        </w:rPr>
+        <w:t>}</w:t>
+      </w:r>
+    </w:p>
+    <w:p>
+      <w:pPr>
+        <w:rPr>
+          <w:rFonts w:ascii="Courier New" w:hAnsi="Courier New" w:cs="Courier New"/>
+          <w:sz w:val="20"/>
+          <w:szCs w:val="20"/>
+          <w:lang w:val="en-US"/>
+        </w:rPr>
+      </w:pPr>
+    </w:p>
+    <w:p>
+      <w:pPr>
+        <w:rPr>
+          <w:rFonts w:ascii="Courier New" w:hAnsi="Courier New" w:cs="Courier New"/>
+          <w:sz w:val="20"/>
+          <w:szCs w:val="20"/>
+          <w:lang w:val="en-US"/>
+        </w:rPr>
+      </w:pPr>
+    </w:p>
+    <w:p>
+      <w:pPr>
+        <w:rPr>
+          <w:rFonts w:ascii="Courier New" w:hAnsi="Courier New" w:cs="Courier New"/>
+          <w:sz w:val="28"/>
+          <w:szCs w:val="28"/>
+          <w:lang w:val="en-US"/>
+        </w:rPr>
+      </w:pPr>
+      <w:r>
+        <w:rPr>
+          <w:sz w:val="28"/>
+          <w:szCs w:val="28"/>
+          <w:lang w:val="ru-RU"/>
+        </w:rPr>
+        <w:t>Тест</w:t>
+      </w:r>
+      <w:r>
+        <w:rPr>
+          <w:sz w:val="28"/>
+          <w:szCs w:val="28"/>
+          <w:lang w:val="en-US"/>
+        </w:rPr>
+        <w:t xml:space="preserve"> </w:t>
+      </w:r>
+      <w:r>
+        <w:rPr>
+          <w:sz w:val="28"/>
+          <w:szCs w:val="28"/>
+          <w:lang w:val="ru-RU"/>
+        </w:rPr>
+        <w:t>драйвер</w:t>
+      </w:r>
+      <w:r>
+        <w:rPr>
+          <w:rFonts w:ascii="Courier New" w:hAnsi="Courier New" w:cs="Courier New"/>
+          <w:sz w:val="28"/>
+          <w:szCs w:val="28"/>
+          <w:lang w:val="en-US"/>
+        </w:rPr>
+        <w:t>:</w:t>
+      </w:r>
+    </w:p>
+    <w:p>
+      <w:pPr>
+        <w:rPr>
+          <w:rFonts w:ascii="Courier New" w:hAnsi="Courier New" w:cs="Courier New"/>
+          <w:sz w:val="20"/>
+          <w:szCs w:val="20"/>
+          <w:lang w:val="en-US"/>
+        </w:rPr>
+      </w:pPr>
+    </w:p>
+    <w:p>
+      <w:pPr>
+        <w:rPr>
+          <w:rFonts w:ascii="Courier New" w:hAnsi="Courier New" w:cs="Courier New"/>
+          <w:sz w:val="20"/>
+          <w:szCs w:val="20"/>
+          <w:lang w:val="en-US"/>
+        </w:rPr>
+      </w:pPr>
+      <w:r>
+        <w:rPr>
+          <w:rFonts w:ascii="Courier New" w:hAnsi="Courier New" w:cs="Courier New"/>
+          <w:sz w:val="20"/>
+          <w:szCs w:val="20"/>
+          <w:lang w:val="en-US"/>
+        </w:rPr>
+        <w:t>#include &lt;iostream&gt;</w:t>
+      </w:r>
+    </w:p>
+    <w:p>
+      <w:pPr>
+        <w:rPr>
+          <w:rFonts w:ascii="Courier New" w:hAnsi="Courier New" w:cs="Courier New"/>
+          <w:sz w:val="20"/>
+          <w:szCs w:val="20"/>
+          <w:lang w:val="en-US"/>
+        </w:rPr>
+      </w:pPr>
+      <w:r>
+        <w:rPr>
+          <w:rFonts w:ascii="Courier New" w:hAnsi="Courier New" w:cs="Courier New"/>
+          <w:sz w:val="20"/>
+          <w:szCs w:val="20"/>
+          <w:lang w:val="en-US"/>
+        </w:rPr>
+        <w:t>#include &lt;cstdlib&gt;</w:t>
+      </w:r>
+    </w:p>
+    <w:p>
+      <w:pPr>
+        <w:rPr>
+          <w:rFonts w:ascii="Courier New" w:hAnsi="Courier New" w:cs="Courier New"/>
+          <w:sz w:val="20"/>
+          <w:szCs w:val="20"/>
+          <w:lang w:val="en-US"/>
+        </w:rPr>
+      </w:pPr>
+      <w:r>
+        <w:rPr>
+          <w:rFonts w:ascii="Courier New" w:hAnsi="Courier New" w:cs="Courier New"/>
+          <w:sz w:val="20"/>
+          <w:szCs w:val="20"/>
+          <w:lang w:val="en-US"/>
+        </w:rPr>
+        <w:t>#include "ModulesNikolenko.h"</w:t>
+      </w:r>
+    </w:p>
+    <w:p>
+      <w:pPr>
+        <w:rPr>
+          <w:rFonts w:ascii="Courier New" w:hAnsi="Courier New" w:cs="Courier New"/>
+          <w:sz w:val="20"/>
+          <w:szCs w:val="20"/>
+          <w:lang w:val="en-US"/>
+        </w:rPr>
+      </w:pPr>
+    </w:p>
+    <w:p>
+      <w:pPr>
+        <w:rPr>
+          <w:rFonts w:ascii="Courier New" w:hAnsi="Courier New" w:cs="Courier New"/>
+          <w:sz w:val="20"/>
+          <w:szCs w:val="20"/>
+          <w:lang w:val="en-US"/>
+        </w:rPr>
+      </w:pPr>
+      <w:r>
+        <w:rPr>
+          <w:rFonts w:ascii="Courier New" w:hAnsi="Courier New" w:cs="Courier New"/>
+          <w:sz w:val="20"/>
+          <w:szCs w:val="20"/>
+          <w:lang w:val="en-US"/>
+        </w:rPr>
+        <w:t>using namespace std;</w:t>
+      </w:r>
+    </w:p>
+    <w:p>
+      <w:pPr>
+        <w:rPr>
+          <w:rFonts w:ascii="Courier New" w:hAnsi="Courier New" w:cs="Courier New"/>
+          <w:sz w:val="20"/>
+          <w:szCs w:val="20"/>
+          <w:lang w:val="en-US"/>
+        </w:rPr>
+      </w:pPr>
+    </w:p>
+    <w:p>
+      <w:pPr>
+        <w:rPr>
+          <w:rFonts w:ascii="Courier New" w:hAnsi="Courier New" w:cs="Courier New"/>
+          <w:sz w:val="20"/>
+          <w:szCs w:val="20"/>
+          <w:lang w:val="en-US"/>
+        </w:rPr>
+      </w:pPr>
+      <w:r>
+        <w:rPr>
+          <w:rFonts w:ascii="Courier New" w:hAnsi="Courier New" w:cs="Courier New"/>
+          <w:sz w:val="20"/>
+          <w:szCs w:val="20"/>
+          <w:lang w:val="en-US"/>
+        </w:rPr>
+        <w:t>int main() {</w:t>
+      </w:r>
+    </w:p>
+    <w:p>
+      <w:pPr>
+        <w:rPr>
+          <w:rFonts w:ascii="Courier New" w:hAnsi="Courier New" w:cs="Courier New"/>
+          <w:sz w:val="20"/>
+          <w:szCs w:val="20"/>
+          <w:lang w:val="en-US"/>
+        </w:rPr>
+      </w:pPr>
+      <w:r>
+        <w:rPr>
+          <w:rFonts w:ascii="Courier New" w:hAnsi="Courier New" w:cs="Courier New"/>
+          <w:sz w:val="20"/>
+          <w:szCs w:val="20"/>
+          <w:lang w:val="en-US"/>
+        </w:rPr>
+        <w:t xml:space="preserve">    cout &lt;&lt; "=== Протокол модульного тестування (TestDriver) ===" &lt;&lt; endl;</w:t>
+      </w:r>
+    </w:p>
+    <w:p>
+      <w:pPr>
+        <w:rPr>
+          <w:rFonts w:ascii="Courier New" w:hAnsi="Courier New" w:cs="Courier New"/>
+          <w:sz w:val="20"/>
+          <w:szCs w:val="20"/>
+          <w:lang w:val="en-US"/>
+        </w:rPr>
+      </w:pPr>
+    </w:p>
+    <w:p>
+      <w:pPr>
+        <w:rPr>
+          <w:rFonts w:ascii="Courier New" w:hAnsi="Courier New" w:cs="Courier New"/>
+          <w:sz w:val="20"/>
+          <w:szCs w:val="20"/>
+          <w:lang w:val="en-US"/>
+        </w:rPr>
+      </w:pPr>
+      <w:r>
+        <w:rPr>
+          <w:rFonts w:ascii="Courier New" w:hAnsi="Courier New" w:cs="Courier New"/>
+          <w:sz w:val="20"/>
+          <w:szCs w:val="20"/>
+          <w:lang w:val="en-US"/>
+        </w:rPr>
+        <w:t xml:space="preserve">    // ---------------------------------------------------------</w:t>
+      </w:r>
+    </w:p>
+    <w:p>
+      <w:pPr>
+        <w:rPr>
+          <w:rFonts w:ascii="Courier New" w:hAnsi="Courier New" w:cs="Courier New"/>
+          <w:sz w:val="20"/>
+          <w:szCs w:val="20"/>
+          <w:lang w:val="en-US"/>
+        </w:rPr>
+      </w:pPr>
+      <w:r>
+        <w:rPr>
+          <w:rFonts w:ascii="Courier New" w:hAnsi="Courier New" w:cs="Courier New"/>
+          <w:sz w:val="20"/>
+          <w:szCs w:val="20"/>
+          <w:lang w:val="en-US"/>
+        </w:rPr>
+        <w:t xml:space="preserve">    // Тестування задачі 9.1</w:t>
+      </w:r>
+    </w:p>
+    <w:p>
+      <w:pPr>
+        <w:rPr>
+          <w:rFonts w:ascii="Courier New" w:hAnsi="Courier New" w:cs="Courier New"/>
+          <w:sz w:val="20"/>
+          <w:szCs w:val="20"/>
+          <w:lang w:val="en-US"/>
+        </w:rPr>
+      </w:pPr>
+      <w:r>
+        <w:rPr>
+          <w:rFonts w:ascii="Courier New" w:hAnsi="Courier New" w:cs="Courier New"/>
+          <w:sz w:val="20"/>
+          <w:szCs w:val="20"/>
+          <w:lang w:val="en-US"/>
+        </w:rPr>
+        <w:t xml:space="preserve">    // ---------------------------------------------------------</w:t>
+      </w:r>
+    </w:p>
+    <w:p>
+      <w:pPr>
+        <w:rPr>
+          <w:rFonts w:ascii="Courier New" w:hAnsi="Courier New" w:cs="Courier New"/>
+          <w:sz w:val="20"/>
+          <w:szCs w:val="20"/>
+          <w:lang w:val="en-US"/>
+        </w:rPr>
+      </w:pPr>
+      <w:r>
+        <w:rPr>
+          <w:rFonts w:ascii="Courier New" w:hAnsi="Courier New" w:cs="Courier New"/>
+          <w:sz w:val="20"/>
+          <w:szCs w:val="20"/>
+          <w:lang w:val="en-US"/>
+        </w:rPr>
+        <w:t xml:space="preserve">    cout &lt;&lt; "\n--- Тестування задачі 9.1 ---" &lt;&lt; endl;</w:t>
+      </w:r>
+    </w:p>
+    <w:p>
+      <w:pPr>
+        <w:rPr>
+          <w:rFonts w:ascii="Courier New" w:hAnsi="Courier New" w:cs="Courier New"/>
+          <w:sz w:val="20"/>
+          <w:szCs w:val="20"/>
+          <w:lang w:val="en-US"/>
+        </w:rPr>
+      </w:pPr>
+    </w:p>
+    <w:p>
+      <w:pPr>
+        <w:rPr>
+          <w:rFonts w:ascii="Courier New" w:hAnsi="Courier New" w:cs="Courier New"/>
+          <w:sz w:val="20"/>
+          <w:szCs w:val="20"/>
+          <w:lang w:val="en-US"/>
+        </w:rPr>
+      </w:pPr>
+      <w:r>
+        <w:rPr>
+          <w:rFonts w:ascii="Courier New" w:hAnsi="Courier New" w:cs="Courier New"/>
+          <w:sz w:val="20"/>
+          <w:szCs w:val="20"/>
+          <w:lang w:val="en-US"/>
+        </w:rPr>
+        <w:t xml:space="preserve">    cout &lt;&lt; "TC-1.1 (grade = 0):" &lt;&lt; endl;</w:t>
+      </w:r>
+    </w:p>
+    <w:p>
+      <w:pPr>
+        <w:rPr>
+          <w:rFonts w:ascii="Courier New" w:hAnsi="Courier New" w:cs="Courier New"/>
+          <w:sz w:val="20"/>
+          <w:szCs w:val="20"/>
+          <w:lang w:val="en-US"/>
+        </w:rPr>
+      </w:pPr>
+      <w:r>
+        <w:rPr>
+          <w:rFonts w:ascii="Courier New" w:hAnsi="Courier New" w:cs="Courier New"/>
+          <w:sz w:val="20"/>
+          <w:szCs w:val="20"/>
+          <w:lang w:val="en-US"/>
+        </w:rPr>
+        <w:t xml:space="preserve">    cout &lt;&lt; "Очікується: CALM-GLASSY, 0 METERS" &lt;&lt; endl;</w:t>
+      </w:r>
+    </w:p>
+    <w:p>
+      <w:pPr>
+        <w:rPr>
+          <w:rFonts w:ascii="Courier New" w:hAnsi="Courier New" w:cs="Courier New"/>
+          <w:sz w:val="20"/>
+          <w:szCs w:val="20"/>
+          <w:lang w:val="en-US"/>
+        </w:rPr>
+      </w:pPr>
+      <w:r>
+        <w:rPr>
+          <w:rFonts w:ascii="Courier New" w:hAnsi="Courier New" w:cs="Courier New"/>
+          <w:sz w:val="20"/>
+          <w:szCs w:val="20"/>
+          <w:lang w:val="en-US"/>
+        </w:rPr>
+        <w:t xml:space="preserve">    cout &lt;&lt; "Фактично: ";</w:t>
+      </w:r>
+    </w:p>
+    <w:p>
+      <w:pPr>
+        <w:rPr>
+          <w:rFonts w:ascii="Courier New" w:hAnsi="Courier New" w:cs="Courier New"/>
+          <w:sz w:val="20"/>
+          <w:szCs w:val="20"/>
+          <w:lang w:val="en-US"/>
+        </w:rPr>
+      </w:pPr>
+      <w:r>
+        <w:rPr>
+          <w:rFonts w:ascii="Courier New" w:hAnsi="Courier New" w:cs="Courier New"/>
+          <w:sz w:val="20"/>
+          <w:szCs w:val="20"/>
+          <w:lang w:val="en-US"/>
+        </w:rPr>
+        <w:t xml:space="preserve">    task_9_1(0);</w:t>
+      </w:r>
+    </w:p>
+    <w:p>
+      <w:pPr>
+        <w:rPr>
+          <w:rFonts w:ascii="Courier New" w:hAnsi="Courier New" w:cs="Courier New"/>
+          <w:sz w:val="20"/>
+          <w:szCs w:val="20"/>
+          <w:lang w:val="en-US"/>
+        </w:rPr>
+      </w:pPr>
+    </w:p>
+    <w:p>
+      <w:pPr>
+        <w:rPr>
+          <w:rFonts w:ascii="Courier New" w:hAnsi="Courier New" w:cs="Courier New"/>
+          <w:sz w:val="20"/>
+          <w:szCs w:val="20"/>
+          <w:lang w:val="en-US"/>
+        </w:rPr>
+      </w:pPr>
+      <w:r>
+        <w:rPr>
+          <w:rFonts w:ascii="Courier New" w:hAnsi="Courier New" w:cs="Courier New"/>
+          <w:sz w:val="20"/>
+          <w:szCs w:val="20"/>
+          <w:lang w:val="en-US"/>
+        </w:rPr>
+        <w:t xml:space="preserve">    cout &lt;&lt; "\nTC-1.2 (grade = 4):" &lt;&lt; endl;</w:t>
+      </w:r>
+    </w:p>
+    <w:p>
+      <w:pPr>
+        <w:rPr>
+          <w:rFonts w:ascii="Courier New" w:hAnsi="Courier New" w:cs="Courier New"/>
+          <w:sz w:val="20"/>
+          <w:szCs w:val="20"/>
+          <w:lang w:val="en-US"/>
+        </w:rPr>
+      </w:pPr>
+      <w:r>
+        <w:rPr>
+          <w:rFonts w:ascii="Courier New" w:hAnsi="Courier New" w:cs="Courier New"/>
+          <w:sz w:val="20"/>
+          <w:szCs w:val="20"/>
+          <w:lang w:val="en-US"/>
+        </w:rPr>
+        <w:t xml:space="preserve">    cout &lt;&lt; "Очікується: MODERATE, 1.25-2.50 METERS" &lt;&lt; endl;</w:t>
+      </w:r>
+    </w:p>
+    <w:p>
+      <w:pPr>
+        <w:rPr>
+          <w:rFonts w:ascii="Courier New" w:hAnsi="Courier New" w:cs="Courier New"/>
+          <w:sz w:val="20"/>
+          <w:szCs w:val="20"/>
+          <w:lang w:val="en-US"/>
+        </w:rPr>
+      </w:pPr>
+      <w:r>
+        <w:rPr>
+          <w:rFonts w:ascii="Courier New" w:hAnsi="Courier New" w:cs="Courier New"/>
+          <w:sz w:val="20"/>
+          <w:szCs w:val="20"/>
+          <w:lang w:val="en-US"/>
+        </w:rPr>
+        <w:t xml:space="preserve">    cout &lt;&lt; "Фактично: ";</w:t>
+      </w:r>
+    </w:p>
+    <w:p>
+      <w:pPr>
+        <w:rPr>
+          <w:rFonts w:ascii="Courier New" w:hAnsi="Courier New" w:cs="Courier New"/>
+          <w:sz w:val="20"/>
+          <w:szCs w:val="20"/>
+          <w:lang w:val="en-US"/>
+        </w:rPr>
+      </w:pPr>
+      <w:r>
+        <w:rPr>
+          <w:rFonts w:ascii="Courier New" w:hAnsi="Courier New" w:cs="Courier New"/>
+          <w:sz w:val="20"/>
+          <w:szCs w:val="20"/>
+          <w:lang w:val="en-US"/>
+        </w:rPr>
+        <w:t xml:space="preserve">    task_9_1(4);</w:t>
+      </w:r>
+    </w:p>
+    <w:p>
+      <w:pPr>
+        <w:rPr>
+          <w:rFonts w:ascii="Courier New" w:hAnsi="Courier New" w:cs="Courier New"/>
+          <w:sz w:val="20"/>
+          <w:szCs w:val="20"/>
+          <w:lang w:val="en-US"/>
+        </w:rPr>
+      </w:pPr>
+    </w:p>
+    <w:p>
+      <w:pPr>
+        <w:rPr>
+          <w:rFonts w:ascii="Courier New" w:hAnsi="Courier New" w:cs="Courier New"/>
+          <w:sz w:val="20"/>
+          <w:szCs w:val="20"/>
+          <w:lang w:val="en-US"/>
+        </w:rPr>
+      </w:pPr>
+      <w:r>
+        <w:rPr>
+          <w:rFonts w:ascii="Courier New" w:hAnsi="Courier New" w:cs="Courier New"/>
+          <w:sz w:val="20"/>
+          <w:szCs w:val="20"/>
+          <w:lang w:val="en-US"/>
+        </w:rPr>
+        <w:t xml:space="preserve">    cout &lt;&lt; "\nTC-1.3 (grade = 10):" &lt;&lt; endl;</w:t>
+      </w:r>
+    </w:p>
+    <w:p>
+      <w:pPr>
+        <w:rPr>
+          <w:rFonts w:ascii="Courier New" w:hAnsi="Courier New" w:cs="Courier New"/>
+          <w:sz w:val="20"/>
+          <w:szCs w:val="20"/>
+          <w:lang w:val="en-US"/>
+        </w:rPr>
+      </w:pPr>
+      <w:r>
+        <w:rPr>
+          <w:rFonts w:ascii="Courier New" w:hAnsi="Courier New" w:cs="Courier New"/>
+          <w:sz w:val="20"/>
+          <w:szCs w:val="20"/>
+          <w:lang w:val="en-US"/>
+        </w:rPr>
+        <w:t xml:space="preserve">    cout &lt;&lt; "Очікується: Звуковий сигнал і Помилка" &lt;&lt; endl;</w:t>
+      </w:r>
+    </w:p>
+    <w:p>
+      <w:pPr>
+        <w:rPr>
+          <w:rFonts w:ascii="Courier New" w:hAnsi="Courier New" w:cs="Courier New"/>
+          <w:sz w:val="20"/>
+          <w:szCs w:val="20"/>
+          <w:lang w:val="ru-RU"/>
+        </w:rPr>
+      </w:pPr>
+      <w:r>
+        <w:rPr>
+          <w:rFonts w:ascii="Courier New" w:hAnsi="Courier New" w:cs="Courier New"/>
+          <w:sz w:val="20"/>
+          <w:szCs w:val="20"/>
+          <w:lang w:val="en-US"/>
+        </w:rPr>
+        <w:t xml:space="preserve">    cout</w:t>
+      </w:r>
+      <w:r>
+        <w:rPr>
+          <w:rFonts w:ascii="Courier New" w:hAnsi="Courier New" w:cs="Courier New"/>
+          <w:sz w:val="20"/>
+          <w:szCs w:val="20"/>
+          <w:lang w:val="ru-RU"/>
+        </w:rPr>
+        <w:t xml:space="preserve"> &lt;&lt; "Фактично: ";</w:t>
+      </w:r>
+    </w:p>
+    <w:p>
+      <w:pPr>
+        <w:rPr>
+          <w:rFonts w:ascii="Courier New" w:hAnsi="Courier New" w:cs="Courier New"/>
+          <w:sz w:val="20"/>
+          <w:szCs w:val="20"/>
+          <w:lang w:val="ru-RU"/>
+        </w:rPr>
+      </w:pPr>
+      <w:r>
+        <w:rPr>
+          <w:rFonts w:ascii="Courier New" w:hAnsi="Courier New" w:cs="Courier New"/>
+          <w:sz w:val="20"/>
+          <w:szCs w:val="20"/>
+          <w:lang w:val="ru-RU"/>
+        </w:rPr>
+        <w:t xml:space="preserve">    </w:t>
+      </w:r>
+      <w:r>
+        <w:rPr>
+          <w:rFonts w:ascii="Courier New" w:hAnsi="Courier New" w:cs="Courier New"/>
+          <w:sz w:val="20"/>
+          <w:szCs w:val="20"/>
+          <w:lang w:val="en-US"/>
+        </w:rPr>
+        <w:t>task</w:t>
+      </w:r>
+      <w:r>
+        <w:rPr>
+          <w:rFonts w:ascii="Courier New" w:hAnsi="Courier New" w:cs="Courier New"/>
+          <w:sz w:val="20"/>
+          <w:szCs w:val="20"/>
+          <w:lang w:val="ru-RU"/>
+        </w:rPr>
+        <w:t>_9_1(10);</w:t>
+      </w:r>
+    </w:p>
+    <w:p>
+      <w:pPr>
+        <w:rPr>
+          <w:rFonts w:ascii="Courier New" w:hAnsi="Courier New" w:cs="Courier New"/>
+          <w:sz w:val="20"/>
+          <w:szCs w:val="20"/>
+          <w:lang w:val="ru-RU"/>
+        </w:rPr>
+      </w:pPr>
+    </w:p>
+    <w:p>
+      <w:pPr>
+        <w:rPr>
+          <w:rFonts w:ascii="Courier New" w:hAnsi="Courier New" w:cs="Courier New"/>
+          <w:sz w:val="20"/>
+          <w:szCs w:val="20"/>
+          <w:lang w:val="ru-RU"/>
+        </w:rPr>
+      </w:pPr>
+      <w:r>
+        <w:rPr>
+          <w:rFonts w:ascii="Courier New" w:hAnsi="Courier New" w:cs="Courier New"/>
+          <w:sz w:val="20"/>
+          <w:szCs w:val="20"/>
+          <w:lang w:val="ru-RU"/>
+        </w:rPr>
+        <w:t xml:space="preserve">    // ---------------------------------------------------------</w:t>
+      </w:r>
+    </w:p>
+    <w:p>
+      <w:pPr>
+        <w:rPr>
+          <w:rFonts w:ascii="Courier New" w:hAnsi="Courier New" w:cs="Courier New"/>
+          <w:sz w:val="20"/>
+          <w:szCs w:val="20"/>
+          <w:lang w:val="ru-RU"/>
+        </w:rPr>
+      </w:pPr>
+      <w:r>
+        <w:rPr>
+          <w:rFonts w:ascii="Courier New" w:hAnsi="Courier New" w:cs="Courier New"/>
+          <w:sz w:val="20"/>
+          <w:szCs w:val="20"/>
+          <w:lang w:val="ru-RU"/>
+        </w:rPr>
+        <w:t xml:space="preserve">    // Тестування задачі 9.2</w:t>
+      </w:r>
+    </w:p>
+    <w:p>
+      <w:pPr>
+        <w:rPr>
+          <w:rFonts w:ascii="Courier New" w:hAnsi="Courier New" w:cs="Courier New"/>
+          <w:sz w:val="20"/>
+          <w:szCs w:val="20"/>
+          <w:lang w:val="ru-RU"/>
+        </w:rPr>
+      </w:pPr>
+      <w:r>
+        <w:rPr>
+          <w:rFonts w:ascii="Courier New" w:hAnsi="Courier New" w:cs="Courier New"/>
+          <w:sz w:val="20"/>
+          <w:szCs w:val="20"/>
+          <w:lang w:val="ru-RU"/>
+        </w:rPr>
+        <w:t xml:space="preserve">    // ---------------------------------------------------------</w:t>
+      </w:r>
+    </w:p>
+    <w:p>
+      <w:pPr>
+        <w:rPr>
+          <w:rFonts w:ascii="Courier New" w:hAnsi="Courier New" w:cs="Courier New"/>
+          <w:sz w:val="20"/>
+          <w:szCs w:val="20"/>
+          <w:lang w:val="ru-RU"/>
+        </w:rPr>
+      </w:pPr>
+      <w:r>
+        <w:rPr>
+          <w:rFonts w:ascii="Courier New" w:hAnsi="Courier New" w:cs="Courier New"/>
+          <w:sz w:val="20"/>
+          <w:szCs w:val="20"/>
+          <w:lang w:val="ru-RU"/>
+        </w:rPr>
+        <w:t xml:space="preserve">    </w:t>
+      </w:r>
+      <w:r>
+        <w:rPr>
+          <w:rFonts w:ascii="Courier New" w:hAnsi="Courier New" w:cs="Courier New"/>
+          <w:sz w:val="20"/>
+          <w:szCs w:val="20"/>
+          <w:lang w:val="en-US"/>
+        </w:rPr>
+        <w:t>cout</w:t>
+      </w:r>
+      <w:r>
+        <w:rPr>
+          <w:rFonts w:ascii="Courier New" w:hAnsi="Courier New" w:cs="Courier New"/>
+          <w:sz w:val="20"/>
+          <w:szCs w:val="20"/>
+          <w:lang w:val="ru-RU"/>
+        </w:rPr>
+        <w:t xml:space="preserve"> &lt;&lt; "\</w:t>
+      </w:r>
+      <w:r>
+        <w:rPr>
+          <w:rFonts w:ascii="Courier New" w:hAnsi="Courier New" w:cs="Courier New"/>
+          <w:sz w:val="20"/>
+          <w:szCs w:val="20"/>
+          <w:lang w:val="en-US"/>
+        </w:rPr>
+        <w:t>n</w:t>
+      </w:r>
+      <w:r>
+        <w:rPr>
+          <w:rFonts w:ascii="Courier New" w:hAnsi="Courier New" w:cs="Courier New"/>
+          <w:sz w:val="20"/>
+          <w:szCs w:val="20"/>
+          <w:lang w:val="ru-RU"/>
+        </w:rPr>
+        <w:t xml:space="preserve">--- Тестування задачі 9.2 ---" &lt;&lt; </w:t>
+      </w:r>
+      <w:r>
+        <w:rPr>
+          <w:rFonts w:ascii="Courier New" w:hAnsi="Courier New" w:cs="Courier New"/>
+          <w:sz w:val="20"/>
+          <w:szCs w:val="20"/>
+          <w:lang w:val="en-US"/>
+        </w:rPr>
+        <w:t>endl</w:t>
+      </w:r>
+      <w:r>
+        <w:rPr>
+          <w:rFonts w:ascii="Courier New" w:hAnsi="Courier New" w:cs="Courier New"/>
+          <w:sz w:val="20"/>
+          <w:szCs w:val="20"/>
+          <w:lang w:val="ru-RU"/>
+        </w:rPr>
+        <w:t>;</w:t>
+      </w:r>
+    </w:p>
+    <w:p>
+      <w:pPr>
+        <w:rPr>
+          <w:rFonts w:ascii="Courier New" w:hAnsi="Courier New" w:cs="Courier New"/>
+          <w:sz w:val="20"/>
+          <w:szCs w:val="20"/>
+          <w:lang w:val="ru-RU"/>
+        </w:rPr>
+      </w:pPr>
+      <w:r>
+        <w:rPr>
+          <w:rFonts w:ascii="Courier New" w:hAnsi="Courier New" w:cs="Courier New"/>
+          <w:sz w:val="20"/>
+          <w:szCs w:val="20"/>
+          <w:lang w:val="ru-RU"/>
+        </w:rPr>
+        <w:t xml:space="preserve">    </w:t>
+      </w:r>
+      <w:r>
+        <w:rPr>
+          <w:rFonts w:ascii="Courier New" w:hAnsi="Courier New" w:cs="Courier New"/>
+          <w:sz w:val="20"/>
+          <w:szCs w:val="20"/>
+          <w:lang w:val="en-US"/>
+        </w:rPr>
+        <w:t>cout</w:t>
+      </w:r>
+      <w:r>
+        <w:rPr>
+          <w:rFonts w:ascii="Courier New" w:hAnsi="Courier New" w:cs="Courier New"/>
+          <w:sz w:val="20"/>
+          <w:szCs w:val="20"/>
+          <w:lang w:val="ru-RU"/>
+        </w:rPr>
+        <w:t xml:space="preserve"> &lt;&lt; "</w:t>
+      </w:r>
+      <w:r>
+        <w:rPr>
+          <w:rFonts w:ascii="Courier New" w:hAnsi="Courier New" w:cs="Courier New"/>
+          <w:sz w:val="20"/>
+          <w:szCs w:val="20"/>
+          <w:lang w:val="en-US"/>
+        </w:rPr>
+        <w:t>TC</w:t>
+      </w:r>
+      <w:r>
+        <w:rPr>
+          <w:rFonts w:ascii="Courier New" w:hAnsi="Courier New" w:cs="Courier New"/>
+          <w:sz w:val="20"/>
+          <w:szCs w:val="20"/>
+          <w:lang w:val="ru-RU"/>
+        </w:rPr>
+        <w:t xml:space="preserve">-2.1: Введіть числа: -5, 0, 10, 2000" &lt;&lt; </w:t>
+      </w:r>
+      <w:r>
+        <w:rPr>
+          <w:rFonts w:ascii="Courier New" w:hAnsi="Courier New" w:cs="Courier New"/>
+          <w:sz w:val="20"/>
+          <w:szCs w:val="20"/>
+          <w:lang w:val="en-US"/>
+        </w:rPr>
+        <w:t>endl</w:t>
+      </w:r>
+      <w:r>
+        <w:rPr>
+          <w:rFonts w:ascii="Courier New" w:hAnsi="Courier New" w:cs="Courier New"/>
+          <w:sz w:val="20"/>
+          <w:szCs w:val="20"/>
+          <w:lang w:val="ru-RU"/>
+        </w:rPr>
+        <w:t>;</w:t>
+      </w:r>
+    </w:p>
+    <w:p>
+      <w:pPr>
+        <w:rPr>
+          <w:rFonts w:ascii="Courier New" w:hAnsi="Courier New" w:cs="Courier New"/>
+          <w:sz w:val="20"/>
+          <w:szCs w:val="20"/>
+          <w:lang w:val="ru-RU"/>
+        </w:rPr>
+      </w:pPr>
+      <w:r>
+        <w:rPr>
+          <w:rFonts w:ascii="Courier New" w:hAnsi="Courier New" w:cs="Courier New"/>
+          <w:sz w:val="20"/>
+          <w:szCs w:val="20"/>
+          <w:lang w:val="ru-RU"/>
+        </w:rPr>
+        <w:t xml:space="preserve">    </w:t>
+      </w:r>
+      <w:r>
+        <w:rPr>
+          <w:rFonts w:ascii="Courier New" w:hAnsi="Courier New" w:cs="Courier New"/>
+          <w:sz w:val="20"/>
+          <w:szCs w:val="20"/>
+          <w:lang w:val="en-US"/>
+        </w:rPr>
+        <w:t>cout</w:t>
+      </w:r>
+      <w:r>
+        <w:rPr>
+          <w:rFonts w:ascii="Courier New" w:hAnsi="Courier New" w:cs="Courier New"/>
+          <w:sz w:val="20"/>
+          <w:szCs w:val="20"/>
+          <w:lang w:val="ru-RU"/>
+        </w:rPr>
+        <w:t xml:space="preserve"> &lt;&lt; "Очікуваний результат: Від'ємних: 1, Нулів: 1, У діапазоні [5; 1024]: 1" &lt;&lt; </w:t>
+      </w:r>
+      <w:r>
+        <w:rPr>
+          <w:rFonts w:ascii="Courier New" w:hAnsi="Courier New" w:cs="Courier New"/>
+          <w:sz w:val="20"/>
+          <w:szCs w:val="20"/>
+          <w:lang w:val="en-US"/>
+        </w:rPr>
+        <w:t>endl</w:t>
+      </w:r>
+      <w:r>
+        <w:rPr>
+          <w:rFonts w:ascii="Courier New" w:hAnsi="Courier New" w:cs="Courier New"/>
+          <w:sz w:val="20"/>
+          <w:szCs w:val="20"/>
+          <w:lang w:val="ru-RU"/>
+        </w:rPr>
+        <w:t>;</w:t>
+      </w:r>
+    </w:p>
+    <w:p>
+      <w:pPr>
+        <w:rPr>
+          <w:rFonts w:ascii="Courier New" w:hAnsi="Courier New" w:cs="Courier New"/>
+          <w:sz w:val="20"/>
+          <w:szCs w:val="20"/>
+          <w:lang w:val="ru-RU"/>
+        </w:rPr>
+      </w:pPr>
+      <w:r>
+        <w:rPr>
+          <w:rFonts w:ascii="Courier New" w:hAnsi="Courier New" w:cs="Courier New"/>
+          <w:sz w:val="20"/>
+          <w:szCs w:val="20"/>
+          <w:lang w:val="ru-RU"/>
+        </w:rPr>
+        <w:t xml:space="preserve">    </w:t>
+      </w:r>
+      <w:r>
+        <w:rPr>
+          <w:rFonts w:ascii="Courier New" w:hAnsi="Courier New" w:cs="Courier New"/>
+          <w:sz w:val="20"/>
+          <w:szCs w:val="20"/>
+          <w:lang w:val="en-US"/>
+        </w:rPr>
+        <w:t>task</w:t>
+      </w:r>
+      <w:r>
+        <w:rPr>
+          <w:rFonts w:ascii="Courier New" w:hAnsi="Courier New" w:cs="Courier New"/>
+          <w:sz w:val="20"/>
+          <w:szCs w:val="20"/>
+          <w:lang w:val="ru-RU"/>
+        </w:rPr>
+        <w:t>_9_2(4);</w:t>
+      </w:r>
+    </w:p>
+    <w:p>
+      <w:pPr>
+        <w:rPr>
+          <w:rFonts w:ascii="Courier New" w:hAnsi="Courier New" w:cs="Courier New"/>
+          <w:sz w:val="20"/>
+          <w:szCs w:val="20"/>
+          <w:lang w:val="ru-RU"/>
+        </w:rPr>
+      </w:pPr>
+    </w:p>
+    <w:p>
+      <w:pPr>
+        <w:rPr>
+          <w:rFonts w:ascii="Courier New" w:hAnsi="Courier New" w:cs="Courier New"/>
+          <w:sz w:val="20"/>
+          <w:szCs w:val="20"/>
+          <w:lang w:val="ru-RU"/>
+        </w:rPr>
+      </w:pPr>
+      <w:r>
+        <w:rPr>
+          <w:rFonts w:ascii="Courier New" w:hAnsi="Courier New" w:cs="Courier New"/>
+          <w:sz w:val="20"/>
+          <w:szCs w:val="20"/>
+          <w:lang w:val="ru-RU"/>
+        </w:rPr>
+        <w:t xml:space="preserve">    </w:t>
+      </w:r>
+      <w:r>
+        <w:rPr>
+          <w:rFonts w:ascii="Courier New" w:hAnsi="Courier New" w:cs="Courier New"/>
+          <w:sz w:val="20"/>
+          <w:szCs w:val="20"/>
+          <w:lang w:val="en-US"/>
+        </w:rPr>
+        <w:t>cout</w:t>
+      </w:r>
+      <w:r>
+        <w:rPr>
+          <w:rFonts w:ascii="Courier New" w:hAnsi="Courier New" w:cs="Courier New"/>
+          <w:sz w:val="20"/>
+          <w:szCs w:val="20"/>
+          <w:lang w:val="ru-RU"/>
+        </w:rPr>
+        <w:t xml:space="preserve"> &lt;&lt; "\</w:t>
+      </w:r>
+      <w:r>
+        <w:rPr>
+          <w:rFonts w:ascii="Courier New" w:hAnsi="Courier New" w:cs="Courier New"/>
+          <w:sz w:val="20"/>
+          <w:szCs w:val="20"/>
+          <w:lang w:val="en-US"/>
+        </w:rPr>
+        <w:t>nTC</w:t>
+      </w:r>
+      <w:r>
+        <w:rPr>
+          <w:rFonts w:ascii="Courier New" w:hAnsi="Courier New" w:cs="Courier New"/>
+          <w:sz w:val="20"/>
+          <w:szCs w:val="20"/>
+          <w:lang w:val="ru-RU"/>
+        </w:rPr>
+        <w:t xml:space="preserve">-2.2: Введіть числа: 0, 0, 0" &lt;&lt; </w:t>
+      </w:r>
+      <w:r>
+        <w:rPr>
+          <w:rFonts w:ascii="Courier New" w:hAnsi="Courier New" w:cs="Courier New"/>
+          <w:sz w:val="20"/>
+          <w:szCs w:val="20"/>
+          <w:lang w:val="en-US"/>
+        </w:rPr>
+        <w:t>endl</w:t>
+      </w:r>
+      <w:r>
+        <w:rPr>
+          <w:rFonts w:ascii="Courier New" w:hAnsi="Courier New" w:cs="Courier New"/>
+          <w:sz w:val="20"/>
+          <w:szCs w:val="20"/>
+          <w:lang w:val="ru-RU"/>
+        </w:rPr>
+        <w:t>;</w:t>
+      </w:r>
+    </w:p>
+    <w:p>
+      <w:pPr>
+        <w:rPr>
+          <w:rFonts w:ascii="Courier New" w:hAnsi="Courier New" w:cs="Courier New"/>
+          <w:sz w:val="20"/>
+          <w:szCs w:val="20"/>
+          <w:lang w:val="ru-RU"/>
+        </w:rPr>
+      </w:pPr>
+      <w:r>
+        <w:rPr>
+          <w:rFonts w:ascii="Courier New" w:hAnsi="Courier New" w:cs="Courier New"/>
+          <w:sz w:val="20"/>
+          <w:szCs w:val="20"/>
+          <w:lang w:val="ru-RU"/>
+        </w:rPr>
+        <w:t xml:space="preserve">    </w:t>
+      </w:r>
+      <w:r>
+        <w:rPr>
+          <w:rFonts w:ascii="Courier New" w:hAnsi="Courier New" w:cs="Courier New"/>
+          <w:sz w:val="20"/>
+          <w:szCs w:val="20"/>
+          <w:lang w:val="en-US"/>
+        </w:rPr>
+        <w:t>cout</w:t>
+      </w:r>
+      <w:r>
+        <w:rPr>
+          <w:rFonts w:ascii="Courier New" w:hAnsi="Courier New" w:cs="Courier New"/>
+          <w:sz w:val="20"/>
+          <w:szCs w:val="20"/>
+          <w:lang w:val="ru-RU"/>
+        </w:rPr>
+        <w:t xml:space="preserve"> &lt;&lt; "Очікуваний результат: Від'ємних: 0, Нулів: 3, У діапазоні [5; 1024]: 0" &lt;&lt; </w:t>
+      </w:r>
+      <w:r>
+        <w:rPr>
+          <w:rFonts w:ascii="Courier New" w:hAnsi="Courier New" w:cs="Courier New"/>
+          <w:sz w:val="20"/>
+          <w:szCs w:val="20"/>
+          <w:lang w:val="en-US"/>
+        </w:rPr>
+        <w:t>endl</w:t>
+      </w:r>
+      <w:r>
+        <w:rPr>
+          <w:rFonts w:ascii="Courier New" w:hAnsi="Courier New" w:cs="Courier New"/>
+          <w:sz w:val="20"/>
+          <w:szCs w:val="20"/>
+          <w:lang w:val="ru-RU"/>
+        </w:rPr>
+        <w:t>;</w:t>
+      </w:r>
+    </w:p>
+    <w:p>
+      <w:pPr>
+        <w:rPr>
+          <w:rFonts w:ascii="Courier New" w:hAnsi="Courier New" w:cs="Courier New"/>
+          <w:sz w:val="20"/>
+          <w:szCs w:val="20"/>
+          <w:lang w:val="ru-RU"/>
+        </w:rPr>
+      </w:pPr>
+      <w:r>
+        <w:rPr>
+          <w:rFonts w:ascii="Courier New" w:hAnsi="Courier New" w:cs="Courier New"/>
+          <w:sz w:val="20"/>
+          <w:szCs w:val="20"/>
+          <w:lang w:val="ru-RU"/>
+        </w:rPr>
+        <w:t xml:space="preserve">    </w:t>
+      </w:r>
+      <w:r>
+        <w:rPr>
+          <w:rFonts w:ascii="Courier New" w:hAnsi="Courier New" w:cs="Courier New"/>
+          <w:sz w:val="20"/>
+          <w:szCs w:val="20"/>
+          <w:lang w:val="en-US"/>
+        </w:rPr>
+        <w:t>task</w:t>
+      </w:r>
+      <w:r>
+        <w:rPr>
+          <w:rFonts w:ascii="Courier New" w:hAnsi="Courier New" w:cs="Courier New"/>
+          <w:sz w:val="20"/>
+          <w:szCs w:val="20"/>
+          <w:lang w:val="ru-RU"/>
+        </w:rPr>
+        <w:t>_9_2(3);</w:t>
+      </w:r>
+    </w:p>
+    <w:p>
+      <w:pPr>
+        <w:rPr>
+          <w:rFonts w:ascii="Courier New" w:hAnsi="Courier New" w:cs="Courier New"/>
+          <w:sz w:val="20"/>
+          <w:szCs w:val="20"/>
+          <w:lang w:val="ru-RU"/>
+        </w:rPr>
+      </w:pPr>
+    </w:p>
+    <w:p>
+      <w:pPr>
+        <w:rPr>
+          <w:rFonts w:ascii="Courier New" w:hAnsi="Courier New" w:cs="Courier New"/>
+          <w:sz w:val="20"/>
+          <w:szCs w:val="20"/>
+          <w:lang w:val="ru-RU"/>
+        </w:rPr>
+      </w:pPr>
+      <w:r>
+        <w:rPr>
+          <w:rFonts w:ascii="Courier New" w:hAnsi="Courier New" w:cs="Courier New"/>
+          <w:sz w:val="20"/>
+          <w:szCs w:val="20"/>
+          <w:lang w:val="ru-RU"/>
+        </w:rPr>
+        <w:t xml:space="preserve">    // ---------------------------------------------------------</w:t>
+      </w:r>
+    </w:p>
+    <w:p>
+      <w:pPr>
+        <w:rPr>
+          <w:rFonts w:ascii="Courier New" w:hAnsi="Courier New" w:cs="Courier New"/>
+          <w:sz w:val="20"/>
+          <w:szCs w:val="20"/>
+          <w:lang w:val="ru-RU"/>
+        </w:rPr>
+      </w:pPr>
+      <w:r>
+        <w:rPr>
+          <w:rFonts w:ascii="Courier New" w:hAnsi="Courier New" w:cs="Courier New"/>
+          <w:sz w:val="20"/>
+          <w:szCs w:val="20"/>
+          <w:lang w:val="ru-RU"/>
+        </w:rPr>
+        <w:t xml:space="preserve">    // Тестування задачі 9.3</w:t>
+      </w:r>
+    </w:p>
+    <w:p>
+      <w:pPr>
+        <w:rPr>
+          <w:rFonts w:ascii="Courier New" w:hAnsi="Courier New" w:cs="Courier New"/>
+          <w:sz w:val="20"/>
+          <w:szCs w:val="20"/>
+          <w:lang w:val="ru-RU"/>
+        </w:rPr>
+      </w:pPr>
+      <w:r>
+        <w:rPr>
+          <w:rFonts w:ascii="Courier New" w:hAnsi="Courier New" w:cs="Courier New"/>
+          <w:sz w:val="20"/>
+          <w:szCs w:val="20"/>
+          <w:lang w:val="ru-RU"/>
+        </w:rPr>
+        <w:t xml:space="preserve">    // ---------------------------------------------------------</w:t>
+      </w:r>
+    </w:p>
+    <w:p>
+      <w:pPr>
+        <w:rPr>
+          <w:rFonts w:ascii="Courier New" w:hAnsi="Courier New" w:cs="Courier New"/>
+          <w:sz w:val="20"/>
+          <w:szCs w:val="20"/>
+          <w:lang w:val="ru-RU"/>
+        </w:rPr>
+      </w:pPr>
+      <w:r>
+        <w:rPr>
+          <w:rFonts w:ascii="Courier New" w:hAnsi="Courier New" w:cs="Courier New"/>
+          <w:sz w:val="20"/>
+          <w:szCs w:val="20"/>
+          <w:lang w:val="ru-RU"/>
+        </w:rPr>
+        <w:t xml:space="preserve">    </w:t>
+      </w:r>
+      <w:r>
+        <w:rPr>
+          <w:rFonts w:ascii="Courier New" w:hAnsi="Courier New" w:cs="Courier New"/>
+          <w:sz w:val="20"/>
+          <w:szCs w:val="20"/>
+          <w:lang w:val="en-US"/>
+        </w:rPr>
+        <w:t>cout</w:t>
+      </w:r>
+      <w:r>
+        <w:rPr>
+          <w:rFonts w:ascii="Courier New" w:hAnsi="Courier New" w:cs="Courier New"/>
+          <w:sz w:val="20"/>
+          <w:szCs w:val="20"/>
+          <w:lang w:val="ru-RU"/>
+        </w:rPr>
+        <w:t xml:space="preserve"> &lt;&lt; "\</w:t>
+      </w:r>
+      <w:r>
+        <w:rPr>
+          <w:rFonts w:ascii="Courier New" w:hAnsi="Courier New" w:cs="Courier New"/>
+          <w:sz w:val="20"/>
+          <w:szCs w:val="20"/>
+          <w:lang w:val="en-US"/>
+        </w:rPr>
+        <w:t>n</w:t>
+      </w:r>
+      <w:r>
+        <w:rPr>
+          <w:rFonts w:ascii="Courier New" w:hAnsi="Courier New" w:cs="Courier New"/>
+          <w:sz w:val="20"/>
+          <w:szCs w:val="20"/>
+          <w:lang w:val="ru-RU"/>
+        </w:rPr>
+        <w:t xml:space="preserve">--- Тестування задачі 9.3 ---" &lt;&lt; </w:t>
+      </w:r>
+      <w:r>
+        <w:rPr>
+          <w:rFonts w:ascii="Courier New" w:hAnsi="Courier New" w:cs="Courier New"/>
+          <w:sz w:val="20"/>
+          <w:szCs w:val="20"/>
+          <w:lang w:val="en-US"/>
+        </w:rPr>
+        <w:t>endl</w:t>
+      </w:r>
+      <w:r>
+        <w:rPr>
+          <w:rFonts w:ascii="Courier New" w:hAnsi="Courier New" w:cs="Courier New"/>
+          <w:sz w:val="20"/>
+          <w:szCs w:val="20"/>
+          <w:lang w:val="ru-RU"/>
+        </w:rPr>
+        <w:t>;</w:t>
+      </w:r>
+    </w:p>
+    <w:p>
+      <w:pPr>
+        <w:rPr>
+          <w:rFonts w:ascii="Courier New" w:hAnsi="Courier New" w:cs="Courier New"/>
+          <w:sz w:val="20"/>
+          <w:szCs w:val="20"/>
+          <w:lang w:val="ru-RU"/>
+        </w:rPr>
+      </w:pPr>
+    </w:p>
+    <w:p>
+      <w:pPr>
+        <w:rPr>
+          <w:rFonts w:ascii="Courier New" w:hAnsi="Courier New" w:cs="Courier New"/>
+          <w:sz w:val="20"/>
+          <w:szCs w:val="20"/>
+          <w:lang w:val="en-US"/>
+        </w:rPr>
+      </w:pPr>
+      <w:r>
+        <w:rPr>
+          <w:rFonts w:ascii="Courier New" w:hAnsi="Courier New" w:cs="Courier New"/>
+          <w:sz w:val="20"/>
+          <w:szCs w:val="20"/>
+          <w:lang w:val="ru-RU"/>
+        </w:rPr>
+        <w:t xml:space="preserve">    </w:t>
+      </w:r>
+      <w:r>
+        <w:rPr>
+          <w:rFonts w:ascii="Courier New" w:hAnsi="Courier New" w:cs="Courier New"/>
+          <w:sz w:val="20"/>
+          <w:szCs w:val="20"/>
+          <w:lang w:val="en-US"/>
+        </w:rPr>
+        <w:t>int res3_1 = task_9_3(5);</w:t>
+      </w:r>
+    </w:p>
+    <w:p>
+      <w:pPr>
+        <w:rPr>
+          <w:rFonts w:ascii="Courier New" w:hAnsi="Courier New" w:cs="Courier New"/>
+          <w:sz w:val="20"/>
+          <w:szCs w:val="20"/>
+          <w:lang w:val="en-US"/>
+        </w:rPr>
+      </w:pPr>
+      <w:r>
+        <w:rPr>
+          <w:rFonts w:ascii="Courier New" w:hAnsi="Courier New" w:cs="Courier New"/>
+          <w:sz w:val="20"/>
+          <w:szCs w:val="20"/>
+          <w:lang w:val="en-US"/>
+        </w:rPr>
+        <w:t xml:space="preserve">    cout &lt;&lt; "TC-3.1 (N=5): Очікується 2 | Фактично: " &lt;&lt; res3_1</w:t>
+      </w:r>
+    </w:p>
+    <w:p>
+      <w:pPr>
+        <w:rPr>
+          <w:rFonts w:ascii="Courier New" w:hAnsi="Courier New" w:cs="Courier New"/>
+          <w:sz w:val="20"/>
+          <w:szCs w:val="20"/>
+          <w:lang w:val="en-US"/>
+        </w:rPr>
+      </w:pPr>
+      <w:r>
+        <w:rPr>
+          <w:rFonts w:ascii="Courier New" w:hAnsi="Courier New" w:cs="Courier New"/>
+          <w:sz w:val="20"/>
+          <w:szCs w:val="20"/>
+          <w:lang w:val="en-US"/>
+        </w:rPr>
+        <w:t xml:space="preserve">         &lt;&lt; " -&gt; Статус: " &lt;&lt; (res3_1 == 2 ? "passed" : "failed") &lt;&lt; endl;</w:t>
+      </w:r>
+    </w:p>
+    <w:p>
+      <w:pPr>
+        <w:rPr>
+          <w:rFonts w:ascii="Courier New" w:hAnsi="Courier New" w:cs="Courier New"/>
+          <w:sz w:val="20"/>
+          <w:szCs w:val="20"/>
+          <w:lang w:val="en-US"/>
+        </w:rPr>
+      </w:pPr>
+    </w:p>
+    <w:p>
+      <w:pPr>
+        <w:rPr>
+          <w:rFonts w:ascii="Courier New" w:hAnsi="Courier New" w:cs="Courier New"/>
+          <w:sz w:val="20"/>
+          <w:szCs w:val="20"/>
+          <w:lang w:val="en-US"/>
+        </w:rPr>
+      </w:pPr>
+      <w:r>
+        <w:rPr>
+          <w:rFonts w:ascii="Courier New" w:hAnsi="Courier New" w:cs="Courier New"/>
+          <w:sz w:val="20"/>
+          <w:szCs w:val="20"/>
+          <w:lang w:val="en-US"/>
+        </w:rPr>
+        <w:t xml:space="preserve">    int res3_2 = task_9_3(2);</w:t>
+      </w:r>
+    </w:p>
+    <w:p>
+      <w:pPr>
+        <w:rPr>
+          <w:rFonts w:ascii="Courier New" w:hAnsi="Courier New" w:cs="Courier New"/>
+          <w:sz w:val="20"/>
+          <w:szCs w:val="20"/>
+          <w:lang w:val="en-US"/>
+        </w:rPr>
+      </w:pPr>
+      <w:r>
+        <w:rPr>
+          <w:rFonts w:ascii="Courier New" w:hAnsi="Courier New" w:cs="Courier New"/>
+          <w:sz w:val="20"/>
+          <w:szCs w:val="20"/>
+          <w:lang w:val="en-US"/>
+        </w:rPr>
+        <w:t xml:space="preserve">    cout &lt;&lt; "TC-3.2 (N=2): Очікується 31 | Фактично: " &lt;&lt; res3_2</w:t>
+      </w:r>
+    </w:p>
+    <w:p>
+      <w:pPr>
+        <w:rPr>
+          <w:rFonts w:ascii="Courier New" w:hAnsi="Courier New" w:cs="Courier New"/>
+          <w:sz w:val="20"/>
+          <w:szCs w:val="20"/>
+          <w:lang w:val="en-US"/>
+        </w:rPr>
+      </w:pPr>
+      <w:r>
+        <w:rPr>
+          <w:rFonts w:ascii="Courier New" w:hAnsi="Courier New" w:cs="Courier New"/>
+          <w:sz w:val="20"/>
+          <w:szCs w:val="20"/>
+          <w:lang w:val="en-US"/>
+        </w:rPr>
+        <w:t xml:space="preserve">         &lt;&lt; " -&gt; Статус: " &lt;&lt; (res3_2 == 31 ? "passed" : "failed") &lt;&lt; endl;</w:t>
+      </w:r>
+    </w:p>
+    <w:p>
+      <w:pPr>
+        <w:rPr>
+          <w:rFonts w:ascii="Courier New" w:hAnsi="Courier New" w:cs="Courier New"/>
+          <w:sz w:val="20"/>
+          <w:szCs w:val="20"/>
+          <w:lang w:val="en-US"/>
+        </w:rPr>
+      </w:pPr>
+    </w:p>
+    <w:p>
+      <w:pPr>
+        <w:rPr>
+          <w:rFonts w:ascii="Courier New" w:hAnsi="Courier New" w:cs="Courier New"/>
+          <w:sz w:val="20"/>
+          <w:szCs w:val="20"/>
+          <w:lang w:val="en-US"/>
+        </w:rPr>
+      </w:pPr>
+      <w:r>
+        <w:rPr>
+          <w:rFonts w:ascii="Courier New" w:hAnsi="Courier New" w:cs="Courier New"/>
+          <w:sz w:val="20"/>
+          <w:szCs w:val="20"/>
+          <w:lang w:val="en-US"/>
+        </w:rPr>
+        <w:t xml:space="preserve">    int res3_3 = task_9_3(75000);</w:t>
+      </w:r>
+    </w:p>
+    <w:p>
+      <w:pPr>
+        <w:rPr>
+          <w:rFonts w:ascii="Courier New" w:hAnsi="Courier New" w:cs="Courier New"/>
+          <w:sz w:val="20"/>
+          <w:szCs w:val="20"/>
+          <w:lang w:val="en-US"/>
+        </w:rPr>
+      </w:pPr>
+      <w:r>
+        <w:rPr>
+          <w:rFonts w:ascii="Courier New" w:hAnsi="Courier New" w:cs="Courier New"/>
+          <w:sz w:val="20"/>
+          <w:szCs w:val="20"/>
+          <w:lang w:val="en-US"/>
+        </w:rPr>
+        <w:t xml:space="preserve">    cout &lt;&lt; "TC-3.3 (N=75000): Очікується -1 (код помилки) | Фактично: " &lt;&lt; res3_3</w:t>
+      </w:r>
+    </w:p>
+    <w:p>
+      <w:pPr>
+        <w:rPr>
+          <w:rFonts w:ascii="Courier New" w:hAnsi="Courier New" w:cs="Courier New"/>
+          <w:sz w:val="20"/>
+          <w:szCs w:val="20"/>
+          <w:lang w:val="en-US"/>
+        </w:rPr>
+      </w:pPr>
+      <w:r>
+        <w:rPr>
+          <w:rFonts w:ascii="Courier New" w:hAnsi="Courier New" w:cs="Courier New"/>
+          <w:sz w:val="20"/>
+          <w:szCs w:val="20"/>
+          <w:lang w:val="en-US"/>
+        </w:rPr>
+        <w:t xml:space="preserve">         &lt;&lt; " -&gt; Статус: " &lt;&lt; (res3_3 == -1 ? "passed" : "failed") &lt;&lt; endl;</w:t>
+      </w:r>
+    </w:p>
+    <w:p>
+      <w:pPr>
+        <w:rPr>
+          <w:rFonts w:ascii="Courier New" w:hAnsi="Courier New" w:cs="Courier New"/>
+          <w:sz w:val="20"/>
+          <w:szCs w:val="20"/>
+          <w:lang w:val="en-US"/>
+        </w:rPr>
+      </w:pPr>
+    </w:p>
+    <w:p>
+      <w:pPr>
+        <w:rPr>
+          <w:rFonts w:ascii="Courier New" w:hAnsi="Courier New" w:cs="Courier New"/>
+          <w:sz w:val="20"/>
+          <w:szCs w:val="20"/>
+          <w:lang w:val="en-US"/>
+        </w:rPr>
+      </w:pPr>
+      <w:r>
+        <w:rPr>
+          <w:rFonts w:ascii="Courier New" w:hAnsi="Courier New" w:cs="Courier New"/>
+          <w:sz w:val="20"/>
+          <w:szCs w:val="20"/>
+          <w:lang w:val="en-US"/>
+        </w:rPr>
+        <w:lastRenderedPageBreak/>
+        <w:t xml:space="preserve">    cout &lt;&lt; "\n=====================================================" &lt;&lt; endl;</w:t>
+      </w:r>
+    </w:p>
+    <w:p>
+      <w:pPr>
+        <w:rPr>
+          <w:rFonts w:ascii="Courier New" w:hAnsi="Courier New" w:cs="Courier New"/>
+          <w:sz w:val="20"/>
+          <w:szCs w:val="20"/>
+          <w:lang w:val="en-US"/>
+        </w:rPr>
+      </w:pPr>
+    </w:p>
+    <w:p>
+      <w:pPr>
+        <w:rPr>
+          <w:rFonts w:ascii="Courier New" w:hAnsi="Courier New" w:cs="Courier New"/>
+          <w:sz w:val="20"/>
+          <w:szCs w:val="20"/>
+          <w:lang w:val="en-US"/>
+        </w:rPr>
+      </w:pPr>
+      <w:r>
+        <w:rPr>
+          <w:rFonts w:ascii="Courier New" w:hAnsi="Courier New" w:cs="Courier New"/>
+          <w:sz w:val="20"/>
+          <w:szCs w:val="20"/>
+          <w:lang w:val="en-US"/>
+        </w:rPr>
+        <w:t xml:space="preserve">    system("pause");</w:t>
+      </w:r>
+    </w:p>
+    <w:p>
+      <w:pPr>
+        <w:rPr>
+          <w:rFonts w:ascii="Courier New" w:hAnsi="Courier New" w:cs="Courier New"/>
+          <w:sz w:val="20"/>
+          <w:szCs w:val="20"/>
+          <w:lang w:val="en-US"/>
+        </w:rPr>
+      </w:pPr>
+      <w:r>
+        <w:rPr>
+          <w:rFonts w:ascii="Courier New" w:hAnsi="Courier New" w:cs="Courier New"/>
+          <w:sz w:val="20"/>
+          <w:szCs w:val="20"/>
+          <w:lang w:val="en-US"/>
+        </w:rPr>
+        <w:t xml:space="preserve">    return 0;</w:t>
+      </w:r>
+    </w:p>
+    <w:p>
+      <w:pPr>
+        <w:rPr>
+          <w:rFonts w:ascii="Courier New" w:hAnsi="Courier New" w:cs="Courier New"/>
+          <w:sz w:val="20"/>
+          <w:szCs w:val="20"/>
+          <w:lang w:val="en-US"/>
+        </w:rPr>
+      </w:pPr>
+      <w:r>
+        <w:rPr>
+          <w:rFonts w:ascii="Courier New" w:hAnsi="Courier New" w:cs="Courier New"/>
+          <w:sz w:val="20"/>
+          <w:szCs w:val="20"/>
+          <w:lang w:val="en-US"/>
+        </w:rPr>
+        <w:t>}</w:t>
+      </w:r>
+    </w:p>
+    <w:p>
+      <w:pPr>
+        <w:rPr>
+          <w:rFonts w:ascii="Courier New" w:hAnsi="Courier New" w:cs="Courier New"/>
+          <w:sz w:val="20"/>
+          <w:szCs w:val="20"/>
+          <w:lang w:val="en-US"/>
+        </w:rPr>
+      </w:pPr>
+      <w:r>
+        <w:rPr>
+          <w:sz w:val="28"/>
+          <w:szCs w:val="28"/>
+          <w:lang w:val="ru-RU"/>
+        </w:rPr>
+        <w:t>Результат виконання</w:t>
+      </w:r>
+      <w:r>
+        <w:rPr>
+          <w:sz w:val="28"/>
+          <w:szCs w:val="28"/>
+          <w:lang w:val="ru-RU"/>
+        </w:rPr>
+        <w:t xml:space="preserve"> роботи</w:t>
+      </w:r>
+      <w:r>
+        <w:rPr>
+          <w:sz w:val="28"/>
+          <w:szCs w:val="28"/>
+          <w:lang w:val="en-US"/>
+        </w:rPr>
+        <w:t xml:space="preserve"> </w:t>
+      </w:r>
+      <w:r>
+        <w:rPr>
+          <w:sz w:val="28"/>
+          <w:szCs w:val="28"/>
+          <w:lang w:val="ru-RU"/>
+        </w:rPr>
+        <w:t>тестового драйвера</w:t>
+      </w:r>
+      <w:r>
+        <w:rPr>
+          <w:rFonts w:ascii="Courier New" w:hAnsi="Courier New" w:cs="Courier New"/>
+          <w:sz w:val="20"/>
+          <w:szCs w:val="20"/>
+          <w:lang w:val="en-US"/>
+        </w:rPr>
+        <w:t>:</w:t>
+      </w:r>
+    </w:p>
+    <w:p>
+      <w:pPr>
+        <w:rPr>
+          <w:rFonts w:ascii="Courier New" w:hAnsi="Courier New" w:cs="Courier New"/>
+          <w:sz w:val="20"/>
+          <w:szCs w:val="20"/>
+          <w:lang w:val="en-US"/>
+        </w:rPr>
+      </w:pPr>
+    </w:p>
+    <w:p>
+      <w:pPr>
+        <w:rPr>
+          <w:rFonts w:ascii="Courier New" w:hAnsi="Courier New" w:cs="Courier New"/>
+          <w:sz w:val="20"/>
+          <w:szCs w:val="20"/>
+          <w:lang w:val="en-US"/>
+        </w:rPr>
+      </w:pPr>
+      <w:r>
+        <w:rPr>
+          <w:rFonts w:ascii="Courier New" w:hAnsi="Courier New" w:cs="Courier New"/>
+          <w:noProof/>
+          <w:sz w:val="20"/>
+          <w:szCs w:val="20"/>
+          <w:lang w:val="en-US"/>
+        </w:rPr>
+        <w:drawing>
+          <wp:inline distT="0" distB="0" distL="0" distR="0" wp14:anchorId="1747ED25" wp14:editId="3D616BB3">
+            <wp:extent cx="6477000" cy="4775200"/>
+            <wp:effectExtent l="0" t="0" r="0" b="6350"/>
+            <wp:docPr id="1" name="Рисунок 1"/>
+            <wp:cNvGraphicFramePr>
+              <a:graphicFrameLocks xmlns:a="http://schemas.openxmlformats.org/drawingml/2006/main" noChangeAspect="1"/>
+            </wp:cNvGraphicFramePr>
+            <a:graphic xmlns:a="http://schemas.openxmlformats.org/drawingml/2006/main">
+              <a:graphicData uri="http://schemas.openxmlformats.org/drawingml/2006/picture">
+                <pic:pic xmlns:pic="http://schemas.openxmlformats.org/drawingml/2006/picture">
+                  <pic:nvPicPr>
+                    <pic:cNvPr id="0" name="Picture 3"/>
+                    <pic:cNvPicPr>
+                      <a:picLocks noChangeAspect="1" noChangeArrowheads="1"/>
+                    </pic:cNvPicPr>
+                  </pic:nvPicPr>
+                  <pic:blipFill>
+                    <a:blip r:embed="rId8">
+                      <a:extLst>
+                        <a:ext uri="{28A0092B-C50C-407E-A947-70E740481C1C}">
+                          <a14:useLocalDpi xmlns:a14="http://schemas.microsoft.com/office/drawing/2010/main" val="0"/>
+                        </a:ext>
+                      </a:extLst>
+                    </a:blip>
+                    <a:srcRect/>
+                    <a:stretch>
+                      <a:fillRect/>
+                    </a:stretch>
+                  </pic:blipFill>
+                  <pic:spPr bwMode="auto">
+                    <a:xfrm>
+                      <a:off x="0" y="0"/>
+                      <a:ext cx="6477000" cy="4775200"/>
+                    </a:xfrm>
+                    <a:prstGeom prst="rect">
+                      <a:avLst/>
+                    </a:prstGeom>
+                    <a:noFill/>
+                    <a:ln>
+                      <a:noFill/>
+                    </a:ln>
+                  </pic:spPr>
+                </pic:pic>
+              </a:graphicData>
+            </a:graphic>
+          </wp:inline>
+        </w:drawing>
+      </w:r>
+    </w:p>
+    <w:p>
+      <w:pPr>
+        <w:rPr>
           <w:sz w:val="28"/>
           <w:szCs w:val="28"/>
           <w:lang w:val="ru-RU"/>
@@ -6546,8 +9875,8 @@
     <w:p/>
     <w:p/>
     <w:sectPr>
-      <w:headerReference w:type="even" r:id="rId8"/>
-      <w:headerReference w:type="default" r:id="rId9"/>
+      <w:headerReference w:type="even" r:id="rId9"/>
+      <w:headerReference w:type="default" r:id="rId10"/>
       <w:pgSz w:w="11906" w:h="16838" w:code="9"/>
       <w:pgMar w:top="567" w:right="567" w:bottom="567" w:left="1134" w:header="539" w:footer="539" w:gutter="0"/>
       <w:pgNumType w:start="0"/>

</xml_diff>